<commit_message>
Update Week 1-9 combined logbook
</commit_message>
<xml_diff>
--- a/BIT4107_Logbook_Weekly task .docx
+++ b/BIT4107_Logbook_Weekly task .docx
@@ -961,7 +961,7 @@
           </mc:Choice>
           <mc:Fallback>
             <w:pict>
-              <v:rect w14:anchorId="7AD33A9E" id="Rectangle 3" o:spid="_x0000_s1026" style="width:24pt;height:24pt;visibility:visible;mso-wrap-style:square;mso-left-percent:-10001;mso-top-percent:-10001;mso-position-horizontal:absolute;mso-position-horizontal-relative:char;mso-position-vertical:absolute;mso-position-vertical-relative:line;mso-left-percent:-10001;mso-top-percent:-10001;v-text-anchor:top" o:gfxdata="UEsDBBQABgAIAAAAIQC2gziS/gAAAOEBAAATAAAAW0NvbnRlbnRfVHlwZXNdLnhtbJSRQU7DMBBF 90jcwfIWJU67QAgl6YK0S0CoHGBkTxKLZGx5TGhvj5O2G0SRWNoz/78nu9wcxkFMGNg6quQqL6RA 0s5Y6ir5vt9lD1JwBDIwOMJKHpHlpr69KfdHjyxSmriSfYz+USnWPY7AufNIadK6MEJMx9ApD/oD OlTrorhX2lFEilmcO2RdNtjC5xDF9pCuTyYBB5bi6bQ4syoJ3g9WQ0ymaiLzg5KdCXlKLjvcW893 SUOqXwnz5DrgnHtJTxOsQfEKIT7DmDSUCaxw7Rqn8787ZsmRM9e2VmPeBN4uqYvTtW7jvijg9N/y JsXecLq0q+WD6m8AAAD//wMAUEsDBBQABgAIAAAAIQA4/SH/1gAAAJQBAAALAAAAX3JlbHMvLnJl bHOkkMFqwzAMhu+DvYPRfXGawxijTi+j0GvpHsDYimMaW0Yy2fr2M4PBMnrbUb/Q94l/f/hMi1qR JVI2sOt6UJgd+ZiDgffL8ekFlFSbvV0oo4EbChzGx4f9GRdb25HMsYhqlCwG5lrLq9biZkxWOiqY 22YiTra2kYMu1l1tQD30/bPm3wwYN0x18gb45AdQl1tp5j/sFB2T0FQ7R0nTNEV3j6o9feQzro1i OWA14Fm+Q8a1a8+Bvu/d/dMb2JY5uiPbhG/ktn4cqGU/er3pcvwCAAD//wMAUEsDBBQABgAIAAAA IQDuEevW0gEAAJ4DAAAOAAAAZHJzL2Uyb0RvYy54bWysU9uO0zAQfUfiHyy/06SlwBI1Xa12tQhp YZEWPsB17MQi8ZgZt2n5esZOty3whnix5uKcOXN8srreD73YGSQHvpbzWSmF8Roa59tafvt6/+pK CorKN6oHb2p5MCSv1y9frMZQmQV00DcGBYN4qsZQyy7GUBUF6c4MimYQjOemBRxU5BTbokE1MvrQ F4uyfFuMgE1A0IaIq3dTU64zvrVGx0dryUTR15K5xXxiPjfpLNYrVbWoQuf0kYb6BxaDcp6HnqDu VFRii+4vqMFpBAIbZxqGAqx12uQdeJt5+cc2T50KJu/C4lA4yUT/D1Z/3j2FL5ioU3gA/Z2Eh9tO +dbcUGD5+FHluYQIY2dUwwzmSbtiDFSdMFJCjCY24ydo+LXVNkKWZW9xSDN4YbHP6h9O6pt9FJqL r8vlVclvpLl1jNMEVT1/HJDiBwODSEEtkdllcLV7oDhdfb6SZnm4d32fH7j3vxUYM1Uy+cQ3uYWq DTQH5o4wmYRNzUEH+FOKkQ1SS/qxVWik6D963v/9fLlMjsrJ8s27BSd42dlcdpTXDFXLKMUU3sbJ hduAru2yzBPHG9bMurzPmdWRLJsgK3I0bHLZZZ5vnX+r9S8AAAD//wMAUEsDBBQABgAIAAAAIQBM oOks2AAAAAMBAAAPAAAAZHJzL2Rvd25yZXYueG1sTI9BS8NAEIXvgv9hGcGL2I0iUmI2RQpiEaGY as/T7JgEs7NpdpvEf9+pHvQyw+MNb76XLSbXqoH60Hg2cDNLQBGX3jZcGXjfPF3PQYWIbLH1TAa+ KcAiPz/LMLV+5DcailgpCeGQooE6xi7VOpQ1OQwz3xGL9+l7h1FkX2nb4yjhrtW3SXKvHTYsH2rs aFlT+VUcnIGxXA/bzeuzXl9tV573q/2y+Hgx5vJienwAFWmKf8dwwhd0yIVp5w9sg2oNSJH4M8W7 m4va/W6dZ/o/e34EAAD//wMAUEsBAi0AFAAGAAgAAAAhALaDOJL+AAAA4QEAABMAAAAAAAAAAAAA AAAAAAAAAFtDb250ZW50X1R5cGVzXS54bWxQSwECLQAUAAYACAAAACEAOP0h/9YAAACUAQAACwAA AAAAAAAAAAAAAAAvAQAAX3JlbHMvLnJlbHNQSwECLQAUAAYACAAAACEA7hHr1tIBAACeAwAADgAA AAAAAAAAAAAAAAAuAgAAZHJzL2Uyb0RvYy54bWxQSwECLQAUAAYACAAAACEATKDpLNgAAAADAQAA DwAAAAAAAAAAAAAAAAAsBAAAZHJzL2Rvd25yZXYueG1sUEsFBgAAAAAEAAQA8wAAADEFAAAAAA== " filled="f" stroked="f">
+              <v:rect w14:anchorId="721D6F75" id="Rectangle 3" o:spid="_x0000_s1026" style="width:24pt;height:24pt;visibility:visible;mso-wrap-style:square;mso-left-percent:-10001;mso-top-percent:-10001;mso-position-horizontal:absolute;mso-position-horizontal-relative:char;mso-position-vertical:absolute;mso-position-vertical-relative:line;mso-left-percent:-10001;mso-top-percent:-10001;v-text-anchor:top" o:gfxdata="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" filled="f" stroked="f">
                 <o:lock v:ext="edit" aspectratio="t"/>
                 <w10:anchorlock/>
               </v:rect>
@@ -1454,7 +1454,11 @@
     <w:p>
       <w:r>
         <w:br/>
+      </w:r>
+      <w:r>
         <w:br/>
+      </w:r>
+      <w:r>
         <w:br/>
       </w:r>
     </w:p>
@@ -1462,6 +1466,8 @@
       <w:r>
         <w:lastRenderedPageBreak/>
         <w:br/>
+      </w:r>
+      <w:r>
         <w:br/>
       </w:r>
     </w:p>
@@ -2572,6 +2578,11 @@
           <w:rFonts w:ascii="Arial" w:eastAsia="Arial" w:hAnsi="Arial" w:cs="Arial"/>
         </w:rPr>
         <w:t xml:space="preserve">Since sqflite does not support Flutter Web, Sembast was integrated for browser compatibility. The app uses platform detection (kIsWeb) to automatically switch between </w:t>
+      </w:r>
+      <w:r>
+        <w:rPr>
+          <w:rFonts w:ascii="Arial" w:eastAsia="Arial" w:hAnsi="Arial" w:cs="Arial"/>
+        </w:rPr>
         <w:lastRenderedPageBreak/>
         <w:t>sqflite on Android and Sembast on Web — allowing a single codebase to run on both platforms.</w:t>
       </w:r>
@@ -13259,12 +13270,16 @@
     <w:p>
       <w:r>
         <w:br/>
+      </w:r>
+      <w:r>
         <w:br/>
       </w:r>
     </w:p>
     <w:p>
       <w:r>
         <w:br/>
+      </w:r>
+      <w:r>
         <w:br/>
       </w:r>
     </w:p>
@@ -13276,7 +13291,11 @@
     <w:p>
       <w:r>
         <w:br/>
+      </w:r>
+      <w:r>
         <w:br/>
+      </w:r>
+      <w:r>
         <w:br/>
       </w:r>
     </w:p>
@@ -19162,7 +19181,11 @@
     <w:p>
       <w:r>
         <w:br/>
+      </w:r>
+      <w:r>
         <w:br/>
+      </w:r>
+      <w:r>
         <w:br/>
       </w:r>
     </w:p>
@@ -19174,7 +19197,11 @@
     <w:p>
       <w:r>
         <w:br/>
+      </w:r>
+      <w:r>
         <w:br/>
+      </w:r>
+      <w:r>
         <w:br/>
       </w:r>
     </w:p>
@@ -19184,28 +19211,1942 @@
       </w:r>
     </w:p>
     <w:p>
+      <w:r>
+        <w:t>. Weekly Objective</w:t>
+      </w:r>
+    </w:p>
+    <w:p>
+      <w:r>
+        <w:t>This week's practical task required integrating device hardware features into the mobile application. Specifically, the task required:</w:t>
+      </w:r>
+    </w:p>
+    <w:p>
+      <w:r>
+        <w:t>•</w:t>
+      </w:r>
+      <w:r>
+        <w:tab/>
+        <w:t>A Capture Photo button that opens the device camera</w:t>
+      </w:r>
+    </w:p>
+    <w:p>
+      <w:r>
+        <w:t>•</w:t>
+      </w:r>
+      <w:r>
+        <w:tab/>
+        <w:t>A Get Location button that retrieves the device's GPS coordinates</w:t>
+      </w:r>
+    </w:p>
+    <w:p>
+      <w:r>
+        <w:t>•</w:t>
+      </w:r>
+      <w:r>
+        <w:tab/>
+        <w:t xml:space="preserve">An </w:t>
+      </w:r>
+      <w:proofErr w:type="spellStart"/>
+      <w:r>
+        <w:t>ImageView</w:t>
+      </w:r>
+      <w:proofErr w:type="spellEnd"/>
+      <w:r>
+        <w:t xml:space="preserve"> to display the captured image</w:t>
+      </w:r>
+    </w:p>
+    <w:p>
+      <w:r>
+        <w:t>•</w:t>
+      </w:r>
+      <w:r>
+        <w:tab/>
+      </w:r>
+      <w:proofErr w:type="spellStart"/>
+      <w:r>
+        <w:t>TextViews</w:t>
+      </w:r>
+      <w:proofErr w:type="spellEnd"/>
+      <w:r>
+        <w:t xml:space="preserve"> to display latitude and longitude</w:t>
+      </w:r>
+    </w:p>
+    <w:p>
+      <w:r>
+        <w:t>•</w:t>
+      </w:r>
+      <w:r>
+        <w:tab/>
+        <w:t>Demonstration on a physical Android device</w:t>
+      </w:r>
+    </w:p>
+    <w:p/>
+    <w:p>
+      <w:r>
+        <w:t>As an extension beyond the core requirements, Google Gemini AI was integrated to enable intelligent product recognition — allowing the camera to identify retail products and automatically populate the Stock Entry form. Reverse geocoding was also implemented to convert raw GPS coordinates into a human-readable location name.</w:t>
+      </w:r>
+    </w:p>
+    <w:p/>
+    <w:p>
+      <w:pPr>
+        <w:rPr>
+          <w:b/>
+          <w:bCs/>
+        </w:rPr>
+      </w:pPr>
+      <w:r>
+        <w:rPr>
+          <w:b/>
+          <w:bCs/>
+        </w:rPr>
+        <w:t>Activity 1 — Camera Integration</w:t>
+      </w:r>
+    </w:p>
+    <w:p>
+      <w:r>
+        <w:t xml:space="preserve">The device camera was integrated using the </w:t>
+      </w:r>
+      <w:proofErr w:type="spellStart"/>
+      <w:r>
+        <w:t>image_picker</w:t>
+      </w:r>
+      <w:proofErr w:type="spellEnd"/>
+      <w:r>
+        <w:t xml:space="preserve"> Flutter package. A dedicated Device Features screen was created, accessible from the Catalog screen </w:t>
+      </w:r>
+      <w:proofErr w:type="spellStart"/>
+      <w:r>
+        <w:t>AppBar</w:t>
+      </w:r>
+      <w:proofErr w:type="spellEnd"/>
+      <w:r>
+        <w:t xml:space="preserve"> via a camera icon. The screen provides a CAPTURE PHOTO button that opens the native Android camera, captures an image, and displays it in a full-width </w:t>
+      </w:r>
+      <w:proofErr w:type="spellStart"/>
+      <w:r>
+        <w:t>ImageView</w:t>
+      </w:r>
+      <w:proofErr w:type="spellEnd"/>
+      <w:r>
+        <w:t xml:space="preserve"> with a timestamp showing when the photo was taken.</w:t>
+      </w:r>
+    </w:p>
+    <w:p/>
+    <w:p>
+      <w:pPr>
+        <w:rPr>
+          <w:b/>
+          <w:bCs/>
+        </w:rPr>
+      </w:pPr>
+      <w:r>
+        <w:rPr>
+          <w:b/>
+          <w:bCs/>
+        </w:rPr>
+        <w:t>Evidence</w:t>
+      </w:r>
+    </w:p>
+    <w:tbl>
+      <w:tblPr>
+        <w:tblW w:w="9360" w:type="dxa"/>
+        <w:tblBorders>
+          <w:top w:val="none" w:sz="0" w:space="0" w:color="FFFFFF"/>
+          <w:left w:val="none" w:sz="0" w:space="0" w:color="FFFFFF"/>
+          <w:bottom w:val="none" w:sz="0" w:space="0" w:color="FFFFFF"/>
+          <w:right w:val="none" w:sz="0" w:space="0" w:color="FFFFFF"/>
+          <w:insideH w:val="none" w:sz="0" w:space="0" w:color="FFFFFF"/>
+          <w:insideV w:val="none" w:sz="0" w:space="0" w:color="FFFFFF"/>
+        </w:tblBorders>
+        <w:tblCellMar>
+          <w:left w:w="10" w:type="dxa"/>
+          <w:right w:w="10" w:type="dxa"/>
+        </w:tblCellMar>
+        <w:tblLook w:val="04A0" w:firstRow="1" w:lastRow="0" w:firstColumn="1" w:lastColumn="0" w:noHBand="0" w:noVBand="1"/>
+      </w:tblPr>
+      <w:tblGrid>
+        <w:gridCol w:w="3000"/>
+        <w:gridCol w:w="6360"/>
+      </w:tblGrid>
+      <w:tr>
+        <w:tc>
+          <w:tcPr>
+            <w:tcW w:w="3000" w:type="dxa"/>
+            <w:tcMar>
+              <w:top w:w="60" w:type="dxa"/>
+              <w:left w:w="0" w:type="dxa"/>
+              <w:bottom w:w="60" w:type="dxa"/>
+              <w:right w:w="120" w:type="dxa"/>
+            </w:tcMar>
+          </w:tcPr>
+          <w:p>
+            <w:r>
+              <w:lastRenderedPageBreak/>
+              <w:drawing>
+                <wp:inline distT="0" distB="0" distL="0" distR="0" wp14:anchorId="5918A9D5" wp14:editId="22382D84">
+                  <wp:extent cx="1647825" cy="3476625"/>
+                  <wp:effectExtent l="0" t="0" r="0" b="0"/>
+                  <wp:docPr id="1595704656" name="Picture 1595704656"/>
+                  <wp:cNvGraphicFramePr>
+                    <a:graphicFrameLocks xmlns:a="http://schemas.openxmlformats.org/drawingml/2006/main" noChangeAspect="1"/>
+                  </wp:cNvGraphicFramePr>
+                  <a:graphic xmlns:a="http://schemas.openxmlformats.org/drawingml/2006/main">
+                    <a:graphicData uri="http://schemas.openxmlformats.org/drawingml/2006/picture">
+                      <pic:pic xmlns:pic="http://schemas.openxmlformats.org/drawingml/2006/picture">
+                        <pic:nvPicPr>
+                          <pic:cNvPr id="0" name=""/>
+                          <pic:cNvPicPr>
+                            <a:picLocks noChangeAspect="1" noChangeArrowheads="1"/>
+                          </pic:cNvPicPr>
+                        </pic:nvPicPr>
+                        <pic:blipFill>
+                          <a:blip r:embed="rId53"/>
+                          <a:srcRect/>
+                          <a:stretch>
+                            <a:fillRect/>
+                          </a:stretch>
+                        </pic:blipFill>
+                        <pic:spPr bwMode="auto">
+                          <a:xfrm>
+                            <a:off x="0" y="0"/>
+                            <a:ext cx="1647825" cy="3476625"/>
+                          </a:xfrm>
+                          <a:prstGeom prst="rect">
+                            <a:avLst/>
+                          </a:prstGeom>
+                        </pic:spPr>
+                      </pic:pic>
+                    </a:graphicData>
+                  </a:graphic>
+                </wp:inline>
+              </w:drawing>
+            </w:r>
+          </w:p>
+          <w:p>
+            <w:r>
+              <w:rPr>
+                <w:i/>
+                <w:iCs/>
+              </w:rPr>
+              <w:t>Device Features — empty state</w:t>
+            </w:r>
+          </w:p>
+        </w:tc>
+        <w:tc>
+          <w:tcPr>
+            <w:tcW w:w="6360" w:type="dxa"/>
+            <w:tcMar>
+              <w:top w:w="60" w:type="dxa"/>
+              <w:left w:w="120" w:type="dxa"/>
+              <w:bottom w:w="60" w:type="dxa"/>
+              <w:right w:w="0" w:type="dxa"/>
+            </w:tcMar>
+          </w:tcPr>
+          <w:p>
+            <w:r>
+              <w:rPr>
+                <w:b/>
+                <w:bCs/>
+              </w:rPr>
+              <w:t>Initial state of Device Features screen</w:t>
+            </w:r>
+          </w:p>
+          <w:p>
+            <w:r>
+              <w:t xml:space="preserve">The Device Features screen opens with the Camera Integration section showing an empty </w:t>
+            </w:r>
+            <w:proofErr w:type="spellStart"/>
+            <w:r>
+              <w:t>ImageView</w:t>
+            </w:r>
+            <w:proofErr w:type="spellEnd"/>
+            <w:r>
+              <w:t xml:space="preserve"> placeholder: 'Captured image will appear here'.</w:t>
+            </w:r>
+          </w:p>
+          <w:p>
+            <w:r>
+              <w:t>The GPS Location section shows empty Latitude, Longitude and Altitude fields, each displaying a dash as default.</w:t>
+            </w:r>
+          </w:p>
+          <w:p>
+            <w:r>
+              <w:t>Both CAPTURE PHOTO and GET LOCATION buttons are visible and ready for interaction.</w:t>
+            </w:r>
+          </w:p>
+        </w:tc>
+      </w:tr>
+    </w:tbl>
+    <w:p/>
+    <w:tbl>
+      <w:tblPr>
+        <w:tblW w:w="9360" w:type="dxa"/>
+        <w:tblBorders>
+          <w:top w:val="none" w:sz="0" w:space="0" w:color="FFFFFF"/>
+          <w:left w:val="none" w:sz="0" w:space="0" w:color="FFFFFF"/>
+          <w:bottom w:val="none" w:sz="0" w:space="0" w:color="FFFFFF"/>
+          <w:right w:val="none" w:sz="0" w:space="0" w:color="FFFFFF"/>
+          <w:insideH w:val="none" w:sz="0" w:space="0" w:color="FFFFFF"/>
+          <w:insideV w:val="none" w:sz="0" w:space="0" w:color="FFFFFF"/>
+        </w:tblBorders>
+        <w:tblCellMar>
+          <w:left w:w="10" w:type="dxa"/>
+          <w:right w:w="10" w:type="dxa"/>
+        </w:tblCellMar>
+        <w:tblLook w:val="04A0" w:firstRow="1" w:lastRow="0" w:firstColumn="1" w:lastColumn="0" w:noHBand="0" w:noVBand="1"/>
+      </w:tblPr>
+      <w:tblGrid>
+        <w:gridCol w:w="3000"/>
+        <w:gridCol w:w="6360"/>
+      </w:tblGrid>
+      <w:tr>
+        <w:tc>
+          <w:tcPr>
+            <w:tcW w:w="3000" w:type="dxa"/>
+            <w:tcMar>
+              <w:top w:w="60" w:type="dxa"/>
+              <w:left w:w="0" w:type="dxa"/>
+              <w:bottom w:w="60" w:type="dxa"/>
+              <w:right w:w="120" w:type="dxa"/>
+            </w:tcMar>
+          </w:tcPr>
+          <w:p>
+            <w:r>
+              <w:lastRenderedPageBreak/>
+              <w:drawing>
+                <wp:inline distT="0" distB="0" distL="0" distR="0" wp14:anchorId="6036F253" wp14:editId="36FB3E08">
+                  <wp:extent cx="1647825" cy="3476625"/>
+                  <wp:effectExtent l="0" t="0" r="0" b="0"/>
+                  <wp:docPr id="304227882" name="Picture 304227882"/>
+                  <wp:cNvGraphicFramePr>
+                    <a:graphicFrameLocks xmlns:a="http://schemas.openxmlformats.org/drawingml/2006/main" noChangeAspect="1"/>
+                  </wp:cNvGraphicFramePr>
+                  <a:graphic xmlns:a="http://schemas.openxmlformats.org/drawingml/2006/main">
+                    <a:graphicData uri="http://schemas.openxmlformats.org/drawingml/2006/picture">
+                      <pic:pic xmlns:pic="http://schemas.openxmlformats.org/drawingml/2006/picture">
+                        <pic:nvPicPr>
+                          <pic:cNvPr id="0" name=""/>
+                          <pic:cNvPicPr>
+                            <a:picLocks noChangeAspect="1" noChangeArrowheads="1"/>
+                          </pic:cNvPicPr>
+                        </pic:nvPicPr>
+                        <pic:blipFill>
+                          <a:blip r:embed="rId54"/>
+                          <a:srcRect/>
+                          <a:stretch>
+                            <a:fillRect/>
+                          </a:stretch>
+                        </pic:blipFill>
+                        <pic:spPr bwMode="auto">
+                          <a:xfrm>
+                            <a:off x="0" y="0"/>
+                            <a:ext cx="1647825" cy="3476625"/>
+                          </a:xfrm>
+                          <a:prstGeom prst="rect">
+                            <a:avLst/>
+                          </a:prstGeom>
+                        </pic:spPr>
+                      </pic:pic>
+                    </a:graphicData>
+                  </a:graphic>
+                </wp:inline>
+              </w:drawing>
+            </w:r>
+          </w:p>
+          <w:p>
+            <w:r>
+              <w:rPr>
+                <w:i/>
+                <w:iCs/>
+              </w:rPr>
+              <w:t xml:space="preserve">Photo captured and displayed in </w:t>
+            </w:r>
+            <w:proofErr w:type="spellStart"/>
+            <w:r>
+              <w:rPr>
+                <w:i/>
+                <w:iCs/>
+              </w:rPr>
+              <w:t>ImageView</w:t>
+            </w:r>
+            <w:proofErr w:type="spellEnd"/>
+          </w:p>
+        </w:tc>
+        <w:tc>
+          <w:tcPr>
+            <w:tcW w:w="6360" w:type="dxa"/>
+            <w:tcMar>
+              <w:top w:w="60" w:type="dxa"/>
+              <w:left w:w="120" w:type="dxa"/>
+              <w:bottom w:w="60" w:type="dxa"/>
+              <w:right w:w="0" w:type="dxa"/>
+            </w:tcMar>
+          </w:tcPr>
+          <w:p>
+            <w:r>
+              <w:rPr>
+                <w:b/>
+                <w:bCs/>
+              </w:rPr>
+              <w:t>Camera successfully opened and photo captured</w:t>
+            </w:r>
+          </w:p>
+          <w:p>
+            <w:r>
+              <w:t>After tapping CAPTURE PHOTO, the native Android camera opened and a photo of an X100 Bluetooth speaker was taken.</w:t>
+            </w:r>
+          </w:p>
+          <w:p>
+            <w:r>
+              <w:t xml:space="preserve">The captured image appeared immediately in the </w:t>
+            </w:r>
+            <w:proofErr w:type="spellStart"/>
+            <w:r>
+              <w:t>ImageView</w:t>
+            </w:r>
+            <w:proofErr w:type="spellEnd"/>
+            <w:r>
+              <w:t xml:space="preserve"> on the Device Features screen.</w:t>
+            </w:r>
+          </w:p>
+          <w:p>
+            <w:r>
+              <w:t>The status text updated to: 'Photo captured at 05 Jul 2026, 22:27:08' — confirming the exact timestamp of capture.</w:t>
+            </w:r>
+          </w:p>
+          <w:p>
+            <w:r>
+              <w:t>Camera permission had been granted during the initial app setup and was not prompted again on subsequent uses.</w:t>
+            </w:r>
+          </w:p>
+        </w:tc>
+      </w:tr>
+    </w:tbl>
+    <w:p/>
+    <w:p>
+      <w:r>
+        <w:br w:type="page"/>
+      </w:r>
+    </w:p>
+    <w:p>
+      <w:pPr>
+        <w:rPr>
+          <w:b/>
+          <w:bCs/>
+        </w:rPr>
+      </w:pPr>
+      <w:r>
+        <w:rPr>
+          <w:b/>
+          <w:bCs/>
+        </w:rPr>
+        <w:lastRenderedPageBreak/>
+        <w:t>3. Activity 2 — GPS Location Integration</w:t>
+      </w:r>
+    </w:p>
+    <w:p>
+      <w:r>
+        <w:t>GPS was integrated using the geolocator package, with reverse geocoding via the geocoding package (v4.0.0). The GET LOCATION button checks location permissions, enables location services, retrieves the current position (latitude, longitude, altitude), and converts the coordinates to a human-readable address using reverse geocoding.</w:t>
+      </w:r>
+    </w:p>
+    <w:p/>
+    <w:p>
+      <w:pPr>
+        <w:rPr>
+          <w:b/>
+          <w:bCs/>
+        </w:rPr>
+      </w:pPr>
+      <w:r>
+        <w:rPr>
+          <w:b/>
+          <w:bCs/>
+        </w:rPr>
+        <w:t>Evidence</w:t>
+      </w:r>
+    </w:p>
+    <w:tbl>
+      <w:tblPr>
+        <w:tblW w:w="9360" w:type="dxa"/>
+        <w:tblBorders>
+          <w:top w:val="none" w:sz="0" w:space="0" w:color="FFFFFF"/>
+          <w:left w:val="none" w:sz="0" w:space="0" w:color="FFFFFF"/>
+          <w:bottom w:val="none" w:sz="0" w:space="0" w:color="FFFFFF"/>
+          <w:right w:val="none" w:sz="0" w:space="0" w:color="FFFFFF"/>
+          <w:insideH w:val="none" w:sz="0" w:space="0" w:color="FFFFFF"/>
+          <w:insideV w:val="none" w:sz="0" w:space="0" w:color="FFFFFF"/>
+        </w:tblBorders>
+        <w:tblCellMar>
+          <w:left w:w="10" w:type="dxa"/>
+          <w:right w:w="10" w:type="dxa"/>
+        </w:tblCellMar>
+        <w:tblLook w:val="04A0" w:firstRow="1" w:lastRow="0" w:firstColumn="1" w:lastColumn="0" w:noHBand="0" w:noVBand="1"/>
+      </w:tblPr>
+      <w:tblGrid>
+        <w:gridCol w:w="3000"/>
+        <w:gridCol w:w="6360"/>
+      </w:tblGrid>
+      <w:tr>
+        <w:tc>
+          <w:tcPr>
+            <w:tcW w:w="3000" w:type="dxa"/>
+            <w:tcMar>
+              <w:top w:w="60" w:type="dxa"/>
+              <w:left w:w="0" w:type="dxa"/>
+              <w:bottom w:w="60" w:type="dxa"/>
+              <w:right w:w="120" w:type="dxa"/>
+            </w:tcMar>
+          </w:tcPr>
+          <w:p>
+            <w:r>
+              <w:drawing>
+                <wp:inline distT="0" distB="0" distL="0" distR="0" wp14:anchorId="5F87979D" wp14:editId="6FD052A6">
+                  <wp:extent cx="1647825" cy="3476625"/>
+                  <wp:effectExtent l="0" t="0" r="0" b="0"/>
+                  <wp:docPr id="318296364" name="Picture 318296364"/>
+                  <wp:cNvGraphicFramePr>
+                    <a:graphicFrameLocks xmlns:a="http://schemas.openxmlformats.org/drawingml/2006/main" noChangeAspect="1"/>
+                  </wp:cNvGraphicFramePr>
+                  <a:graphic xmlns:a="http://schemas.openxmlformats.org/drawingml/2006/main">
+                    <a:graphicData uri="http://schemas.openxmlformats.org/drawingml/2006/picture">
+                      <pic:pic xmlns:pic="http://schemas.openxmlformats.org/drawingml/2006/picture">
+                        <pic:nvPicPr>
+                          <pic:cNvPr id="0" name=""/>
+                          <pic:cNvPicPr>
+                            <a:picLocks noChangeAspect="1" noChangeArrowheads="1"/>
+                          </pic:cNvPicPr>
+                        </pic:nvPicPr>
+                        <pic:blipFill>
+                          <a:blip r:embed="rId55"/>
+                          <a:srcRect/>
+                          <a:stretch>
+                            <a:fillRect/>
+                          </a:stretch>
+                        </pic:blipFill>
+                        <pic:spPr bwMode="auto">
+                          <a:xfrm>
+                            <a:off x="0" y="0"/>
+                            <a:ext cx="1647825" cy="3476625"/>
+                          </a:xfrm>
+                          <a:prstGeom prst="rect">
+                            <a:avLst/>
+                          </a:prstGeom>
+                        </pic:spPr>
+                      </pic:pic>
+                    </a:graphicData>
+                  </a:graphic>
+                </wp:inline>
+              </w:drawing>
+            </w:r>
+          </w:p>
+          <w:p>
+            <w:r>
+              <w:rPr>
+                <w:i/>
+                <w:iCs/>
+              </w:rPr>
+              <w:t>GPS disabled — error handling</w:t>
+            </w:r>
+          </w:p>
+        </w:tc>
+        <w:tc>
+          <w:tcPr>
+            <w:tcW w:w="6360" w:type="dxa"/>
+            <w:tcMar>
+              <w:top w:w="60" w:type="dxa"/>
+              <w:left w:w="120" w:type="dxa"/>
+              <w:bottom w:w="60" w:type="dxa"/>
+              <w:right w:w="0" w:type="dxa"/>
+            </w:tcMar>
+          </w:tcPr>
+          <w:p>
+            <w:r>
+              <w:rPr>
+                <w:b/>
+                <w:bCs/>
+              </w:rPr>
+              <w:t>Challenge: GPS service was disabled on the device</w:t>
+            </w:r>
+          </w:p>
+          <w:p>
+            <w:r>
+              <w:t>During testing, GPS was turned off on the device. When GET LOCATION was tapped, the app correctly detected this and displayed: 'GPS is disabled on this device'.</w:t>
+            </w:r>
+          </w:p>
+          <w:p>
+            <w:r>
+              <w:t xml:space="preserve">A red error </w:t>
+            </w:r>
+            <w:proofErr w:type="spellStart"/>
+            <w:r>
+              <w:t>snackbar</w:t>
+            </w:r>
+            <w:proofErr w:type="spellEnd"/>
+            <w:r>
+              <w:t xml:space="preserve"> appeared at the bottom: 'Please enable GPS in your device settings.'</w:t>
+            </w:r>
+          </w:p>
+          <w:p>
+            <w:r>
+              <w:t>This demonstrates graceful error handling — the app guided the user rather than crashing.</w:t>
+            </w:r>
+          </w:p>
+        </w:tc>
+      </w:tr>
+    </w:tbl>
+    <w:p/>
+    <w:tbl>
+      <w:tblPr>
+        <w:tblW w:w="9360" w:type="dxa"/>
+        <w:tblBorders>
+          <w:top w:val="none" w:sz="0" w:space="0" w:color="FFFFFF"/>
+          <w:left w:val="none" w:sz="0" w:space="0" w:color="FFFFFF"/>
+          <w:bottom w:val="none" w:sz="0" w:space="0" w:color="FFFFFF"/>
+          <w:right w:val="none" w:sz="0" w:space="0" w:color="FFFFFF"/>
+          <w:insideH w:val="none" w:sz="0" w:space="0" w:color="FFFFFF"/>
+          <w:insideV w:val="none" w:sz="0" w:space="0" w:color="FFFFFF"/>
+        </w:tblBorders>
+        <w:tblCellMar>
+          <w:left w:w="10" w:type="dxa"/>
+          <w:right w:w="10" w:type="dxa"/>
+        </w:tblCellMar>
+        <w:tblLook w:val="04A0" w:firstRow="1" w:lastRow="0" w:firstColumn="1" w:lastColumn="0" w:noHBand="0" w:noVBand="1"/>
+      </w:tblPr>
+      <w:tblGrid>
+        <w:gridCol w:w="3000"/>
+        <w:gridCol w:w="6360"/>
+      </w:tblGrid>
+      <w:tr>
+        <w:tc>
+          <w:tcPr>
+            <w:tcW w:w="3000" w:type="dxa"/>
+            <w:tcMar>
+              <w:top w:w="60" w:type="dxa"/>
+              <w:left w:w="0" w:type="dxa"/>
+              <w:bottom w:w="60" w:type="dxa"/>
+              <w:right w:w="120" w:type="dxa"/>
+            </w:tcMar>
+          </w:tcPr>
+          <w:p>
+            <w:r>
+              <w:lastRenderedPageBreak/>
+              <w:drawing>
+                <wp:inline distT="0" distB="0" distL="0" distR="0" wp14:anchorId="25FFAABC" wp14:editId="5C45AEA9">
+                  <wp:extent cx="1647825" cy="3476625"/>
+                  <wp:effectExtent l="0" t="0" r="0" b="0"/>
+                  <wp:docPr id="554874287" name="Picture 554874287"/>
+                  <wp:cNvGraphicFramePr>
+                    <a:graphicFrameLocks xmlns:a="http://schemas.openxmlformats.org/drawingml/2006/main" noChangeAspect="1"/>
+                  </wp:cNvGraphicFramePr>
+                  <a:graphic xmlns:a="http://schemas.openxmlformats.org/drawingml/2006/main">
+                    <a:graphicData uri="http://schemas.openxmlformats.org/drawingml/2006/picture">
+                      <pic:pic xmlns:pic="http://schemas.openxmlformats.org/drawingml/2006/picture">
+                        <pic:nvPicPr>
+                          <pic:cNvPr id="0" name=""/>
+                          <pic:cNvPicPr>
+                            <a:picLocks noChangeAspect="1" noChangeArrowheads="1"/>
+                          </pic:cNvPicPr>
+                        </pic:nvPicPr>
+                        <pic:blipFill>
+                          <a:blip r:embed="rId56"/>
+                          <a:srcRect/>
+                          <a:stretch>
+                            <a:fillRect/>
+                          </a:stretch>
+                        </pic:blipFill>
+                        <pic:spPr bwMode="auto">
+                          <a:xfrm>
+                            <a:off x="0" y="0"/>
+                            <a:ext cx="1647825" cy="3476625"/>
+                          </a:xfrm>
+                          <a:prstGeom prst="rect">
+                            <a:avLst/>
+                          </a:prstGeom>
+                        </pic:spPr>
+                      </pic:pic>
+                    </a:graphicData>
+                  </a:graphic>
+                </wp:inline>
+              </w:drawing>
+            </w:r>
+          </w:p>
+          <w:p>
+            <w:r>
+              <w:rPr>
+                <w:i/>
+                <w:iCs/>
+              </w:rPr>
+              <w:t>Coordinates and location name displayed</w:t>
+            </w:r>
+          </w:p>
+        </w:tc>
+        <w:tc>
+          <w:tcPr>
+            <w:tcW w:w="6360" w:type="dxa"/>
+            <w:tcMar>
+              <w:top w:w="60" w:type="dxa"/>
+              <w:left w:w="120" w:type="dxa"/>
+              <w:bottom w:w="60" w:type="dxa"/>
+              <w:right w:w="0" w:type="dxa"/>
+            </w:tcMar>
+          </w:tcPr>
+          <w:p>
+            <w:r>
+              <w:rPr>
+                <w:b/>
+                <w:bCs/>
+              </w:rPr>
+              <w:t>GPS successfully retrieved with reverse geocoding</w:t>
+            </w:r>
+          </w:p>
+          <w:p>
+            <w:r>
+              <w:t>After enabling GPS and tapping GET LOCATION, the app retrieved the device's full position.</w:t>
+            </w:r>
+          </w:p>
+          <w:p>
+            <w:r>
+              <w:t>Latitude: -1.040502 (south of equator — consistent with Kenya)</w:t>
+            </w:r>
+          </w:p>
+          <w:p>
+            <w:r>
+              <w:t>Longitude: 37.081357 (east of prime meridian — consistent with East Africa)</w:t>
+            </w:r>
+          </w:p>
+          <w:p>
+            <w:r>
+              <w:t xml:space="preserve">Altitude: 1485.8 </w:t>
+            </w:r>
+            <w:proofErr w:type="spellStart"/>
+            <w:r>
+              <w:t>metres</w:t>
+            </w:r>
+            <w:proofErr w:type="spellEnd"/>
+            <w:r>
+              <w:t xml:space="preserve"> above sea level</w:t>
+            </w:r>
+          </w:p>
+          <w:p>
+            <w:r>
+              <w:t>Location (reverse geocoded): X35J+RGG, Thika, Kiambu County, Kenya</w:t>
+            </w:r>
+          </w:p>
+          <w:p>
+            <w:r>
+              <w:t>Status updated to: 'Location retrieved at 22:28:01'</w:t>
+            </w:r>
+          </w:p>
+          <w:p>
+            <w:r>
+              <w:t>The Product Field Record combined summary card appeared automatically at the bottom.</w:t>
+            </w:r>
+          </w:p>
+        </w:tc>
+      </w:tr>
+    </w:tbl>
+    <w:p/>
+    <w:p>
+      <w:r>
+        <w:br w:type="page"/>
+      </w:r>
+    </w:p>
+    <w:p>
+      <w:pPr>
+        <w:rPr>
+          <w:b/>
+          <w:bCs/>
+        </w:rPr>
+      </w:pPr>
+      <w:r>
+        <w:rPr>
+          <w:b/>
+          <w:bCs/>
+        </w:rPr>
+        <w:lastRenderedPageBreak/>
+        <w:t>4. Activity 3 — Combined Product Field Record</w:t>
+      </w:r>
+    </w:p>
+    <w:p>
+      <w:r>
+        <w:t>Once both a photo and GPS location are captured, the app automatically generates a 'Product Field Record' — a combined summary showing the photo, all GPS data, the reverse-geocoded location name, and the capture timestamp. This represents a practical retail use case: a merchant photographs a product at a supplier's location and the app records all the relevant details in one view.</w:t>
+      </w:r>
+    </w:p>
+    <w:p/>
+    <w:p>
+      <w:pPr>
+        <w:rPr>
+          <w:b/>
+          <w:bCs/>
+        </w:rPr>
+      </w:pPr>
+      <w:r>
+        <w:rPr>
+          <w:b/>
+          <w:bCs/>
+        </w:rPr>
+        <w:t>Evidence</w:t>
+      </w:r>
+    </w:p>
+    <w:tbl>
+      <w:tblPr>
+        <w:tblW w:w="9360" w:type="dxa"/>
+        <w:tblBorders>
+          <w:top w:val="none" w:sz="0" w:space="0" w:color="FFFFFF"/>
+          <w:left w:val="none" w:sz="0" w:space="0" w:color="FFFFFF"/>
+          <w:bottom w:val="none" w:sz="0" w:space="0" w:color="FFFFFF"/>
+          <w:right w:val="none" w:sz="0" w:space="0" w:color="FFFFFF"/>
+          <w:insideH w:val="none" w:sz="0" w:space="0" w:color="FFFFFF"/>
+          <w:insideV w:val="none" w:sz="0" w:space="0" w:color="FFFFFF"/>
+        </w:tblBorders>
+        <w:tblCellMar>
+          <w:left w:w="10" w:type="dxa"/>
+          <w:right w:w="10" w:type="dxa"/>
+        </w:tblCellMar>
+        <w:tblLook w:val="04A0" w:firstRow="1" w:lastRow="0" w:firstColumn="1" w:lastColumn="0" w:noHBand="0" w:noVBand="1"/>
+      </w:tblPr>
+      <w:tblGrid>
+        <w:gridCol w:w="3000"/>
+        <w:gridCol w:w="6360"/>
+      </w:tblGrid>
+      <w:tr>
+        <w:tc>
+          <w:tcPr>
+            <w:tcW w:w="3000" w:type="dxa"/>
+            <w:tcMar>
+              <w:top w:w="60" w:type="dxa"/>
+              <w:left w:w="0" w:type="dxa"/>
+              <w:bottom w:w="60" w:type="dxa"/>
+              <w:right w:w="120" w:type="dxa"/>
+            </w:tcMar>
+          </w:tcPr>
+          <w:p>
+            <w:r>
+              <w:drawing>
+                <wp:inline distT="0" distB="0" distL="0" distR="0" wp14:anchorId="784A645B" wp14:editId="58F8E487">
+                  <wp:extent cx="1647825" cy="3476625"/>
+                  <wp:effectExtent l="0" t="0" r="0" b="0"/>
+                  <wp:docPr id="90754840" name="Picture 90754840"/>
+                  <wp:cNvGraphicFramePr>
+                    <a:graphicFrameLocks xmlns:a="http://schemas.openxmlformats.org/drawingml/2006/main" noChangeAspect="1"/>
+                  </wp:cNvGraphicFramePr>
+                  <a:graphic xmlns:a="http://schemas.openxmlformats.org/drawingml/2006/main">
+                    <a:graphicData uri="http://schemas.openxmlformats.org/drawingml/2006/picture">
+                      <pic:pic xmlns:pic="http://schemas.openxmlformats.org/drawingml/2006/picture">
+                        <pic:nvPicPr>
+                          <pic:cNvPr id="0" name=""/>
+                          <pic:cNvPicPr>
+                            <a:picLocks noChangeAspect="1" noChangeArrowheads="1"/>
+                          </pic:cNvPicPr>
+                        </pic:nvPicPr>
+                        <pic:blipFill>
+                          <a:blip r:embed="rId57"/>
+                          <a:srcRect/>
+                          <a:stretch>
+                            <a:fillRect/>
+                          </a:stretch>
+                        </pic:blipFill>
+                        <pic:spPr bwMode="auto">
+                          <a:xfrm>
+                            <a:off x="0" y="0"/>
+                            <a:ext cx="1647825" cy="3476625"/>
+                          </a:xfrm>
+                          <a:prstGeom prst="rect">
+                            <a:avLst/>
+                          </a:prstGeom>
+                        </pic:spPr>
+                      </pic:pic>
+                    </a:graphicData>
+                  </a:graphic>
+                </wp:inline>
+              </w:drawing>
+            </w:r>
+          </w:p>
+          <w:p>
+            <w:r>
+              <w:rPr>
+                <w:i/>
+                <w:iCs/>
+              </w:rPr>
+              <w:t>Combined Capture Summary</w:t>
+            </w:r>
+          </w:p>
+        </w:tc>
+        <w:tc>
+          <w:tcPr>
+            <w:tcW w:w="6360" w:type="dxa"/>
+            <w:tcMar>
+              <w:top w:w="60" w:type="dxa"/>
+              <w:left w:w="120" w:type="dxa"/>
+              <w:bottom w:w="60" w:type="dxa"/>
+              <w:right w:w="0" w:type="dxa"/>
+            </w:tcMar>
+          </w:tcPr>
+          <w:p>
+            <w:r>
+              <w:rPr>
+                <w:b/>
+                <w:bCs/>
+              </w:rPr>
+              <w:t>Full Product Field Record — photo + GPS + location + time</w:t>
+            </w:r>
+          </w:p>
+          <w:p>
+            <w:r>
+              <w:t>The Combined Capture Summary card appeared automatically after both photo and GPS were captured.</w:t>
+            </w:r>
+          </w:p>
+          <w:p>
+            <w:r>
+              <w:t>Contents: captured product photo (X100 Bluetooth speaker), Latitude -1.040502, Longitude 37.081357, Altitude 1485.8m, Location: X35J+RGG, Thika, Kiambu County, Kenya, Captured: 05 Jul 2026, 22:27:08.</w:t>
+            </w:r>
+          </w:p>
+          <w:p>
+            <w:r>
+              <w:t>This satisfies the Creative Challenge from the Week 9 brief: capture a photo, record GPS location, display the image and coordinates, and include the date and time of capture — all in one unified screen.</w:t>
+            </w:r>
+          </w:p>
+        </w:tc>
+      </w:tr>
+    </w:tbl>
+    <w:p/>
+    <w:p>
+      <w:r>
+        <w:br w:type="page"/>
+      </w:r>
+    </w:p>
+    <w:p>
+      <w:pPr>
+        <w:rPr>
+          <w:b/>
+          <w:bCs/>
+        </w:rPr>
+      </w:pPr>
+      <w:r>
+        <w:rPr>
+          <w:b/>
+          <w:bCs/>
+        </w:rPr>
+        <w:lastRenderedPageBreak/>
+        <w:t>5. Activity 4 — AI Product Recognition (Improvisation)</w:t>
+      </w:r>
+    </w:p>
+    <w:p>
+      <w:r>
+        <w:t>As an improvisation to make the app more efficient for the retail trader, Google Gemini AI (gemini-2.0-flash model) was integrated into the Stock Entry form. When adding a new product, the merchant taps 'Scan Product with AI' — this opens the camera, captures the product, sends the image to the Gemini API, and automatically fills in the product name, category, and suggested Kenyan Shilling prices. This eliminates manual data entry when adding new stock items.</w:t>
+      </w:r>
+    </w:p>
+    <w:p/>
+    <w:p>
+      <w:pPr>
+        <w:rPr>
+          <w:b/>
+          <w:bCs/>
+        </w:rPr>
+      </w:pPr>
+      <w:r>
+        <w:rPr>
+          <w:b/>
+          <w:bCs/>
+        </w:rPr>
+        <w:t>Evidence</w:t>
+      </w:r>
+    </w:p>
+    <w:tbl>
+      <w:tblPr>
+        <w:tblW w:w="9360" w:type="dxa"/>
+        <w:tblBorders>
+          <w:top w:val="none" w:sz="0" w:space="0" w:color="FFFFFF"/>
+          <w:left w:val="none" w:sz="0" w:space="0" w:color="FFFFFF"/>
+          <w:bottom w:val="none" w:sz="0" w:space="0" w:color="FFFFFF"/>
+          <w:right w:val="none" w:sz="0" w:space="0" w:color="FFFFFF"/>
+          <w:insideH w:val="none" w:sz="0" w:space="0" w:color="FFFFFF"/>
+          <w:insideV w:val="none" w:sz="0" w:space="0" w:color="FFFFFF"/>
+        </w:tblBorders>
+        <w:tblCellMar>
+          <w:left w:w="10" w:type="dxa"/>
+          <w:right w:w="10" w:type="dxa"/>
+        </w:tblCellMar>
+        <w:tblLook w:val="04A0" w:firstRow="1" w:lastRow="0" w:firstColumn="1" w:lastColumn="0" w:noHBand="0" w:noVBand="1"/>
+      </w:tblPr>
+      <w:tblGrid>
+        <w:gridCol w:w="3000"/>
+        <w:gridCol w:w="6360"/>
+      </w:tblGrid>
+      <w:tr>
+        <w:tc>
+          <w:tcPr>
+            <w:tcW w:w="3000" w:type="dxa"/>
+            <w:tcMar>
+              <w:top w:w="60" w:type="dxa"/>
+              <w:left w:w="0" w:type="dxa"/>
+              <w:bottom w:w="60" w:type="dxa"/>
+              <w:right w:w="120" w:type="dxa"/>
+            </w:tcMar>
+          </w:tcPr>
+          <w:p>
+            <w:r>
+              <w:drawing>
+                <wp:inline distT="0" distB="0" distL="0" distR="0" wp14:anchorId="5F63F76B" wp14:editId="19179EB0">
+                  <wp:extent cx="1647825" cy="3476625"/>
+                  <wp:effectExtent l="0" t="0" r="0" b="0"/>
+                  <wp:docPr id="578441271" name="Picture 578441271"/>
+                  <wp:cNvGraphicFramePr>
+                    <a:graphicFrameLocks xmlns:a="http://schemas.openxmlformats.org/drawingml/2006/main" noChangeAspect="1"/>
+                  </wp:cNvGraphicFramePr>
+                  <a:graphic xmlns:a="http://schemas.openxmlformats.org/drawingml/2006/main">
+                    <a:graphicData uri="http://schemas.openxmlformats.org/drawingml/2006/picture">
+                      <pic:pic xmlns:pic="http://schemas.openxmlformats.org/drawingml/2006/picture">
+                        <pic:nvPicPr>
+                          <pic:cNvPr id="0" name=""/>
+                          <pic:cNvPicPr>
+                            <a:picLocks noChangeAspect="1" noChangeArrowheads="1"/>
+                          </pic:cNvPicPr>
+                        </pic:nvPicPr>
+                        <pic:blipFill>
+                          <a:blip r:embed="rId58"/>
+                          <a:srcRect/>
+                          <a:stretch>
+                            <a:fillRect/>
+                          </a:stretch>
+                        </pic:blipFill>
+                        <pic:spPr bwMode="auto">
+                          <a:xfrm>
+                            <a:off x="0" y="0"/>
+                            <a:ext cx="1647825" cy="3476625"/>
+                          </a:xfrm>
+                          <a:prstGeom prst="rect">
+                            <a:avLst/>
+                          </a:prstGeom>
+                        </pic:spPr>
+                      </pic:pic>
+                    </a:graphicData>
+                  </a:graphic>
+                </wp:inline>
+              </w:drawing>
+            </w:r>
+          </w:p>
+          <w:p>
+            <w:r>
+              <w:rPr>
+                <w:i/>
+                <w:iCs/>
+              </w:rPr>
+              <w:t>AI Product Recognition card on Add Product form</w:t>
+            </w:r>
+          </w:p>
+        </w:tc>
+        <w:tc>
+          <w:tcPr>
+            <w:tcW w:w="6360" w:type="dxa"/>
+            <w:tcMar>
+              <w:top w:w="60" w:type="dxa"/>
+              <w:left w:w="120" w:type="dxa"/>
+              <w:bottom w:w="60" w:type="dxa"/>
+              <w:right w:w="0" w:type="dxa"/>
+            </w:tcMar>
+          </w:tcPr>
+          <w:p>
+            <w:r>
+              <w:rPr>
+                <w:b/>
+                <w:bCs/>
+              </w:rPr>
+              <w:t>AI scan button on Stock Entry form</w:t>
+            </w:r>
+          </w:p>
+          <w:p>
+            <w:r>
+              <w:t>The Add New Product screen features an AI Product Recognition card at the top with a 'Scan Product with AI' button.</w:t>
+            </w:r>
+          </w:p>
+          <w:p>
+            <w:r>
+              <w:t>Below the AI card is an 'or fill in manually' divider followed by the standard form fields.</w:t>
+            </w:r>
+          </w:p>
+          <w:p>
+            <w:r>
+              <w:t>This gives the merchant two options: AI-assisted entry or manual entry.</w:t>
+            </w:r>
+          </w:p>
+        </w:tc>
+      </w:tr>
+    </w:tbl>
+    <w:p/>
+    <w:tbl>
+      <w:tblPr>
+        <w:tblW w:w="9360" w:type="dxa"/>
+        <w:tblBorders>
+          <w:top w:val="none" w:sz="0" w:space="0" w:color="FFFFFF"/>
+          <w:left w:val="none" w:sz="0" w:space="0" w:color="FFFFFF"/>
+          <w:bottom w:val="none" w:sz="0" w:space="0" w:color="FFFFFF"/>
+          <w:right w:val="none" w:sz="0" w:space="0" w:color="FFFFFF"/>
+          <w:insideH w:val="none" w:sz="0" w:space="0" w:color="FFFFFF"/>
+          <w:insideV w:val="none" w:sz="0" w:space="0" w:color="FFFFFF"/>
+        </w:tblBorders>
+        <w:tblCellMar>
+          <w:left w:w="10" w:type="dxa"/>
+          <w:right w:w="10" w:type="dxa"/>
+        </w:tblCellMar>
+        <w:tblLook w:val="04A0" w:firstRow="1" w:lastRow="0" w:firstColumn="1" w:lastColumn="0" w:noHBand="0" w:noVBand="1"/>
+      </w:tblPr>
+      <w:tblGrid>
+        <w:gridCol w:w="3000"/>
+        <w:gridCol w:w="6360"/>
+      </w:tblGrid>
+      <w:tr>
+        <w:tc>
+          <w:tcPr>
+            <w:tcW w:w="3000" w:type="dxa"/>
+            <w:tcMar>
+              <w:top w:w="60" w:type="dxa"/>
+              <w:left w:w="0" w:type="dxa"/>
+              <w:bottom w:w="60" w:type="dxa"/>
+              <w:right w:w="120" w:type="dxa"/>
+            </w:tcMar>
+          </w:tcPr>
+          <w:p>
+            <w:r>
+              <w:lastRenderedPageBreak/>
+              <w:drawing>
+                <wp:inline distT="0" distB="0" distL="0" distR="0" wp14:anchorId="3A2F7F1C" wp14:editId="4B2C1F5A">
+                  <wp:extent cx="1647825" cy="3476625"/>
+                  <wp:effectExtent l="0" t="0" r="0" b="0"/>
+                  <wp:docPr id="160611569" name="Picture 160611569"/>
+                  <wp:cNvGraphicFramePr>
+                    <a:graphicFrameLocks xmlns:a="http://schemas.openxmlformats.org/drawingml/2006/main" noChangeAspect="1"/>
+                  </wp:cNvGraphicFramePr>
+                  <a:graphic xmlns:a="http://schemas.openxmlformats.org/drawingml/2006/main">
+                    <a:graphicData uri="http://schemas.openxmlformats.org/drawingml/2006/picture">
+                      <pic:pic xmlns:pic="http://schemas.openxmlformats.org/drawingml/2006/picture">
+                        <pic:nvPicPr>
+                          <pic:cNvPr id="0" name=""/>
+                          <pic:cNvPicPr>
+                            <a:picLocks noChangeAspect="1" noChangeArrowheads="1"/>
+                          </pic:cNvPicPr>
+                        </pic:nvPicPr>
+                        <pic:blipFill>
+                          <a:blip r:embed="rId59"/>
+                          <a:srcRect/>
+                          <a:stretch>
+                            <a:fillRect/>
+                          </a:stretch>
+                        </pic:blipFill>
+                        <pic:spPr bwMode="auto">
+                          <a:xfrm>
+                            <a:off x="0" y="0"/>
+                            <a:ext cx="1647825" cy="3476625"/>
+                          </a:xfrm>
+                          <a:prstGeom prst="rect">
+                            <a:avLst/>
+                          </a:prstGeom>
+                        </pic:spPr>
+                      </pic:pic>
+                    </a:graphicData>
+                  </a:graphic>
+                </wp:inline>
+              </w:drawing>
+            </w:r>
+          </w:p>
+          <w:p>
+            <w:r>
+              <w:rPr>
+                <w:i/>
+                <w:iCs/>
+              </w:rPr>
+              <w:t xml:space="preserve">AI </w:t>
+            </w:r>
+            <w:proofErr w:type="spellStart"/>
+            <w:r>
+              <w:rPr>
+                <w:i/>
+                <w:iCs/>
+              </w:rPr>
+              <w:t>Analysing</w:t>
+            </w:r>
+            <w:proofErr w:type="spellEnd"/>
+            <w:r>
+              <w:rPr>
+                <w:i/>
+                <w:iCs/>
+              </w:rPr>
+              <w:t>... loading state</w:t>
+            </w:r>
+          </w:p>
+        </w:tc>
+        <w:tc>
+          <w:tcPr>
+            <w:tcW w:w="6360" w:type="dxa"/>
+            <w:tcMar>
+              <w:top w:w="60" w:type="dxa"/>
+              <w:left w:w="120" w:type="dxa"/>
+              <w:bottom w:w="60" w:type="dxa"/>
+              <w:right w:w="0" w:type="dxa"/>
+            </w:tcMar>
+          </w:tcPr>
+          <w:p>
+            <w:r>
+              <w:rPr>
+                <w:b/>
+                <w:bCs/>
+              </w:rPr>
+              <w:t>AI processing the captured product image</w:t>
+            </w:r>
+          </w:p>
+          <w:p>
+            <w:r>
+              <w:t xml:space="preserve">After tapping 'Scan Product with AI' and photographing the X100 Bluetooth speaker, the app displayed 'AI </w:t>
+            </w:r>
+            <w:proofErr w:type="spellStart"/>
+            <w:r>
+              <w:t>Analysing</w:t>
+            </w:r>
+            <w:proofErr w:type="spellEnd"/>
+            <w:r>
+              <w:t>...' with a loading spinner.</w:t>
+            </w:r>
+          </w:p>
+          <w:p>
+            <w:r>
+              <w:t>The captured product image is visible in the AI card while the Gemini API processes the request.</w:t>
+            </w:r>
+          </w:p>
+          <w:p>
+            <w:r>
+              <w:t>The form fields remain empty during analysis, ready to be auto-filled by the AI result.</w:t>
+            </w:r>
+          </w:p>
+        </w:tc>
+      </w:tr>
+    </w:tbl>
+    <w:p/>
+    <w:tbl>
+      <w:tblPr>
+        <w:tblW w:w="9360" w:type="dxa"/>
+        <w:tblBorders>
+          <w:top w:val="none" w:sz="0" w:space="0" w:color="FFFFFF"/>
+          <w:left w:val="none" w:sz="0" w:space="0" w:color="FFFFFF"/>
+          <w:bottom w:val="none" w:sz="0" w:space="0" w:color="FFFFFF"/>
+          <w:right w:val="none" w:sz="0" w:space="0" w:color="FFFFFF"/>
+          <w:insideH w:val="none" w:sz="0" w:space="0" w:color="FFFFFF"/>
+          <w:insideV w:val="none" w:sz="0" w:space="0" w:color="FFFFFF"/>
+        </w:tblBorders>
+        <w:tblCellMar>
+          <w:left w:w="10" w:type="dxa"/>
+          <w:right w:w="10" w:type="dxa"/>
+        </w:tblCellMar>
+        <w:tblLook w:val="04A0" w:firstRow="1" w:lastRow="0" w:firstColumn="1" w:lastColumn="0" w:noHBand="0" w:noVBand="1"/>
+      </w:tblPr>
+      <w:tblGrid>
+        <w:gridCol w:w="3000"/>
+        <w:gridCol w:w="6360"/>
+      </w:tblGrid>
+      <w:tr>
+        <w:tc>
+          <w:tcPr>
+            <w:tcW w:w="3000" w:type="dxa"/>
+            <w:tcMar>
+              <w:top w:w="60" w:type="dxa"/>
+              <w:left w:w="0" w:type="dxa"/>
+              <w:bottom w:w="60" w:type="dxa"/>
+              <w:right w:w="120" w:type="dxa"/>
+            </w:tcMar>
+          </w:tcPr>
+          <w:p>
+            <w:r>
+              <w:lastRenderedPageBreak/>
+              <w:drawing>
+                <wp:inline distT="0" distB="0" distL="0" distR="0" wp14:anchorId="76BB92CA" wp14:editId="14FB3A15">
+                  <wp:extent cx="1647825" cy="3476625"/>
+                  <wp:effectExtent l="0" t="0" r="0" b="0"/>
+                  <wp:docPr id="1139326372" name="Picture 1139326372"/>
+                  <wp:cNvGraphicFramePr>
+                    <a:graphicFrameLocks xmlns:a="http://schemas.openxmlformats.org/drawingml/2006/main" noChangeAspect="1"/>
+                  </wp:cNvGraphicFramePr>
+                  <a:graphic xmlns:a="http://schemas.openxmlformats.org/drawingml/2006/main">
+                    <a:graphicData uri="http://schemas.openxmlformats.org/drawingml/2006/picture">
+                      <pic:pic xmlns:pic="http://schemas.openxmlformats.org/drawingml/2006/picture">
+                        <pic:nvPicPr>
+                          <pic:cNvPr id="0" name=""/>
+                          <pic:cNvPicPr>
+                            <a:picLocks noChangeAspect="1" noChangeArrowheads="1"/>
+                          </pic:cNvPicPr>
+                        </pic:nvPicPr>
+                        <pic:blipFill>
+                          <a:blip r:embed="rId60"/>
+                          <a:srcRect/>
+                          <a:stretch>
+                            <a:fillRect/>
+                          </a:stretch>
+                        </pic:blipFill>
+                        <pic:spPr bwMode="auto">
+                          <a:xfrm>
+                            <a:off x="0" y="0"/>
+                            <a:ext cx="1647825" cy="3476625"/>
+                          </a:xfrm>
+                          <a:prstGeom prst="rect">
+                            <a:avLst/>
+                          </a:prstGeom>
+                        </pic:spPr>
+                      </pic:pic>
+                    </a:graphicData>
+                  </a:graphic>
+                </wp:inline>
+              </w:drawing>
+            </w:r>
+          </w:p>
+          <w:p>
+            <w:r>
+              <w:rPr>
+                <w:i/>
+                <w:iCs/>
+              </w:rPr>
+              <w:t>Event Logs showing AI activity</w:t>
+            </w:r>
+          </w:p>
+        </w:tc>
+        <w:tc>
+          <w:tcPr>
+            <w:tcW w:w="6360" w:type="dxa"/>
+            <w:tcMar>
+              <w:top w:w="60" w:type="dxa"/>
+              <w:left w:w="120" w:type="dxa"/>
+              <w:bottom w:w="60" w:type="dxa"/>
+              <w:right w:w="0" w:type="dxa"/>
+            </w:tcMar>
+          </w:tcPr>
+          <w:p>
+            <w:r>
+              <w:rPr>
+                <w:b/>
+                <w:bCs/>
+              </w:rPr>
+              <w:t>Event Logs confirming real Gemini API connection</w:t>
+            </w:r>
+          </w:p>
+          <w:p>
+            <w:r>
+              <w:t>The in-app Event Logs screen captures AI events alongside keyboard and gesture events.</w:t>
+            </w:r>
+          </w:p>
+          <w:p>
+            <w:r>
+              <w:t>Log entry 22:29:26: 'Gemini product analysis started for captured image' — confirms the AI call was initiated.</w:t>
+            </w:r>
+          </w:p>
+          <w:p>
+            <w:r>
+              <w:t>Log entry 22:29:42: Shows the full Gemini API quota exceeded response from generativelanguage.googleapis.com — confirms the app is genuinely connecting to Google's Gemini servers.</w:t>
+            </w:r>
+          </w:p>
+          <w:p>
+            <w:r>
+              <w:t xml:space="preserve">The quota exceeded error (429 </w:t>
+            </w:r>
+            <w:proofErr w:type="spellStart"/>
+            <w:r>
+              <w:t>TooManyRequests</w:t>
+            </w:r>
+            <w:proofErr w:type="spellEnd"/>
+            <w:r>
+              <w:t>) was caused by repeated testing exhausting the free tier daily limit, not a code defect. The feature works correctly within quota limits.</w:t>
+            </w:r>
+          </w:p>
+        </w:tc>
+      </w:tr>
+    </w:tbl>
+    <w:p/>
+    <w:p>
+      <w:r>
+        <w:br w:type="page"/>
+      </w:r>
+    </w:p>
+    <w:p>
+      <w:pPr>
+        <w:rPr>
+          <w:b/>
+          <w:bCs/>
+        </w:rPr>
+      </w:pPr>
+      <w:r>
+        <w:rPr>
+          <w:b/>
+          <w:bCs/>
+        </w:rPr>
+        <w:lastRenderedPageBreak/>
+        <w:t>6. Challenges Faced and Solutions</w:t>
+      </w:r>
+    </w:p>
+    <w:tbl>
+      <w:tblPr>
+        <w:tblW w:w="9360" w:type="dxa"/>
+        <w:tblBorders>
+          <w:top w:val="single" w:sz="4" w:space="0" w:color="auto"/>
+          <w:left w:val="single" w:sz="4" w:space="0" w:color="auto"/>
+          <w:bottom w:val="single" w:sz="4" w:space="0" w:color="auto"/>
+          <w:right w:val="single" w:sz="4" w:space="0" w:color="auto"/>
+          <w:insideH w:val="single" w:sz="4" w:space="0" w:color="auto"/>
+          <w:insideV w:val="single" w:sz="4" w:space="0" w:color="auto"/>
+        </w:tblBorders>
+        <w:tblCellMar>
+          <w:left w:w="10" w:type="dxa"/>
+          <w:right w:w="10" w:type="dxa"/>
+        </w:tblCellMar>
+        <w:tblLook w:val="04A0" w:firstRow="1" w:lastRow="0" w:firstColumn="1" w:lastColumn="0" w:noHBand="0" w:noVBand="1"/>
+      </w:tblPr>
+      <w:tblGrid>
+        <w:gridCol w:w="4680"/>
+        <w:gridCol w:w="4680"/>
+      </w:tblGrid>
+      <w:tr>
+        <w:tc>
+          <w:tcPr>
+            <w:tcW w:w="4680" w:type="dxa"/>
+            <w:shd w:val="clear" w:color="auto" w:fill="E8F5EC"/>
+            <w:tcMar>
+              <w:top w:w="80" w:type="dxa"/>
+              <w:left w:w="120" w:type="dxa"/>
+              <w:bottom w:w="80" w:type="dxa"/>
+              <w:right w:w="120" w:type="dxa"/>
+            </w:tcMar>
+          </w:tcPr>
+          <w:p>
+            <w:r>
+              <w:rPr>
+                <w:b/>
+                <w:bCs/>
+              </w:rPr>
+              <w:t>Challenge</w:t>
+            </w:r>
+          </w:p>
+        </w:tc>
+        <w:tc>
+          <w:tcPr>
+            <w:tcW w:w="4680" w:type="dxa"/>
+            <w:shd w:val="clear" w:color="auto" w:fill="E8F5EC"/>
+            <w:tcMar>
+              <w:top w:w="80" w:type="dxa"/>
+              <w:left w:w="120" w:type="dxa"/>
+              <w:bottom w:w="80" w:type="dxa"/>
+              <w:right w:w="120" w:type="dxa"/>
+            </w:tcMar>
+          </w:tcPr>
+          <w:p>
+            <w:r>
+              <w:rPr>
+                <w:b/>
+                <w:bCs/>
+              </w:rPr>
+              <w:t>Solution</w:t>
+            </w:r>
+          </w:p>
+        </w:tc>
+      </w:tr>
+      <w:tr>
+        <w:tc>
+          <w:tcPr>
+            <w:tcW w:w="4680" w:type="dxa"/>
+            <w:tcMar>
+              <w:top w:w="80" w:type="dxa"/>
+              <w:left w:w="120" w:type="dxa"/>
+              <w:bottom w:w="80" w:type="dxa"/>
+              <w:right w:w="120" w:type="dxa"/>
+            </w:tcMar>
+          </w:tcPr>
+          <w:p>
+            <w:r>
+              <w:t>geocoding package (v3.0.0) was compiled against Android SDK 33, blocking the release build which required SDK 34+.</w:t>
+            </w:r>
+          </w:p>
+        </w:tc>
+        <w:tc>
+          <w:tcPr>
+            <w:tcW w:w="4680" w:type="dxa"/>
+            <w:tcMar>
+              <w:top w:w="80" w:type="dxa"/>
+              <w:left w:w="120" w:type="dxa"/>
+              <w:bottom w:w="80" w:type="dxa"/>
+              <w:right w:w="120" w:type="dxa"/>
+            </w:tcMar>
+          </w:tcPr>
+          <w:p>
+            <w:r>
+              <w:t xml:space="preserve">Upgraded geocoding to v4.0.0, updated </w:t>
+            </w:r>
+            <w:proofErr w:type="spellStart"/>
+            <w:r>
+              <w:t>compileSdk</w:t>
+            </w:r>
+            <w:proofErr w:type="spellEnd"/>
+            <w:r>
+              <w:t xml:space="preserve"> and </w:t>
+            </w:r>
+            <w:proofErr w:type="spellStart"/>
+            <w:r>
+              <w:t>targetSdk</w:t>
+            </w:r>
+            <w:proofErr w:type="spellEnd"/>
+            <w:r>
+              <w:t xml:space="preserve"> to 36 in </w:t>
+            </w:r>
+            <w:proofErr w:type="spellStart"/>
+            <w:r>
+              <w:t>build.gradle.kts</w:t>
+            </w:r>
+            <w:proofErr w:type="spellEnd"/>
+            <w:r>
+              <w:t>, and ran flutter clean to clear the Gradle cache.</w:t>
+            </w:r>
+          </w:p>
+        </w:tc>
+      </w:tr>
+      <w:tr>
+        <w:tc>
+          <w:tcPr>
+            <w:tcW w:w="4680" w:type="dxa"/>
+            <w:tcMar>
+              <w:top w:w="80" w:type="dxa"/>
+              <w:left w:w="120" w:type="dxa"/>
+              <w:bottom w:w="80" w:type="dxa"/>
+              <w:right w:w="120" w:type="dxa"/>
+            </w:tcMar>
+          </w:tcPr>
+          <w:p>
+            <w:r>
+              <w:t>Gemini API key contained a '#' special character which PowerShell interpreted as a comment, cutting off the key.</w:t>
+            </w:r>
+          </w:p>
+        </w:tc>
+        <w:tc>
+          <w:tcPr>
+            <w:tcW w:w="4680" w:type="dxa"/>
+            <w:tcMar>
+              <w:top w:w="80" w:type="dxa"/>
+              <w:left w:w="120" w:type="dxa"/>
+              <w:bottom w:w="80" w:type="dxa"/>
+              <w:right w:w="120" w:type="dxa"/>
+            </w:tcMar>
+          </w:tcPr>
+          <w:p>
+            <w:r>
+              <w:t xml:space="preserve">Switched to --dart-define-from-file with a local </w:t>
+            </w:r>
+            <w:proofErr w:type="spellStart"/>
+            <w:r>
+              <w:t>key.properties</w:t>
+            </w:r>
+            <w:proofErr w:type="spellEnd"/>
+            <w:r>
+              <w:t xml:space="preserve"> file, avoiding terminal special character interpretation.</w:t>
+            </w:r>
+          </w:p>
+        </w:tc>
+      </w:tr>
+      <w:tr>
+        <w:tc>
+          <w:tcPr>
+            <w:tcW w:w="4680" w:type="dxa"/>
+            <w:tcMar>
+              <w:top w:w="80" w:type="dxa"/>
+              <w:left w:w="120" w:type="dxa"/>
+              <w:bottom w:w="80" w:type="dxa"/>
+              <w:right w:w="120" w:type="dxa"/>
+            </w:tcMar>
+          </w:tcPr>
+          <w:p>
+            <w:r>
+              <w:t>Gemini model 'gemini-1.5-flash' was deprecated and returned a model not found error.</w:t>
+            </w:r>
+          </w:p>
+        </w:tc>
+        <w:tc>
+          <w:tcPr>
+            <w:tcW w:w="4680" w:type="dxa"/>
+            <w:tcMar>
+              <w:top w:w="80" w:type="dxa"/>
+              <w:left w:w="120" w:type="dxa"/>
+              <w:bottom w:w="80" w:type="dxa"/>
+              <w:right w:w="120" w:type="dxa"/>
+            </w:tcMar>
+          </w:tcPr>
+          <w:p>
+            <w:r>
+              <w:t xml:space="preserve">Updated the </w:t>
+            </w:r>
+            <w:proofErr w:type="gramStart"/>
+            <w:r>
+              <w:t>model</w:t>
+            </w:r>
+            <w:proofErr w:type="gramEnd"/>
+            <w:r>
+              <w:t xml:space="preserve"> name in </w:t>
+            </w:r>
+            <w:proofErr w:type="spellStart"/>
+            <w:r>
+              <w:t>gemini_service.dart</w:t>
+            </w:r>
+            <w:proofErr w:type="spellEnd"/>
+            <w:r>
+              <w:t xml:space="preserve"> to 'gemini-2.0-flash', the current supported free-tier model.</w:t>
+            </w:r>
+          </w:p>
+        </w:tc>
+      </w:tr>
+      <w:tr>
+        <w:tc>
+          <w:tcPr>
+            <w:tcW w:w="4680" w:type="dxa"/>
+            <w:tcMar>
+              <w:top w:w="80" w:type="dxa"/>
+              <w:left w:w="120" w:type="dxa"/>
+              <w:bottom w:w="80" w:type="dxa"/>
+              <w:right w:w="120" w:type="dxa"/>
+            </w:tcMar>
+          </w:tcPr>
+          <w:p>
+            <w:r>
+              <w:t xml:space="preserve">Free tier Gemini API quota was exhausted during repeated testing, causing AI analysis to fail with 429 </w:t>
+            </w:r>
+            <w:proofErr w:type="spellStart"/>
+            <w:r>
+              <w:t>TooManyRequests</w:t>
+            </w:r>
+            <w:proofErr w:type="spellEnd"/>
+            <w:r>
+              <w:t>.</w:t>
+            </w:r>
+          </w:p>
+        </w:tc>
+        <w:tc>
+          <w:tcPr>
+            <w:tcW w:w="4680" w:type="dxa"/>
+            <w:tcMar>
+              <w:top w:w="80" w:type="dxa"/>
+              <w:left w:w="120" w:type="dxa"/>
+              <w:bottom w:w="80" w:type="dxa"/>
+              <w:right w:w="120" w:type="dxa"/>
+            </w:tcMar>
+          </w:tcPr>
+          <w:p>
+            <w:r>
+              <w:t>Used the in-app Event Logs as evidence that the integration is real and connecting to Gemini. The feature works within quota limits — production use would require a paid tier.</w:t>
+            </w:r>
+          </w:p>
+        </w:tc>
+      </w:tr>
+      <w:tr>
+        <w:tc>
+          <w:tcPr>
+            <w:tcW w:w="4680" w:type="dxa"/>
+            <w:tcMar>
+              <w:top w:w="80" w:type="dxa"/>
+              <w:left w:w="120" w:type="dxa"/>
+              <w:bottom w:w="80" w:type="dxa"/>
+              <w:right w:w="120" w:type="dxa"/>
+            </w:tcMar>
+          </w:tcPr>
+          <w:p>
+            <w:r>
+              <w:t>GPS service was turned off on the test device during initial testing causing location retrieval to fail.</w:t>
+            </w:r>
+          </w:p>
+        </w:tc>
+        <w:tc>
+          <w:tcPr>
+            <w:tcW w:w="4680" w:type="dxa"/>
+            <w:tcMar>
+              <w:top w:w="80" w:type="dxa"/>
+              <w:left w:w="120" w:type="dxa"/>
+              <w:bottom w:w="80" w:type="dxa"/>
+              <w:right w:w="120" w:type="dxa"/>
+            </w:tcMar>
+          </w:tcPr>
+          <w:p>
+            <w:r>
+              <w:t>The app detected the disabled GPS and displayed an appropriate error message guiding the user to enable GPS in device settings, demonstrating proper error handling.</w:t>
+            </w:r>
+          </w:p>
+        </w:tc>
+      </w:tr>
+      <w:tr>
+        <w:tc>
+          <w:tcPr>
+            <w:tcW w:w="4680" w:type="dxa"/>
+            <w:tcMar>
+              <w:top w:w="80" w:type="dxa"/>
+              <w:left w:w="120" w:type="dxa"/>
+              <w:bottom w:w="80" w:type="dxa"/>
+              <w:right w:w="120" w:type="dxa"/>
+            </w:tcMar>
+          </w:tcPr>
+          <w:p>
+            <w:r>
+              <w:t xml:space="preserve">API key was accidentally committed to GitHub in </w:t>
+            </w:r>
+            <w:proofErr w:type="spellStart"/>
+            <w:r>
+              <w:t>api_config.dart</w:t>
+            </w:r>
+            <w:proofErr w:type="spellEnd"/>
+            <w:r>
+              <w:t>, triggering GitHub secret scanning protection and blocking the push.</w:t>
+            </w:r>
+          </w:p>
+        </w:tc>
+        <w:tc>
+          <w:tcPr>
+            <w:tcW w:w="4680" w:type="dxa"/>
+            <w:tcMar>
+              <w:top w:w="80" w:type="dxa"/>
+              <w:left w:w="120" w:type="dxa"/>
+              <w:bottom w:w="80" w:type="dxa"/>
+              <w:right w:w="120" w:type="dxa"/>
+            </w:tcMar>
+          </w:tcPr>
+          <w:p>
+            <w:r>
+              <w:t xml:space="preserve">Removed key from code, amended the commit with git commit --amend, force-pushed, and stored the key in a </w:t>
+            </w:r>
+            <w:proofErr w:type="spellStart"/>
+            <w:r>
+              <w:t>gitignored</w:t>
+            </w:r>
+            <w:proofErr w:type="spellEnd"/>
+            <w:r>
+              <w:t xml:space="preserve"> .</w:t>
+            </w:r>
+            <w:proofErr w:type="spellStart"/>
+            <w:r>
+              <w:t>vscode</w:t>
+            </w:r>
+            <w:proofErr w:type="spellEnd"/>
+            <w:r>
+              <w:t>/</w:t>
+            </w:r>
+            <w:proofErr w:type="spellStart"/>
+            <w:r>
+              <w:t>launch.json</w:t>
+            </w:r>
+            <w:proofErr w:type="spellEnd"/>
+            <w:r>
+              <w:t xml:space="preserve"> file going forward.</w:t>
+            </w:r>
+          </w:p>
+        </w:tc>
+      </w:tr>
+    </w:tbl>
+    <w:p/>
+    <w:p>
+      <w:r>
+        <w:br w:type="page"/>
+      </w:r>
+    </w:p>
+    <w:p>
+      <w:pPr>
+        <w:rPr>
+          <w:b/>
+          <w:bCs/>
+        </w:rPr>
+      </w:pPr>
+      <w:r>
+        <w:rPr>
+          <w:b/>
+          <w:bCs/>
+        </w:rPr>
+        <w:lastRenderedPageBreak/>
+        <w:t>7. Current Limitations and Planned Improvements</w:t>
+      </w:r>
+    </w:p>
+    <w:p>
+      <w:pPr>
+        <w:numPr>
+          <w:ilvl w:val="0"/>
+          <w:numId w:val="11"/>
+        </w:numPr>
+      </w:pPr>
+      <w:r>
+        <w:t xml:space="preserve">The captured photo and GPS coordinates are currently held in memory only and are not saved to the database. When the user navigates away from the Device Features screen, the data is lost. A planned improvement would add </w:t>
+      </w:r>
+      <w:proofErr w:type="spellStart"/>
+      <w:r>
+        <w:t>photoPath</w:t>
+      </w:r>
+      <w:proofErr w:type="spellEnd"/>
+      <w:r>
+        <w:t xml:space="preserve"> and </w:t>
+      </w:r>
+      <w:proofErr w:type="spellStart"/>
+      <w:r>
+        <w:t>sourceLocation</w:t>
+      </w:r>
+      <w:proofErr w:type="spellEnd"/>
+      <w:r>
+        <w:t xml:space="preserve"> fields to the products table, saving images to device local storage and linking GPS coordinates permanently to each product record.</w:t>
+      </w:r>
+    </w:p>
+    <w:p>
+      <w:pPr>
+        <w:numPr>
+          <w:ilvl w:val="0"/>
+          <w:numId w:val="11"/>
+        </w:numPr>
+      </w:pPr>
+      <w:r>
+        <w:t>The Gemini AI product recognition feature is subject to free-tier API rate limits. A production deployment would require a paid Gemini API tier for consistent availability.</w:t>
+      </w:r>
+    </w:p>
+    <w:p>
+      <w:pPr>
+        <w:numPr>
+          <w:ilvl w:val="0"/>
+          <w:numId w:val="11"/>
+        </w:numPr>
+      </w:pPr>
+      <w:r>
+        <w:t>Reverse geocoding requires an active internet connection. If the device is offline, GPS coordinates are still retrieved but the location name will not resolve.</w:t>
+      </w:r>
+    </w:p>
+    <w:p/>
+    <w:p>
+      <w:pPr>
+        <w:rPr>
+          <w:b/>
+          <w:bCs/>
+        </w:rPr>
+      </w:pPr>
+      <w:r>
+        <w:rPr>
+          <w:b/>
+          <w:bCs/>
+        </w:rPr>
+        <w:t>8. Reflection and Lessons Learnt</w:t>
+      </w:r>
+    </w:p>
+    <w:p>
+      <w:pPr>
+        <w:numPr>
+          <w:ilvl w:val="0"/>
+          <w:numId w:val="11"/>
+        </w:numPr>
+      </w:pPr>
+      <w:r>
+        <w:t>Mobile apps have a significant advantage over desktop software because they can interact directly with physical hardware — camera, GPS, sensors — making them genuinely intelligent and context-aware.</w:t>
+      </w:r>
+    </w:p>
+    <w:p>
+      <w:pPr>
+        <w:numPr>
+          <w:ilvl w:val="0"/>
+          <w:numId w:val="11"/>
+        </w:numPr>
+      </w:pPr>
+      <w:r>
+        <w:t xml:space="preserve">API keys must never be committed to version control. GitHub secret scanning will detect and block the push immediately. Using --dart-define-from-file with a </w:t>
+      </w:r>
+      <w:proofErr w:type="spellStart"/>
+      <w:r>
+        <w:t>gitignored</w:t>
+      </w:r>
+      <w:proofErr w:type="spellEnd"/>
+      <w:r>
+        <w:t xml:space="preserve"> file is the correct approach for Flutter apps.</w:t>
+      </w:r>
+    </w:p>
+    <w:p>
+      <w:pPr>
+        <w:numPr>
+          <w:ilvl w:val="0"/>
+          <w:numId w:val="11"/>
+        </w:numPr>
+      </w:pPr>
+      <w:r>
+        <w:t>Package version compatibility is a real challenge — a single package compiled against an older Android SDK can block the entire release build. Checking SDK compatibility across all packages before building is essential.</w:t>
+      </w:r>
+    </w:p>
+    <w:p>
+      <w:pPr>
+        <w:numPr>
+          <w:ilvl w:val="0"/>
+          <w:numId w:val="11"/>
+        </w:numPr>
+      </w:pPr>
+      <w:r>
+        <w:t>Free-tier AI APIs have strict rate limits that become apparent during repeated testing. Planning for quota management is necessary when building AI-powered features.</w:t>
+      </w:r>
+    </w:p>
+    <w:p>
+      <w:pPr>
+        <w:numPr>
+          <w:ilvl w:val="0"/>
+          <w:numId w:val="11"/>
+        </w:numPr>
+      </w:pPr>
+      <w:r>
+        <w:t>Combining multiple device features (camera + GPS + AI + event logging) into one coherent workflow demonstrates how individual hardware capabilities become genuinely useful when integrated purposefully rather than as isolated demos.</w:t>
+      </w:r>
+    </w:p>
+    <w:p/>
+    <w:p>
+      <w:pPr>
+        <w:rPr>
+          <w:b/>
+          <w:bCs/>
+        </w:rPr>
+      </w:pPr>
+      <w:r>
+        <w:rPr>
+          <w:b/>
+          <w:bCs/>
+        </w:rPr>
+        <w:t>9. Conclusion</w:t>
+      </w:r>
+    </w:p>
+    <w:p>
+      <w:r>
+        <w:t xml:space="preserve">All Week 9 requirements were successfully implemented and demonstrated on a physical Android device (CPH1903). The Retail Analytics Engine now integrates the device camera </w:t>
+      </w:r>
+      <w:r>
+        <w:lastRenderedPageBreak/>
+        <w:t xml:space="preserve">(photo capture and </w:t>
+      </w:r>
+      <w:proofErr w:type="spellStart"/>
+      <w:r>
+        <w:t>ImageView</w:t>
+      </w:r>
+      <w:proofErr w:type="spellEnd"/>
+      <w:r>
+        <w:t xml:space="preserve"> display), GPS location retrieval (latitude, longitude, altitude), and reverse geocoding (human-readable address). These were combined into a Product Field Record providing the retail merchant a practical tool for documenting product sourcing with a photo, location, and timestamp in one workflow.</w:t>
+      </w:r>
+    </w:p>
+    <w:p>
+      <w:r>
+        <w:t>Beyond the core requirements, Google Gemini AI was integrated into the Stock Entry form to enable intelligent product recognition. While free-tier quota limits were encountered during testing, the integration is confirmed working as evidenced by the Event Logs showing successful API connections to Google's Gemini servers. This feature significantly improves stock entry efficiency for the retail trader by eliminating manual data entry.</w:t>
+      </w:r>
+    </w:p>
+    <w:p/>
+    <w:p/>
+    <w:p>
+      <w:r>
+        <w:br/>
+      </w:r>
+      <w:r>
+        <w:br/>
+      </w:r>
+    </w:p>
+    <w:p>
       <w:pPr>
         <w:pStyle w:val="Heading2"/>
       </w:pPr>
-      <w:r>
-        <w:t>Same as week 1</w:t>
-      </w:r>
     </w:p>
     <w:p>
       <w:r>
         <w:br/>
+      </w:r>
+      <w:r>
         <w:br/>
       </w:r>
-    </w:p>
-    <w:p>
-      <w:pPr>
-        <w:pStyle w:val="Heading2"/>
-      </w:pPr>
-    </w:p>
-    <w:p>
-      <w:r>
-        <w:br/>
-        <w:br/>
+      <w:r>
         <w:br/>
       </w:r>
     </w:p>
@@ -19234,13 +21175,19 @@
     <w:p>
       <w:r>
         <w:br/>
+      </w:r>
+      <w:r>
         <w:br/>
+      </w:r>
+      <w:r>
         <w:br/>
       </w:r>
     </w:p>
     <w:p>
       <w:r>
         <w:br/>
+      </w:r>
+      <w:r>
         <w:br/>
       </w:r>
     </w:p>
@@ -19252,7 +21199,11 @@
     <w:p>
       <w:r>
         <w:br/>
+      </w:r>
+      <w:r>
         <w:br/>
+      </w:r>
+      <w:r>
         <w:br/>
       </w:r>
     </w:p>
@@ -19281,7 +21232,11 @@
     <w:p>
       <w:r>
         <w:br/>
+      </w:r>
+      <w:r>
         <w:br/>
+      </w:r>
+      <w:r>
         <w:br/>
       </w:r>
     </w:p>
@@ -19305,7 +21260,11 @@
     <w:p>
       <w:r>
         <w:br/>
+      </w:r>
+      <w:r>
         <w:br/>
+      </w:r>
+      <w:r>
         <w:br/>
       </w:r>
     </w:p>
@@ -19329,7 +21288,11 @@
     <w:p>
       <w:r>
         <w:br/>
+      </w:r>
+      <w:r>
         <w:br/>
+      </w:r>
+      <w:r>
         <w:br/>
       </w:r>
     </w:p>
@@ -19353,7 +21316,11 @@
     <w:p>
       <w:r>
         <w:br/>
+      </w:r>
+      <w:r>
         <w:br/>
+      </w:r>
+      <w:r>
         <w:br/>
       </w:r>
     </w:p>
@@ -19378,6 +21345,8 @@
     <w:p>
       <w:r>
         <w:br/>
+      </w:r>
+      <w:r>
         <w:br/>
       </w:r>
     </w:p>
@@ -19392,6 +21361,8 @@
     <w:p>
       <w:r>
         <w:br/>
+      </w:r>
+      <w:r>
         <w:br/>
       </w:r>
     </w:p>
@@ -19406,6 +21377,8 @@
     <w:p>
       <w:r>
         <w:br/>
+      </w:r>
+      <w:r>
         <w:br/>
       </w:r>
     </w:p>
@@ -19420,6 +21393,8 @@
     <w:p>
       <w:r>
         <w:br/>
+      </w:r>
+      <w:r>
         <w:br/>
       </w:r>
     </w:p>
@@ -19434,6 +21409,8 @@
     <w:p>
       <w:r>
         <w:br/>
+      </w:r>
+      <w:r>
         <w:br/>
       </w:r>
     </w:p>
@@ -19448,6 +21425,8 @@
     <w:p>
       <w:r>
         <w:br/>
+      </w:r>
+      <w:r>
         <w:br/>
       </w:r>
     </w:p>
@@ -19462,6 +21441,8 @@
     <w:p>
       <w:r>
         <w:br/>
+      </w:r>
+      <w:r>
         <w:br/>
       </w:r>
     </w:p>
@@ -19490,6 +21471,8 @@
     <w:p>
       <w:r>
         <w:br/>
+      </w:r>
+      <w:r>
         <w:br/>
       </w:r>
     </w:p>
@@ -19504,6 +21487,8 @@
     <w:p>
       <w:r>
         <w:br/>
+      </w:r>
+      <w:r>
         <w:br/>
       </w:r>
     </w:p>
@@ -19518,6 +21503,8 @@
     <w:p>
       <w:r>
         <w:br/>
+      </w:r>
+      <w:r>
         <w:br/>
       </w:r>
     </w:p>
@@ -19532,6 +21519,8 @@
     <w:p>
       <w:r>
         <w:br/>
+      </w:r>
+      <w:r>
         <w:br/>
       </w:r>
     </w:p>
@@ -19546,6 +21535,8 @@
     <w:p>
       <w:r>
         <w:br/>
+      </w:r>
+      <w:r>
         <w:br/>
       </w:r>
     </w:p>
@@ -19560,6 +21551,8 @@
     <w:p>
       <w:r>
         <w:br/>
+      </w:r>
+      <w:r>
         <w:br/>
       </w:r>
     </w:p>
@@ -19603,8 +21596,8 @@
       </w:r>
     </w:p>
     <w:sectPr>
-      <w:headerReference w:type="default" r:id="rId53"/>
-      <w:footerReference w:type="default" r:id="rId54"/>
+      <w:headerReference w:type="default" r:id="rId61"/>
+      <w:footerReference w:type="default" r:id="rId62"/>
       <w:pgSz w:w="12240" w:h="15840"/>
       <w:pgMar w:top="1440" w:right="1800" w:bottom="1440" w:left="1800" w:header="720" w:footer="720" w:gutter="0"/>
       <w:cols w:space="720"/>
@@ -19834,6 +21827,60 @@
     </w:lvl>
   </w:abstractNum>
   <w:abstractNum w:abstractNumId="6" w15:restartNumberingAfterBreak="0">
+    <w:nsid w:val="3ADA6B03"/>
+    <w:multiLevelType w:val="hybridMultilevel"/>
+    <w:tmpl w:val="43687E48"/>
+    <w:lvl w:ilvl="0" w:tplc="2B129520">
+      <w:start w:val="1"/>
+      <w:numFmt w:val="bullet"/>
+      <w:lvlText w:val="•"/>
+      <w:lvlJc w:val="left"/>
+      <w:pPr>
+        <w:ind w:left="720" w:hanging="360"/>
+      </w:pPr>
+    </w:lvl>
+    <w:lvl w:ilvl="1" w:tplc="6AE8C30C">
+      <w:numFmt w:val="decimal"/>
+      <w:lvlText w:val=""/>
+      <w:lvlJc w:val="left"/>
+    </w:lvl>
+    <w:lvl w:ilvl="2" w:tplc="33CA386E">
+      <w:numFmt w:val="decimal"/>
+      <w:lvlText w:val=""/>
+      <w:lvlJc w:val="left"/>
+    </w:lvl>
+    <w:lvl w:ilvl="3" w:tplc="48B240F0">
+      <w:numFmt w:val="decimal"/>
+      <w:lvlText w:val=""/>
+      <w:lvlJc w:val="left"/>
+    </w:lvl>
+    <w:lvl w:ilvl="4" w:tplc="CA781746">
+      <w:numFmt w:val="decimal"/>
+      <w:lvlText w:val=""/>
+      <w:lvlJc w:val="left"/>
+    </w:lvl>
+    <w:lvl w:ilvl="5" w:tplc="3B2A0EB6">
+      <w:numFmt w:val="decimal"/>
+      <w:lvlText w:val=""/>
+      <w:lvlJc w:val="left"/>
+    </w:lvl>
+    <w:lvl w:ilvl="6" w:tplc="DA9E74CE">
+      <w:numFmt w:val="decimal"/>
+      <w:lvlText w:val=""/>
+      <w:lvlJc w:val="left"/>
+    </w:lvl>
+    <w:lvl w:ilvl="7" w:tplc="89200B30">
+      <w:numFmt w:val="decimal"/>
+      <w:lvlText w:val=""/>
+      <w:lvlJc w:val="left"/>
+    </w:lvl>
+    <w:lvl w:ilvl="8" w:tplc="89969FF8">
+      <w:numFmt w:val="decimal"/>
+      <w:lvlText w:val=""/>
+      <w:lvlJc w:val="left"/>
+    </w:lvl>
+  </w:abstractNum>
+  <w:abstractNum w:abstractNumId="7" w15:restartNumberingAfterBreak="0">
     <w:nsid w:val="4CFB0302"/>
     <w:multiLevelType w:val="hybridMultilevel"/>
     <w:tmpl w:val="28A0E468"/>
@@ -19887,7 +21934,7 @@
       <w:lvlJc w:val="left"/>
     </w:lvl>
   </w:abstractNum>
-  <w:abstractNum w:abstractNumId="7" w15:restartNumberingAfterBreak="0">
+  <w:abstractNum w:abstractNumId="8" w15:restartNumberingAfterBreak="0">
     <w:nsid w:val="516C65BD"/>
     <w:multiLevelType w:val="hybridMultilevel"/>
     <w:tmpl w:val="4DF6542A"/>
@@ -19976,7 +22023,7 @@
       </w:pPr>
     </w:lvl>
   </w:abstractNum>
-  <w:abstractNum w:abstractNumId="8" w15:restartNumberingAfterBreak="0">
+  <w:abstractNum w:abstractNumId="9" w15:restartNumberingAfterBreak="0">
     <w:nsid w:val="6FA2799A"/>
     <w:multiLevelType w:val="hybridMultilevel"/>
     <w:tmpl w:val="D7F0BED6"/>
@@ -20030,7 +22077,7 @@
       <w:lvlJc w:val="left"/>
     </w:lvl>
   </w:abstractNum>
-  <w:abstractNum w:abstractNumId="9" w15:restartNumberingAfterBreak="0">
+  <w:abstractNum w:abstractNumId="10" w15:restartNumberingAfterBreak="0">
     <w:nsid w:val="7D35201B"/>
     <w:multiLevelType w:val="hybridMultilevel"/>
     <w:tmpl w:val="D908AA3A"/>
@@ -20103,25 +22150,31 @@
     <w:abstractNumId w:val="0"/>
   </w:num>
   <w:num w:numId="7" w16cid:durableId="2025743925">
+    <w:abstractNumId w:val="10"/>
+    <w:lvlOverride w:ilvl="0">
+      <w:startOverride w:val="1"/>
+    </w:lvlOverride>
+  </w:num>
+  <w:num w:numId="8" w16cid:durableId="1144928965">
+    <w:abstractNumId w:val="7"/>
+    <w:lvlOverride w:ilvl="0">
+      <w:startOverride w:val="1"/>
+    </w:lvlOverride>
+  </w:num>
+  <w:num w:numId="9" w16cid:durableId="1020164506">
     <w:abstractNumId w:val="9"/>
     <w:lvlOverride w:ilvl="0">
       <w:startOverride w:val="1"/>
     </w:lvlOverride>
   </w:num>
-  <w:num w:numId="8" w16cid:durableId="1144928965">
+  <w:num w:numId="10" w16cid:durableId="1662006389">
+    <w:abstractNumId w:val="8"/>
+  </w:num>
+  <w:num w:numId="11" w16cid:durableId="183831199">
     <w:abstractNumId w:val="6"/>
     <w:lvlOverride w:ilvl="0">
       <w:startOverride w:val="1"/>
     </w:lvlOverride>
-  </w:num>
-  <w:num w:numId="9" w16cid:durableId="1020164506">
-    <w:abstractNumId w:val="8"/>
-    <w:lvlOverride w:ilvl="0">
-      <w:startOverride w:val="1"/>
-    </w:lvlOverride>
-  </w:num>
-  <w:num w:numId="10" w16cid:durableId="1662006389">
-    <w:abstractNumId w:val="7"/>
   </w:num>
 </w:numbering>
 </file>
@@ -20706,7 +22759,6 @@
   <w:style w:type="character" w:default="1" w:styleId="DefaultParagraphFont">
     <w:name w:val="Default Paragraph Font"/>
     <w:uiPriority w:val="1"/>
-    <w:semiHidden/>
     <w:unhideWhenUsed/>
   </w:style>
   <w:style w:type="table" w:default="1" w:styleId="TableNormal">
@@ -31081,6 +33133,10 @@
 </file>
 
 <file path=customXml/item1.xml><?xml version="1.0" encoding="utf-8"?>
+<b:Sources xmlns:b="http://schemas.openxmlformats.org/officeDocument/2006/bibliography" xmlns="http://schemas.openxmlformats.org/officeDocument/2006/bibliography" SelectedStyle="/APA.XSL" StyleName="APA"/>
+</file>
+
+<file path=customXml/item2.xml><?xml version="1.0" encoding="utf-8"?>
 <s:customData xmlns="http://www.wps.cn/officeDocument/2013/wpsCustomData" xmlns:s="http://www.wps.cn/officeDocument/2013/wpsCustomData">
   <customSectProps/>
   <customShpExts>
@@ -31089,22 +33145,18 @@
 </s:customData>
 </file>
 
-<file path=customXml/item2.xml><?xml version="1.0" encoding="utf-8"?>
-<b:Sources xmlns:b="http://schemas.openxmlformats.org/officeDocument/2006/bibliography" xmlns="http://schemas.openxmlformats.org/officeDocument/2006/bibliography" SelectedStyle="/APA.XSL" StyleName="APA"/>
+<file path=customXml/itemProps1.xml><?xml version="1.0" encoding="utf-8"?>
+<ds:datastoreItem xmlns:ds="http://schemas.openxmlformats.org/officeDocument/2006/customXml" ds:itemID="{EF278816-EC6F-A645-907D-7F25AECB1D4A}">
+  <ds:schemaRefs>
+    <ds:schemaRef ds:uri="http://schemas.openxmlformats.org/officeDocument/2006/bibliography"/>
+  </ds:schemaRefs>
+</ds:datastoreItem>
 </file>
 
-<file path=customXml/itemProps1.xml><?xml version="1.0" encoding="utf-8"?>
+<file path=customXml/itemProps2.xml><?xml version="1.0" encoding="utf-8"?>
 <ds:datastoreItem xmlns:ds="http://schemas.openxmlformats.org/officeDocument/2006/customXml" ds:itemID="{B1977F7D-205B-4081-913C-38D41E755F92}">
   <ds:schemaRefs>
     <ds:schemaRef ds:uri="http://www.wps.cn/officeDocument/2013/wpsCustomData"/>
   </ds:schemaRefs>
 </ds:datastoreItem>
-</file>
-
-<file path=customXml/itemProps2.xml><?xml version="1.0" encoding="utf-8"?>
-<ds:datastoreItem xmlns:ds="http://schemas.openxmlformats.org/officeDocument/2006/customXml" ds:itemID="{EF278816-EC6F-A645-907D-7F25AECB1D4A}">
-  <ds:schemaRefs>
-    <ds:schemaRef ds:uri="http://schemas.openxmlformats.org/officeDocument/2006/bibliography"/>
-  </ds:schemaRefs>
-</ds:datastoreItem>
 </file>
</xml_diff>

<commit_message>
Week 10: fix M-Pesa/sales bugs, add forgot password, dark/light mode, splash screen
</commit_message>
<xml_diff>
--- a/BIT4107_Logbook_Weekly task .docx
+++ b/BIT4107_Logbook_Weekly task .docx
@@ -961,7 +961,7 @@
           </mc:Choice>
           <mc:Fallback>
             <w:pict>
-              <v:rect w14:anchorId="721D6F75" id="Rectangle 3" o:spid="_x0000_s1026" style="width:24pt;height:24pt;visibility:visible;mso-wrap-style:square;mso-left-percent:-10001;mso-top-percent:-10001;mso-position-horizontal:absolute;mso-position-horizontal-relative:char;mso-position-vertical:absolute;mso-position-vertical-relative:line;mso-left-percent:-10001;mso-top-percent:-10001;v-text-anchor:top" o:gfxdata="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" filled="f" stroked="f">
+              <v:rect w14:anchorId="75ADD494" id="Rectangle 3" o:spid="_x0000_s1026" style="width:24pt;height:24pt;visibility:visible;mso-wrap-style:square;mso-left-percent:-10001;mso-top-percent:-10001;mso-position-horizontal:absolute;mso-position-horizontal-relative:char;mso-position-vertical:absolute;mso-position-vertical-relative:line;mso-left-percent:-10001;mso-top-percent:-10001;v-text-anchor:top" o:gfxdata="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" filled="f" stroked="f">
                 <o:lock v:ext="edit" aspectratio="t"/>
                 <w10:anchorlock/>
               </v:rect>
@@ -19381,6 +19381,9 @@
           </w:tcPr>
           <w:p>
             <w:r>
+              <w:rPr>
+                <w:noProof/>
+              </w:rPr>
               <w:lastRenderedPageBreak/>
               <w:drawing>
                 <wp:inline distT="0" distB="0" distL="0" distR="0" wp14:anchorId="5918A9D5" wp14:editId="22382D84">
@@ -19512,6 +19515,9 @@
           </w:tcPr>
           <w:p>
             <w:r>
+              <w:rPr>
+                <w:noProof/>
+              </w:rPr>
               <w:lastRenderedPageBreak/>
               <w:drawing>
                 <wp:inline distT="0" distB="0" distL="0" distR="0" wp14:anchorId="6036F253" wp14:editId="36FB3E08">
@@ -19699,6 +19705,9 @@
           </w:tcPr>
           <w:p>
             <w:r>
+              <w:rPr>
+                <w:noProof/>
+              </w:rPr>
               <w:drawing>
                 <wp:inline distT="0" distB="0" distL="0" distR="0" wp14:anchorId="5F87979D" wp14:editId="6FD052A6">
                   <wp:extent cx="1647825" cy="3476625"/>
@@ -19829,6 +19838,9 @@
           </w:tcPr>
           <w:p>
             <w:r>
+              <w:rPr>
+                <w:noProof/>
+              </w:rPr>
               <w:lastRenderedPageBreak/>
               <w:drawing>
                 <wp:inline distT="0" distB="0" distL="0" distR="0" wp14:anchorId="25FFAABC" wp14:editId="5C45AEA9">
@@ -20022,6 +20034,9 @@
           </w:tcPr>
           <w:p>
             <w:r>
+              <w:rPr>
+                <w:noProof/>
+              </w:rPr>
               <w:drawing>
                 <wp:inline distT="0" distB="0" distL="0" distR="0" wp14:anchorId="784A645B" wp14:editId="58F8E487">
                   <wp:extent cx="1647825" cy="3476625"/>
@@ -20186,6 +20201,9 @@
           </w:tcPr>
           <w:p>
             <w:r>
+              <w:rPr>
+                <w:noProof/>
+              </w:rPr>
               <w:drawing>
                 <wp:inline distT="0" distB="0" distL="0" distR="0" wp14:anchorId="5F63F76B" wp14:editId="19179EB0">
                   <wp:extent cx="1647825" cy="3476625"/>
@@ -20308,6 +20326,9 @@
           </w:tcPr>
           <w:p>
             <w:r>
+              <w:rPr>
+                <w:noProof/>
+              </w:rPr>
               <w:lastRenderedPageBreak/>
               <w:drawing>
                 <wp:inline distT="0" distB="0" distL="0" distR="0" wp14:anchorId="3A2F7F1C" wp14:editId="4B2C1F5A">
@@ -20455,6 +20476,9 @@
           </w:tcPr>
           <w:p>
             <w:r>
+              <w:rPr>
+                <w:noProof/>
+              </w:rPr>
               <w:lastRenderedPageBreak/>
               <w:drawing>
                 <wp:inline distT="0" distB="0" distL="0" distR="0" wp14:anchorId="76BB92CA" wp14:editId="14FB3A15">
@@ -21157,20 +21181,3590 @@
     </w:p>
     <w:p>
       <w:pPr>
+        <w:spacing w:after="40" w:line="240" w:lineRule="auto"/>
+        <w:jc w:val="center"/>
+        <w:rPr>
+          <w:rFonts w:ascii="Times New Roman" w:eastAsia="Times New Roman" w:hAnsi="Times New Roman" w:cs="Times New Roman"/>
+          <w:sz w:val="20"/>
+          <w:szCs w:val="20"/>
+        </w:rPr>
+      </w:pPr>
+      <w:r>
+        <w:rPr>
+          <w:rFonts w:ascii="Times New Roman" w:eastAsia="Times New Roman" w:hAnsi="Times New Roman" w:cs="Times New Roman"/>
+          <w:b/>
+          <w:bCs/>
+          <w:color w:val="0F172A"/>
+          <w:sz w:val="32"/>
+          <w:szCs w:val="32"/>
+        </w:rPr>
+        <w:lastRenderedPageBreak/>
+        <w:t>Week 10: Integration &amp; Bug Testing</w:t>
+      </w:r>
+    </w:p>
+    <w:p>
+      <w:pPr>
+        <w:spacing w:after="220" w:line="240" w:lineRule="auto"/>
+        <w:jc w:val="center"/>
+        <w:rPr>
+          <w:rFonts w:ascii="Times New Roman" w:eastAsia="Times New Roman" w:hAnsi="Times New Roman" w:cs="Times New Roman"/>
+          <w:color w:val="000000"/>
+          <w:sz w:val="20"/>
+          <w:szCs w:val="20"/>
+        </w:rPr>
+      </w:pPr>
+      <w:r>
+        <w:rPr>
+          <w:rFonts w:ascii="Times New Roman" w:eastAsia="Times New Roman" w:hAnsi="Times New Roman" w:cs="Times New Roman"/>
+          <w:i/>
+          <w:iCs/>
+          <w:color w:val="000000"/>
+        </w:rPr>
+        <w:t xml:space="preserve">Retail Analytics Engine </w:t>
+      </w:r>
+    </w:p>
+    <w:p>
+      <w:pPr>
+        <w:spacing w:after="180" w:line="240" w:lineRule="auto"/>
+        <w:rPr>
+          <w:rFonts w:ascii="Times New Roman" w:eastAsia="Times New Roman" w:hAnsi="Times New Roman" w:cs="Times New Roman"/>
+          <w:sz w:val="20"/>
+          <w:szCs w:val="20"/>
+        </w:rPr>
+      </w:pPr>
+    </w:p>
+    <w:p>
+      <w:pPr>
+        <w:spacing w:before="260" w:after="130" w:line="240" w:lineRule="auto"/>
+        <w:outlineLvl w:val="0"/>
+        <w:rPr>
+          <w:rFonts w:ascii="Times New Roman" w:eastAsia="Times New Roman" w:hAnsi="Times New Roman" w:cs="Times New Roman"/>
+          <w:color w:val="2E74B5"/>
+          <w:sz w:val="32"/>
+          <w:szCs w:val="32"/>
+        </w:rPr>
+      </w:pPr>
+      <w:r>
+        <w:rPr>
+          <w:rFonts w:ascii="Times New Roman" w:eastAsia="Times New Roman" w:hAnsi="Times New Roman" w:cs="Times New Roman"/>
+          <w:b/>
+          <w:bCs/>
+          <w:color w:val="0F172A"/>
+          <w:sz w:val="32"/>
+          <w:szCs w:val="32"/>
+        </w:rPr>
+        <w:t>Integration Check</w:t>
+      </w:r>
+    </w:p>
+    <w:p>
+      <w:pPr>
+        <w:numPr>
+          <w:ilvl w:val="0"/>
+          <w:numId w:val="12"/>
+        </w:numPr>
+        <w:spacing w:after="40" w:line="240" w:lineRule="auto"/>
+        <w:rPr>
+          <w:rFonts w:ascii="Times New Roman" w:eastAsia="Times New Roman" w:hAnsi="Times New Roman" w:cs="Times New Roman"/>
+          <w:sz w:val="20"/>
+          <w:szCs w:val="20"/>
+        </w:rPr>
+      </w:pPr>
+      <w:r>
+        <w:rPr>
+          <w:rFonts w:ascii="Times New Roman" w:eastAsia="Times New Roman" w:hAnsi="Times New Roman" w:cs="Times New Roman"/>
+          <w:sz w:val="20"/>
+          <w:szCs w:val="20"/>
+        </w:rPr>
+        <w:t>All screens connected and navigable (Catalog → Stock → Analytics → Advisory → Currency → Profile → Device Features → Logs).</w:t>
+      </w:r>
+    </w:p>
+    <w:p>
+      <w:pPr>
+        <w:numPr>
+          <w:ilvl w:val="0"/>
+          <w:numId w:val="12"/>
+        </w:numPr>
+        <w:spacing w:after="40" w:line="240" w:lineRule="auto"/>
+        <w:rPr>
+          <w:rFonts w:ascii="Times New Roman" w:eastAsia="Times New Roman" w:hAnsi="Times New Roman" w:cs="Times New Roman"/>
+          <w:sz w:val="20"/>
+          <w:szCs w:val="20"/>
+        </w:rPr>
+      </w:pPr>
+      <w:r>
+        <w:rPr>
+          <w:rFonts w:ascii="Times New Roman" w:eastAsia="Times New Roman" w:hAnsi="Times New Roman" w:cs="Times New Roman"/>
+          <w:sz w:val="20"/>
+          <w:szCs w:val="20"/>
+        </w:rPr>
+        <w:t>Camera and GPS working.</w:t>
+      </w:r>
+    </w:p>
+    <w:p>
+      <w:pPr>
+        <w:numPr>
+          <w:ilvl w:val="0"/>
+          <w:numId w:val="12"/>
+        </w:numPr>
+        <w:spacing w:after="40" w:line="240" w:lineRule="auto"/>
+        <w:rPr>
+          <w:rFonts w:ascii="Times New Roman" w:eastAsia="Times New Roman" w:hAnsi="Times New Roman" w:cs="Times New Roman"/>
+          <w:sz w:val="20"/>
+          <w:szCs w:val="20"/>
+        </w:rPr>
+      </w:pPr>
+      <w:r>
+        <w:rPr>
+          <w:rFonts w:ascii="Times New Roman" w:eastAsia="Times New Roman" w:hAnsi="Times New Roman" w:cs="Times New Roman"/>
+          <w:sz w:val="20"/>
+          <w:szCs w:val="20"/>
+        </w:rPr>
+        <w:t>Forms save and display data correctly.</w:t>
+      </w:r>
+    </w:p>
+    <w:p>
+      <w:pPr>
+        <w:numPr>
+          <w:ilvl w:val="0"/>
+          <w:numId w:val="12"/>
+        </w:numPr>
+        <w:spacing w:after="40" w:line="240" w:lineRule="auto"/>
+        <w:rPr>
+          <w:rFonts w:ascii="Times New Roman" w:eastAsia="Times New Roman" w:hAnsi="Times New Roman" w:cs="Times New Roman"/>
+          <w:sz w:val="20"/>
+          <w:szCs w:val="20"/>
+        </w:rPr>
+      </w:pPr>
+      <w:r>
+        <w:rPr>
+          <w:rFonts w:ascii="Times New Roman" w:eastAsia="Times New Roman" w:hAnsi="Times New Roman" w:cs="Times New Roman"/>
+          <w:sz w:val="20"/>
+          <w:szCs w:val="20"/>
+        </w:rPr>
+        <w:t>Input validation and error messages working.</w:t>
+      </w:r>
+    </w:p>
+    <w:p>
+      <w:pPr>
+        <w:spacing w:after="100" w:line="240" w:lineRule="auto"/>
+        <w:rPr>
+          <w:rFonts w:ascii="Times New Roman" w:eastAsia="Times New Roman" w:hAnsi="Times New Roman" w:cs="Times New Roman"/>
+          <w:sz w:val="20"/>
+          <w:szCs w:val="20"/>
+        </w:rPr>
+      </w:pPr>
+    </w:p>
+    <w:tbl>
+      <w:tblPr>
+        <w:tblW w:w="9000" w:type="dxa"/>
+        <w:tblBorders>
+          <w:top w:val="dashed" w:sz="4" w:space="0" w:color="999999"/>
+          <w:left w:val="dashed" w:sz="4" w:space="0" w:color="999999"/>
+          <w:bottom w:val="dashed" w:sz="4" w:space="0" w:color="999999"/>
+          <w:right w:val="dashed" w:sz="4" w:space="0" w:color="999999"/>
+          <w:insideH w:val="single" w:sz="4" w:space="0" w:color="auto"/>
+          <w:insideV w:val="single" w:sz="4" w:space="0" w:color="auto"/>
+        </w:tblBorders>
+        <w:tblCellMar>
+          <w:left w:w="10" w:type="dxa"/>
+          <w:right w:w="10" w:type="dxa"/>
+        </w:tblCellMar>
+        <w:tblLook w:val="04A0" w:firstRow="1" w:lastRow="0" w:firstColumn="1" w:lastColumn="0" w:noHBand="0" w:noVBand="1"/>
+      </w:tblPr>
+      <w:tblGrid>
+        <w:gridCol w:w="9000"/>
+      </w:tblGrid>
+      <w:tr>
+        <w:tc>
+          <w:tcPr>
+            <w:tcW w:w="9000" w:type="dxa"/>
+            <w:shd w:val="clear" w:color="auto" w:fill="FAFAFA"/>
+            <w:tcMar>
+              <w:top w:w="140" w:type="dxa"/>
+              <w:left w:w="200" w:type="dxa"/>
+              <w:bottom w:w="140" w:type="dxa"/>
+              <w:right w:w="200" w:type="dxa"/>
+            </w:tcMar>
+            <w:vAlign w:val="center"/>
+          </w:tcPr>
+          <w:p>
+            <w:pPr>
+              <w:spacing w:after="20" w:line="240" w:lineRule="auto"/>
+              <w:jc w:val="center"/>
+              <w:rPr>
+                <w:rFonts w:ascii="Times New Roman" w:eastAsia="Times New Roman" w:hAnsi="Times New Roman" w:cs="Times New Roman"/>
+                <w:sz w:val="20"/>
+                <w:szCs w:val="20"/>
+              </w:rPr>
+            </w:pPr>
+            <w:r>
+              <w:rPr>
+                <w:rFonts w:ascii="Times New Roman" w:eastAsia="Times New Roman" w:hAnsi="Times New Roman" w:cs="Times New Roman"/>
+                <w:b/>
+                <w:bCs/>
+                <w:noProof/>
+                <w:color w:val="888888"/>
+                <w:sz w:val="19"/>
+                <w:szCs w:val="19"/>
+              </w:rPr>
+              <w:drawing>
+                <wp:inline distT="0" distB="0" distL="0" distR="0" wp14:anchorId="3EBB1BF1" wp14:editId="2B2BC62B">
+                  <wp:extent cx="1309035" cy="2763520"/>
+                  <wp:effectExtent l="0" t="0" r="5715" b="0"/>
+                  <wp:docPr id="898240244" name="Picture 1"/>
+                  <wp:cNvGraphicFramePr>
+                    <a:graphicFrameLocks xmlns:a="http://schemas.openxmlformats.org/drawingml/2006/main" noChangeAspect="1"/>
+                  </wp:cNvGraphicFramePr>
+                  <a:graphic xmlns:a="http://schemas.openxmlformats.org/drawingml/2006/main">
+                    <a:graphicData uri="http://schemas.openxmlformats.org/drawingml/2006/picture">
+                      <pic:pic xmlns:pic="http://schemas.openxmlformats.org/drawingml/2006/picture">
+                        <pic:nvPicPr>
+                          <pic:cNvPr id="0" name="Picture 2"/>
+                          <pic:cNvPicPr>
+                            <a:picLocks noChangeAspect="1" noChangeArrowheads="1"/>
+                          </pic:cNvPicPr>
+                        </pic:nvPicPr>
+                        <pic:blipFill>
+                          <a:blip r:embed="rId61" cstate="print">
+                            <a:extLst>
+                              <a:ext uri="{28A0092B-C50C-407E-A947-70E740481C1C}">
+                                <a14:useLocalDpi xmlns:a14="http://schemas.microsoft.com/office/drawing/2010/main" val="0"/>
+                              </a:ext>
+                            </a:extLst>
+                          </a:blip>
+                          <a:srcRect/>
+                          <a:stretch>
+                            <a:fillRect/>
+                          </a:stretch>
+                        </pic:blipFill>
+                        <pic:spPr bwMode="auto">
+                          <a:xfrm>
+                            <a:off x="0" y="0"/>
+                            <a:ext cx="1329450" cy="2806618"/>
+                          </a:xfrm>
+                          <a:prstGeom prst="rect">
+                            <a:avLst/>
+                          </a:prstGeom>
+                          <a:noFill/>
+                        </pic:spPr>
+                      </pic:pic>
+                    </a:graphicData>
+                  </a:graphic>
+                </wp:inline>
+              </w:drawing>
+            </w:r>
+          </w:p>
+          <w:p>
+            <w:pPr>
+              <w:spacing w:after="0" w:line="240" w:lineRule="auto"/>
+              <w:jc w:val="center"/>
+              <w:rPr>
+                <w:rFonts w:ascii="Times New Roman" w:eastAsia="Times New Roman" w:hAnsi="Times New Roman" w:cs="Times New Roman"/>
+                <w:sz w:val="20"/>
+                <w:szCs w:val="20"/>
+              </w:rPr>
+            </w:pPr>
+            <w:r>
+              <w:rPr>
+                <w:rFonts w:ascii="Times New Roman" w:eastAsia="Times New Roman" w:hAnsi="Times New Roman" w:cs="Times New Roman"/>
+                <w:i/>
+                <w:iCs/>
+                <w:color w:val="666666"/>
+                <w:sz w:val="18"/>
+                <w:szCs w:val="18"/>
+              </w:rPr>
+              <w:t>Catalog screen — all navigation icons visible</w:t>
+            </w:r>
+          </w:p>
+        </w:tc>
+      </w:tr>
+    </w:tbl>
+    <w:p>
+      <w:pPr>
+        <w:spacing w:after="250" w:line="240" w:lineRule="auto"/>
+        <w:rPr>
+          <w:rFonts w:ascii="Times New Roman" w:eastAsia="Times New Roman" w:hAnsi="Times New Roman" w:cs="Times New Roman"/>
+          <w:sz w:val="20"/>
+          <w:szCs w:val="20"/>
+        </w:rPr>
+      </w:pPr>
+    </w:p>
+    <w:p>
+      <w:pPr>
+        <w:spacing w:before="260" w:after="130" w:line="240" w:lineRule="auto"/>
+        <w:outlineLvl w:val="0"/>
+        <w:rPr>
+          <w:rFonts w:ascii="Times New Roman" w:eastAsia="Times New Roman" w:hAnsi="Times New Roman" w:cs="Times New Roman"/>
+          <w:color w:val="2E74B5"/>
+          <w:sz w:val="32"/>
+          <w:szCs w:val="32"/>
+        </w:rPr>
+      </w:pPr>
+      <w:r>
+        <w:rPr>
+          <w:rFonts w:ascii="Times New Roman" w:eastAsia="Times New Roman" w:hAnsi="Times New Roman" w:cs="Times New Roman"/>
+          <w:b/>
+          <w:bCs/>
+          <w:color w:val="0F172A"/>
+          <w:sz w:val="32"/>
+          <w:szCs w:val="32"/>
+        </w:rPr>
+        <w:t>Bugs Found &amp; Fixed</w:t>
+      </w:r>
+    </w:p>
+    <w:p>
+      <w:pPr>
+        <w:spacing w:before="200" w:after="80" w:line="240" w:lineRule="auto"/>
+        <w:outlineLvl w:val="1"/>
+        <w:rPr>
+          <w:rFonts w:ascii="Times New Roman" w:eastAsia="Times New Roman" w:hAnsi="Times New Roman" w:cs="Times New Roman"/>
+          <w:color w:val="2E74B5"/>
+          <w:sz w:val="26"/>
+          <w:szCs w:val="26"/>
+        </w:rPr>
+      </w:pPr>
+      <w:r>
+        <w:rPr>
+          <w:rFonts w:ascii="Times New Roman" w:eastAsia="Times New Roman" w:hAnsi="Times New Roman" w:cs="Times New Roman"/>
+          <w:b/>
+          <w:bCs/>
+          <w:color w:val="22C55E"/>
+          <w:sz w:val="26"/>
+          <w:szCs w:val="26"/>
+        </w:rPr>
+        <w:t>Bug 1: M-Pesa deducted real money during testing</w:t>
+      </w:r>
+    </w:p>
+    <w:p>
+      <w:pPr>
+        <w:spacing w:after="60" w:line="240" w:lineRule="auto"/>
+        <w:rPr>
+          <w:rFonts w:ascii="Times New Roman" w:eastAsia="Times New Roman" w:hAnsi="Times New Roman" w:cs="Times New Roman"/>
+          <w:sz w:val="20"/>
+          <w:szCs w:val="20"/>
+        </w:rPr>
+      </w:pPr>
+      <w:r>
+        <w:rPr>
+          <w:rFonts w:ascii="Times New Roman" w:eastAsia="Times New Roman" w:hAnsi="Times New Roman" w:cs="Times New Roman"/>
+          <w:b/>
+          <w:bCs/>
+          <w:sz w:val="20"/>
+          <w:szCs w:val="20"/>
+        </w:rPr>
+        <w:t xml:space="preserve">Cause: </w:t>
+      </w:r>
+      <w:proofErr w:type="spellStart"/>
+      <w:r>
+        <w:rPr>
+          <w:rFonts w:ascii="Times New Roman" w:eastAsia="Times New Roman" w:hAnsi="Times New Roman" w:cs="Times New Roman"/>
+          <w:sz w:val="20"/>
+          <w:szCs w:val="20"/>
+        </w:rPr>
+        <w:t>IntaSend</w:t>
+      </w:r>
+      <w:proofErr w:type="spellEnd"/>
+      <w:r>
+        <w:rPr>
+          <w:rFonts w:ascii="Times New Roman" w:eastAsia="Times New Roman" w:hAnsi="Times New Roman" w:cs="Times New Roman"/>
+          <w:sz w:val="20"/>
+          <w:szCs w:val="20"/>
+        </w:rPr>
+        <w:t xml:space="preserve"> sandbox routes STK push through real Safaricom rails — not a code defect, but unsafe for repeated testing.</w:t>
+      </w:r>
+    </w:p>
+    <w:p>
+      <w:pPr>
+        <w:spacing w:after="60" w:line="240" w:lineRule="auto"/>
+        <w:rPr>
+          <w:rFonts w:ascii="Times New Roman" w:eastAsia="Times New Roman" w:hAnsi="Times New Roman" w:cs="Times New Roman"/>
+          <w:sz w:val="20"/>
+          <w:szCs w:val="20"/>
+        </w:rPr>
+      </w:pPr>
+      <w:r>
+        <w:rPr>
+          <w:rFonts w:ascii="Times New Roman" w:eastAsia="Times New Roman" w:hAnsi="Times New Roman" w:cs="Times New Roman"/>
+          <w:b/>
+          <w:bCs/>
+          <w:sz w:val="20"/>
+          <w:szCs w:val="20"/>
+        </w:rPr>
+        <w:t xml:space="preserve">Fix: </w:t>
+      </w:r>
+      <w:r>
+        <w:rPr>
+          <w:rFonts w:ascii="Times New Roman" w:eastAsia="Times New Roman" w:hAnsi="Times New Roman" w:cs="Times New Roman"/>
+          <w:sz w:val="20"/>
+          <w:szCs w:val="20"/>
+        </w:rPr>
+        <w:t>Added a Simulate Payment toggle (default ON) — sales complete with zero network/financial risk.</w:t>
+      </w:r>
+    </w:p>
+    <w:p>
+      <w:pPr>
+        <w:spacing w:after="80" w:line="240" w:lineRule="auto"/>
+        <w:rPr>
+          <w:rFonts w:ascii="Times New Roman" w:eastAsia="Times New Roman" w:hAnsi="Times New Roman" w:cs="Times New Roman"/>
+          <w:sz w:val="20"/>
+          <w:szCs w:val="20"/>
+        </w:rPr>
+      </w:pPr>
+    </w:p>
+    <w:tbl>
+      <w:tblPr>
+        <w:tblW w:w="9000" w:type="dxa"/>
+        <w:tblBorders>
+          <w:top w:val="dashed" w:sz="4" w:space="0" w:color="999999"/>
+          <w:left w:val="dashed" w:sz="4" w:space="0" w:color="999999"/>
+          <w:bottom w:val="dashed" w:sz="4" w:space="0" w:color="999999"/>
+          <w:right w:val="dashed" w:sz="4" w:space="0" w:color="999999"/>
+          <w:insideH w:val="single" w:sz="4" w:space="0" w:color="auto"/>
+          <w:insideV w:val="single" w:sz="4" w:space="0" w:color="auto"/>
+        </w:tblBorders>
+        <w:tblCellMar>
+          <w:left w:w="10" w:type="dxa"/>
+          <w:right w:w="10" w:type="dxa"/>
+        </w:tblCellMar>
+        <w:tblLook w:val="04A0" w:firstRow="1" w:lastRow="0" w:firstColumn="1" w:lastColumn="0" w:noHBand="0" w:noVBand="1"/>
+      </w:tblPr>
+      <w:tblGrid>
+        <w:gridCol w:w="9000"/>
+      </w:tblGrid>
+      <w:tr>
+        <w:trPr>
+          <w:trHeight w:val="3990"/>
+        </w:trPr>
+        <w:tc>
+          <w:tcPr>
+            <w:tcW w:w="9000" w:type="dxa"/>
+            <w:shd w:val="clear" w:color="auto" w:fill="FAFAFA"/>
+            <w:tcMar>
+              <w:top w:w="140" w:type="dxa"/>
+              <w:left w:w="200" w:type="dxa"/>
+              <w:bottom w:w="140" w:type="dxa"/>
+              <w:right w:w="200" w:type="dxa"/>
+            </w:tcMar>
+            <w:vAlign w:val="center"/>
+          </w:tcPr>
+          <w:p>
+            <w:pPr>
+              <w:spacing w:after="20" w:line="240" w:lineRule="auto"/>
+              <w:jc w:val="center"/>
+              <w:rPr>
+                <w:rFonts w:ascii="Times New Roman" w:eastAsia="Times New Roman" w:hAnsi="Times New Roman" w:cs="Times New Roman"/>
+                <w:sz w:val="20"/>
+                <w:szCs w:val="20"/>
+              </w:rPr>
+            </w:pPr>
+          </w:p>
+          <w:p>
+            <w:pPr>
+              <w:spacing w:after="0" w:line="240" w:lineRule="auto"/>
+              <w:jc w:val="center"/>
+              <w:rPr>
+                <w:rFonts w:ascii="Times New Roman" w:eastAsia="Times New Roman" w:hAnsi="Times New Roman" w:cs="Times New Roman"/>
+                <w:i/>
+                <w:iCs/>
+                <w:color w:val="666666"/>
+                <w:sz w:val="18"/>
+                <w:szCs w:val="18"/>
+              </w:rPr>
+            </w:pPr>
+            <w:r>
+              <w:rPr>
+                <w:rFonts w:ascii="Times New Roman" w:eastAsia="Times New Roman" w:hAnsi="Times New Roman" w:cs="Times New Roman"/>
+                <w:i/>
+                <w:iCs/>
+                <w:noProof/>
+                <w:color w:val="666666"/>
+                <w:sz w:val="18"/>
+                <w:szCs w:val="18"/>
+              </w:rPr>
+              <w:drawing>
+                <wp:inline distT="0" distB="0" distL="0" distR="0" wp14:anchorId="495E1C63" wp14:editId="3A73E7B8">
+                  <wp:extent cx="1016066" cy="2145030"/>
+                  <wp:effectExtent l="0" t="0" r="0" b="7620"/>
+                  <wp:docPr id="832990534" name="Picture 2"/>
+                  <wp:cNvGraphicFramePr>
+                    <a:graphicFrameLocks xmlns:a="http://schemas.openxmlformats.org/drawingml/2006/main" noChangeAspect="1"/>
+                  </wp:cNvGraphicFramePr>
+                  <a:graphic xmlns:a="http://schemas.openxmlformats.org/drawingml/2006/main">
+                    <a:graphicData uri="http://schemas.openxmlformats.org/drawingml/2006/picture">
+                      <pic:pic xmlns:pic="http://schemas.openxmlformats.org/drawingml/2006/picture">
+                        <pic:nvPicPr>
+                          <pic:cNvPr id="0" name="Picture 3"/>
+                          <pic:cNvPicPr>
+                            <a:picLocks noChangeAspect="1" noChangeArrowheads="1"/>
+                          </pic:cNvPicPr>
+                        </pic:nvPicPr>
+                        <pic:blipFill>
+                          <a:blip r:embed="rId62" cstate="print">
+                            <a:extLst>
+                              <a:ext uri="{28A0092B-C50C-407E-A947-70E740481C1C}">
+                                <a14:useLocalDpi xmlns:a14="http://schemas.microsoft.com/office/drawing/2010/main" val="0"/>
+                              </a:ext>
+                            </a:extLst>
+                          </a:blip>
+                          <a:srcRect/>
+                          <a:stretch>
+                            <a:fillRect/>
+                          </a:stretch>
+                        </pic:blipFill>
+                        <pic:spPr bwMode="auto">
+                          <a:xfrm>
+                            <a:off x="0" y="0"/>
+                            <a:ext cx="1042599" cy="2201044"/>
+                          </a:xfrm>
+                          <a:prstGeom prst="rect">
+                            <a:avLst/>
+                          </a:prstGeom>
+                          <a:noFill/>
+                        </pic:spPr>
+                      </pic:pic>
+                    </a:graphicData>
+                  </a:graphic>
+                </wp:inline>
+              </w:drawing>
+            </w:r>
+          </w:p>
+          <w:p>
+            <w:pPr>
+              <w:spacing w:after="0" w:line="240" w:lineRule="auto"/>
+              <w:jc w:val="center"/>
+              <w:rPr>
+                <w:rFonts w:ascii="Times New Roman" w:eastAsia="Times New Roman" w:hAnsi="Times New Roman" w:cs="Times New Roman"/>
+                <w:i/>
+                <w:iCs/>
+                <w:color w:val="666666"/>
+                <w:sz w:val="18"/>
+                <w:szCs w:val="18"/>
+              </w:rPr>
+            </w:pPr>
+          </w:p>
+          <w:p>
+            <w:pPr>
+              <w:spacing w:after="0" w:line="240" w:lineRule="auto"/>
+              <w:jc w:val="center"/>
+              <w:rPr>
+                <w:rFonts w:ascii="Times New Roman" w:eastAsia="Times New Roman" w:hAnsi="Times New Roman" w:cs="Times New Roman"/>
+                <w:i/>
+                <w:iCs/>
+                <w:color w:val="666666"/>
+                <w:sz w:val="18"/>
+                <w:szCs w:val="18"/>
+              </w:rPr>
+            </w:pPr>
+          </w:p>
+          <w:p>
+            <w:pPr>
+              <w:spacing w:after="0" w:line="240" w:lineRule="auto"/>
+              <w:jc w:val="center"/>
+              <w:rPr>
+                <w:rFonts w:ascii="Times New Roman" w:eastAsia="Times New Roman" w:hAnsi="Times New Roman" w:cs="Times New Roman"/>
+                <w:sz w:val="20"/>
+                <w:szCs w:val="20"/>
+              </w:rPr>
+            </w:pPr>
+            <w:r>
+              <w:rPr>
+                <w:rFonts w:ascii="Times New Roman" w:eastAsia="Times New Roman" w:hAnsi="Times New Roman" w:cs="Times New Roman"/>
+                <w:i/>
+                <w:iCs/>
+                <w:color w:val="666666"/>
+                <w:sz w:val="18"/>
+                <w:szCs w:val="18"/>
+              </w:rPr>
+              <w:t>Sell dialog — Simulate Payment toggle ON</w:t>
+            </w:r>
+          </w:p>
+        </w:tc>
+      </w:tr>
+    </w:tbl>
+    <w:p>
+      <w:pPr>
+        <w:spacing w:line="240" w:lineRule="auto"/>
+        <w:rPr>
+          <w:rFonts w:ascii="Times New Roman" w:eastAsia="Times New Roman" w:hAnsi="Times New Roman" w:cs="Times New Roman"/>
+          <w:sz w:val="20"/>
+          <w:szCs w:val="20"/>
+        </w:rPr>
+      </w:pPr>
+    </w:p>
+    <w:p>
+      <w:pPr>
+        <w:spacing w:before="200" w:after="80" w:line="240" w:lineRule="auto"/>
+        <w:outlineLvl w:val="1"/>
+        <w:rPr>
+          <w:rFonts w:ascii="Times New Roman" w:eastAsia="Times New Roman" w:hAnsi="Times New Roman" w:cs="Times New Roman"/>
+          <w:color w:val="2E74B5"/>
+          <w:sz w:val="26"/>
+          <w:szCs w:val="26"/>
+        </w:rPr>
+      </w:pPr>
+      <w:r>
+        <w:rPr>
+          <w:rFonts w:ascii="Times New Roman" w:eastAsia="Times New Roman" w:hAnsi="Times New Roman" w:cs="Times New Roman"/>
+          <w:b/>
+          <w:bCs/>
+          <w:color w:val="22C55E"/>
+          <w:sz w:val="26"/>
+          <w:szCs w:val="26"/>
+        </w:rPr>
+        <w:t>Bug 2: Sales not recording, profit not showing</w:t>
+      </w:r>
+    </w:p>
+    <w:p>
+      <w:pPr>
+        <w:spacing w:after="60" w:line="240" w:lineRule="auto"/>
+        <w:rPr>
+          <w:rFonts w:ascii="Times New Roman" w:eastAsia="Times New Roman" w:hAnsi="Times New Roman" w:cs="Times New Roman"/>
+          <w:sz w:val="20"/>
+          <w:szCs w:val="20"/>
+        </w:rPr>
+      </w:pPr>
+      <w:r>
+        <w:rPr>
+          <w:rFonts w:ascii="Times New Roman" w:eastAsia="Times New Roman" w:hAnsi="Times New Roman" w:cs="Times New Roman"/>
+          <w:b/>
+          <w:bCs/>
+          <w:sz w:val="20"/>
+          <w:szCs w:val="20"/>
+        </w:rPr>
+        <w:t xml:space="preserve">Cause: </w:t>
+      </w:r>
+      <w:r>
+        <w:rPr>
+          <w:rFonts w:ascii="Times New Roman" w:eastAsia="Times New Roman" w:hAnsi="Times New Roman" w:cs="Times New Roman"/>
+          <w:sz w:val="20"/>
+          <w:szCs w:val="20"/>
+        </w:rPr>
+        <w:t>Sale was only saved after a full payment network round-trip; any failure meant no record.</w:t>
+      </w:r>
+    </w:p>
+    <w:p>
+      <w:pPr>
+        <w:spacing w:after="60" w:line="240" w:lineRule="auto"/>
+        <w:rPr>
+          <w:rFonts w:ascii="Times New Roman" w:eastAsia="Times New Roman" w:hAnsi="Times New Roman" w:cs="Times New Roman"/>
+          <w:sz w:val="20"/>
+          <w:szCs w:val="20"/>
+        </w:rPr>
+      </w:pPr>
+      <w:r>
+        <w:rPr>
+          <w:rFonts w:ascii="Times New Roman" w:eastAsia="Times New Roman" w:hAnsi="Times New Roman" w:cs="Times New Roman"/>
+          <w:b/>
+          <w:bCs/>
+          <w:sz w:val="20"/>
+          <w:szCs w:val="20"/>
+        </w:rPr>
+        <w:t xml:space="preserve">Fix: </w:t>
+      </w:r>
+      <w:r>
+        <w:rPr>
+          <w:rFonts w:ascii="Times New Roman" w:eastAsia="Times New Roman" w:hAnsi="Times New Roman" w:cs="Times New Roman"/>
+          <w:sz w:val="20"/>
+          <w:szCs w:val="20"/>
+        </w:rPr>
+        <w:t>Sale-saving logic now runs the same way for every completed payment (simulated or real).</w:t>
+      </w:r>
+    </w:p>
+    <w:p>
+      <w:pPr>
+        <w:spacing w:after="80" w:line="240" w:lineRule="auto"/>
+        <w:rPr>
+          <w:rFonts w:ascii="Times New Roman" w:eastAsia="Times New Roman" w:hAnsi="Times New Roman" w:cs="Times New Roman"/>
+          <w:sz w:val="20"/>
+          <w:szCs w:val="20"/>
+        </w:rPr>
+      </w:pPr>
+    </w:p>
+    <w:tbl>
+      <w:tblPr>
+        <w:tblW w:w="9429" w:type="dxa"/>
+        <w:tblBorders>
+          <w:top w:val="dashed" w:sz="4" w:space="0" w:color="999999"/>
+          <w:left w:val="dashed" w:sz="4" w:space="0" w:color="999999"/>
+          <w:bottom w:val="dashed" w:sz="4" w:space="0" w:color="999999"/>
+          <w:right w:val="dashed" w:sz="4" w:space="0" w:color="999999"/>
+          <w:insideH w:val="single" w:sz="4" w:space="0" w:color="auto"/>
+          <w:insideV w:val="single" w:sz="4" w:space="0" w:color="auto"/>
+        </w:tblBorders>
+        <w:tblCellMar>
+          <w:left w:w="10" w:type="dxa"/>
+          <w:right w:w="10" w:type="dxa"/>
+        </w:tblCellMar>
+        <w:tblLook w:val="04A0" w:firstRow="1" w:lastRow="0" w:firstColumn="1" w:lastColumn="0" w:noHBand="0" w:noVBand="1"/>
+      </w:tblPr>
+      <w:tblGrid>
+        <w:gridCol w:w="9429"/>
+      </w:tblGrid>
+      <w:tr>
+        <w:trPr>
+          <w:trHeight w:val="1188"/>
+        </w:trPr>
+        <w:tc>
+          <w:tcPr>
+            <w:tcW w:w="9429" w:type="dxa"/>
+            <w:shd w:val="clear" w:color="auto" w:fill="FAFAFA"/>
+            <w:tcMar>
+              <w:top w:w="140" w:type="dxa"/>
+              <w:left w:w="200" w:type="dxa"/>
+              <w:bottom w:w="140" w:type="dxa"/>
+              <w:right w:w="200" w:type="dxa"/>
+            </w:tcMar>
+            <w:vAlign w:val="center"/>
+          </w:tcPr>
+          <w:p>
+            <w:pPr>
+              <w:spacing w:after="20" w:line="240" w:lineRule="auto"/>
+              <w:rPr>
+                <w:rFonts w:ascii="Times New Roman" w:eastAsia="Times New Roman" w:hAnsi="Times New Roman" w:cs="Times New Roman"/>
+                <w:sz w:val="20"/>
+                <w:szCs w:val="20"/>
+              </w:rPr>
+            </w:pPr>
+            <w:r>
+              <w:rPr>
+                <w:rFonts w:ascii="Times New Roman" w:eastAsia="Times New Roman" w:hAnsi="Times New Roman" w:cs="Times New Roman"/>
+                <w:noProof/>
+                <w:sz w:val="20"/>
+                <w:szCs w:val="20"/>
+              </w:rPr>
+              <w:drawing>
+                <wp:inline distT="0" distB="0" distL="0" distR="0" wp14:anchorId="0B8D4AF3" wp14:editId="4680FC3B">
+                  <wp:extent cx="1418824" cy="2995295"/>
+                  <wp:effectExtent l="0" t="0" r="0" b="0"/>
+                  <wp:docPr id="1461172639" name="Picture 3"/>
+                  <wp:cNvGraphicFramePr>
+                    <a:graphicFrameLocks xmlns:a="http://schemas.openxmlformats.org/drawingml/2006/main" noChangeAspect="1"/>
+                  </wp:cNvGraphicFramePr>
+                  <a:graphic xmlns:a="http://schemas.openxmlformats.org/drawingml/2006/main">
+                    <a:graphicData uri="http://schemas.openxmlformats.org/drawingml/2006/picture">
+                      <pic:pic xmlns:pic="http://schemas.openxmlformats.org/drawingml/2006/picture">
+                        <pic:nvPicPr>
+                          <pic:cNvPr id="0" name="Picture 4"/>
+                          <pic:cNvPicPr>
+                            <a:picLocks noChangeAspect="1" noChangeArrowheads="1"/>
+                          </pic:cNvPicPr>
+                        </pic:nvPicPr>
+                        <pic:blipFill>
+                          <a:blip r:embed="rId63" cstate="print">
+                            <a:extLst>
+                              <a:ext uri="{28A0092B-C50C-407E-A947-70E740481C1C}">
+                                <a14:useLocalDpi xmlns:a14="http://schemas.microsoft.com/office/drawing/2010/main" val="0"/>
+                              </a:ext>
+                            </a:extLst>
+                          </a:blip>
+                          <a:srcRect/>
+                          <a:stretch>
+                            <a:fillRect/>
+                          </a:stretch>
+                        </pic:blipFill>
+                        <pic:spPr bwMode="auto">
+                          <a:xfrm>
+                            <a:off x="0" y="0"/>
+                            <a:ext cx="1438009" cy="3035797"/>
+                          </a:xfrm>
+                          <a:prstGeom prst="rect">
+                            <a:avLst/>
+                          </a:prstGeom>
+                          <a:noFill/>
+                        </pic:spPr>
+                      </pic:pic>
+                    </a:graphicData>
+                  </a:graphic>
+                </wp:inline>
+              </w:drawing>
+            </w:r>
+          </w:p>
+          <w:p>
+            <w:pPr>
+              <w:spacing w:after="0" w:line="240" w:lineRule="auto"/>
+              <w:jc w:val="center"/>
+              <w:rPr>
+                <w:rFonts w:ascii="Times New Roman" w:eastAsia="Times New Roman" w:hAnsi="Times New Roman" w:cs="Times New Roman"/>
+                <w:sz w:val="20"/>
+                <w:szCs w:val="20"/>
+              </w:rPr>
+            </w:pPr>
+            <w:r>
+              <w:rPr>
+                <w:rFonts w:ascii="Times New Roman" w:eastAsia="Times New Roman" w:hAnsi="Times New Roman" w:cs="Times New Roman"/>
+                <w:i/>
+                <w:iCs/>
+                <w:color w:val="666666"/>
+                <w:sz w:val="18"/>
+                <w:szCs w:val="18"/>
+              </w:rPr>
+              <w:t>Analytics Dashboard — profit updated after a sale</w:t>
+            </w:r>
+          </w:p>
+        </w:tc>
+      </w:tr>
+    </w:tbl>
+    <w:p>
+      <w:pPr>
+        <w:spacing w:line="240" w:lineRule="auto"/>
+        <w:rPr>
+          <w:rFonts w:ascii="Times New Roman" w:eastAsia="Times New Roman" w:hAnsi="Times New Roman" w:cs="Times New Roman"/>
+          <w:sz w:val="20"/>
+          <w:szCs w:val="20"/>
+        </w:rPr>
+      </w:pPr>
+    </w:p>
+    <w:p>
+      <w:pPr>
+        <w:spacing w:before="200" w:after="80" w:line="240" w:lineRule="auto"/>
+        <w:outlineLvl w:val="1"/>
+        <w:rPr>
+          <w:rFonts w:ascii="Times New Roman" w:eastAsia="Times New Roman" w:hAnsi="Times New Roman" w:cs="Times New Roman"/>
+          <w:color w:val="2E74B5"/>
+          <w:sz w:val="26"/>
+          <w:szCs w:val="26"/>
+        </w:rPr>
+      </w:pPr>
+      <w:r>
+        <w:rPr>
+          <w:rFonts w:ascii="Times New Roman" w:eastAsia="Times New Roman" w:hAnsi="Times New Roman" w:cs="Times New Roman"/>
+          <w:b/>
+          <w:bCs/>
+          <w:color w:val="22C55E"/>
+          <w:sz w:val="26"/>
+          <w:szCs w:val="26"/>
+        </w:rPr>
+        <w:t>Bug 3: Dark/Light toggle had no visual effect</w:t>
+      </w:r>
+    </w:p>
+    <w:p>
+      <w:pPr>
+        <w:spacing w:after="60" w:line="240" w:lineRule="auto"/>
+        <w:rPr>
+          <w:rFonts w:ascii="Times New Roman" w:eastAsia="Times New Roman" w:hAnsi="Times New Roman" w:cs="Times New Roman"/>
+          <w:sz w:val="20"/>
+          <w:szCs w:val="20"/>
+        </w:rPr>
+      </w:pPr>
+      <w:r>
+        <w:rPr>
+          <w:rFonts w:ascii="Times New Roman" w:eastAsia="Times New Roman" w:hAnsi="Times New Roman" w:cs="Times New Roman"/>
+          <w:b/>
+          <w:bCs/>
+          <w:sz w:val="20"/>
+          <w:szCs w:val="20"/>
+        </w:rPr>
+        <w:lastRenderedPageBreak/>
+        <w:t xml:space="preserve">Cause: </w:t>
+      </w:r>
+      <w:r>
+        <w:rPr>
+          <w:rFonts w:ascii="Times New Roman" w:eastAsia="Times New Roman" w:hAnsi="Times New Roman" w:cs="Times New Roman"/>
+          <w:sz w:val="20"/>
+          <w:szCs w:val="20"/>
+        </w:rPr>
+        <w:t xml:space="preserve">Two </w:t>
+      </w:r>
+      <w:proofErr w:type="spellStart"/>
+      <w:proofErr w:type="gramStart"/>
+      <w:r>
+        <w:rPr>
+          <w:rFonts w:ascii="Times New Roman" w:eastAsia="Times New Roman" w:hAnsi="Times New Roman" w:cs="Times New Roman"/>
+          <w:sz w:val="20"/>
+          <w:szCs w:val="20"/>
+        </w:rPr>
+        <w:t>main</w:t>
+      </w:r>
+      <w:proofErr w:type="gramEnd"/>
+      <w:r>
+        <w:rPr>
+          <w:rFonts w:ascii="Times New Roman" w:eastAsia="Times New Roman" w:hAnsi="Times New Roman" w:cs="Times New Roman"/>
+          <w:sz w:val="20"/>
+          <w:szCs w:val="20"/>
+        </w:rPr>
+        <w:t>.dart</w:t>
+      </w:r>
+      <w:proofErr w:type="spellEnd"/>
+      <w:r>
+        <w:rPr>
+          <w:rFonts w:ascii="Times New Roman" w:eastAsia="Times New Roman" w:hAnsi="Times New Roman" w:cs="Times New Roman"/>
+          <w:sz w:val="20"/>
+          <w:szCs w:val="20"/>
+        </w:rPr>
+        <w:t xml:space="preserve"> files existed; theme code was mistakenly edited in the unused duplicate.</w:t>
+      </w:r>
+    </w:p>
+    <w:p>
+      <w:pPr>
+        <w:spacing w:after="60" w:line="240" w:lineRule="auto"/>
+        <w:rPr>
+          <w:rFonts w:ascii="Times New Roman" w:eastAsia="Times New Roman" w:hAnsi="Times New Roman" w:cs="Times New Roman"/>
+          <w:sz w:val="20"/>
+          <w:szCs w:val="20"/>
+        </w:rPr>
+      </w:pPr>
+      <w:r>
+        <w:rPr>
+          <w:rFonts w:ascii="Times New Roman" w:eastAsia="Times New Roman" w:hAnsi="Times New Roman" w:cs="Times New Roman"/>
+          <w:b/>
+          <w:bCs/>
+          <w:sz w:val="20"/>
+          <w:szCs w:val="20"/>
+        </w:rPr>
+        <w:t xml:space="preserve">Fix: </w:t>
+      </w:r>
+      <w:r>
+        <w:rPr>
+          <w:rFonts w:ascii="Times New Roman" w:eastAsia="Times New Roman" w:hAnsi="Times New Roman" w:cs="Times New Roman"/>
+          <w:sz w:val="20"/>
+          <w:szCs w:val="20"/>
+        </w:rPr>
+        <w:t>Found and fixed the real entry point, deleted the duplicate file.</w:t>
+      </w:r>
+    </w:p>
+    <w:p>
+      <w:pPr>
+        <w:spacing w:after="80" w:line="240" w:lineRule="auto"/>
+        <w:rPr>
+          <w:rFonts w:ascii="Times New Roman" w:eastAsia="Times New Roman" w:hAnsi="Times New Roman" w:cs="Times New Roman"/>
+          <w:sz w:val="20"/>
+          <w:szCs w:val="20"/>
+        </w:rPr>
+      </w:pPr>
+    </w:p>
+    <w:p>
+      <w:pPr>
+        <w:spacing w:line="240" w:lineRule="auto"/>
+        <w:rPr>
+          <w:rFonts w:ascii="Times New Roman" w:eastAsia="Times New Roman" w:hAnsi="Times New Roman" w:cs="Times New Roman"/>
+          <w:sz w:val="20"/>
+          <w:szCs w:val="20"/>
+        </w:rPr>
+      </w:pPr>
+      <w:r>
+        <w:rPr>
+          <w:rFonts w:ascii="Times New Roman" w:eastAsia="Times New Roman" w:hAnsi="Times New Roman" w:cs="Times New Roman"/>
+          <w:noProof/>
+          <w:sz w:val="20"/>
+          <w:szCs w:val="20"/>
+        </w:rPr>
+        <w:drawing>
+          <wp:inline distT="0" distB="0" distL="0" distR="0" wp14:anchorId="5D5946DD" wp14:editId="4500678C">
+            <wp:extent cx="1006141" cy="2124075"/>
+            <wp:effectExtent l="0" t="0" r="3810" b="0"/>
+            <wp:docPr id="1612948193" name="Picture 4"/>
+            <wp:cNvGraphicFramePr>
+              <a:graphicFrameLocks xmlns:a="http://schemas.openxmlformats.org/drawingml/2006/main" noChangeAspect="1"/>
+            </wp:cNvGraphicFramePr>
+            <a:graphic xmlns:a="http://schemas.openxmlformats.org/drawingml/2006/main">
+              <a:graphicData uri="http://schemas.openxmlformats.org/drawingml/2006/picture">
+                <pic:pic xmlns:pic="http://schemas.openxmlformats.org/drawingml/2006/picture">
+                  <pic:nvPicPr>
+                    <pic:cNvPr id="0" name="Picture 5"/>
+                    <pic:cNvPicPr>
+                      <a:picLocks noChangeAspect="1" noChangeArrowheads="1"/>
+                    </pic:cNvPicPr>
+                  </pic:nvPicPr>
+                  <pic:blipFill>
+                    <a:blip r:embed="rId64" cstate="print">
+                      <a:extLst>
+                        <a:ext uri="{28A0092B-C50C-407E-A947-70E740481C1C}">
+                          <a14:useLocalDpi xmlns:a14="http://schemas.microsoft.com/office/drawing/2010/main" val="0"/>
+                        </a:ext>
+                      </a:extLst>
+                    </a:blip>
+                    <a:srcRect/>
+                    <a:stretch>
+                      <a:fillRect/>
+                    </a:stretch>
+                  </pic:blipFill>
+                  <pic:spPr bwMode="auto">
+                    <a:xfrm>
+                      <a:off x="0" y="0"/>
+                      <a:ext cx="1018809" cy="2150818"/>
+                    </a:xfrm>
+                    <a:prstGeom prst="rect">
+                      <a:avLst/>
+                    </a:prstGeom>
+                    <a:noFill/>
+                  </pic:spPr>
+                </pic:pic>
+              </a:graphicData>
+            </a:graphic>
+          </wp:inline>
+        </w:drawing>
+      </w:r>
+    </w:p>
+    <w:p>
+      <w:pPr>
+        <w:spacing w:before="200" w:after="80" w:line="240" w:lineRule="auto"/>
+        <w:outlineLvl w:val="1"/>
+        <w:rPr>
+          <w:rFonts w:ascii="Times New Roman" w:eastAsia="Times New Roman" w:hAnsi="Times New Roman" w:cs="Times New Roman"/>
+          <w:color w:val="2E74B5"/>
+          <w:sz w:val="26"/>
+          <w:szCs w:val="26"/>
+        </w:rPr>
+      </w:pPr>
+      <w:r>
+        <w:rPr>
+          <w:rFonts w:ascii="Times New Roman" w:eastAsia="Times New Roman" w:hAnsi="Times New Roman" w:cs="Times New Roman"/>
+          <w:b/>
+          <w:bCs/>
+          <w:color w:val="22C55E"/>
+          <w:sz w:val="26"/>
+          <w:szCs w:val="26"/>
+        </w:rPr>
+        <w:t>Bug 4: No password recovery</w:t>
+      </w:r>
+    </w:p>
+    <w:p>
+      <w:pPr>
+        <w:spacing w:after="60" w:line="240" w:lineRule="auto"/>
+        <w:rPr>
+          <w:rFonts w:ascii="Times New Roman" w:eastAsia="Times New Roman" w:hAnsi="Times New Roman" w:cs="Times New Roman"/>
+          <w:sz w:val="20"/>
+          <w:szCs w:val="20"/>
+        </w:rPr>
+      </w:pPr>
+      <w:r>
+        <w:rPr>
+          <w:rFonts w:ascii="Times New Roman" w:eastAsia="Times New Roman" w:hAnsi="Times New Roman" w:cs="Times New Roman"/>
+          <w:b/>
+          <w:bCs/>
+          <w:sz w:val="20"/>
+          <w:szCs w:val="20"/>
+        </w:rPr>
+        <w:t xml:space="preserve">Cause: </w:t>
+      </w:r>
+      <w:r>
+        <w:rPr>
+          <w:rFonts w:ascii="Times New Roman" w:eastAsia="Times New Roman" w:hAnsi="Times New Roman" w:cs="Times New Roman"/>
+          <w:sz w:val="20"/>
+          <w:szCs w:val="20"/>
+        </w:rPr>
+        <w:t>App is fully offline (no email server), so no way to reset a forgotten password.</w:t>
+      </w:r>
+    </w:p>
+    <w:p>
+      <w:pPr>
+        <w:spacing w:after="60" w:line="240" w:lineRule="auto"/>
+        <w:rPr>
+          <w:rFonts w:ascii="Times New Roman" w:eastAsia="Times New Roman" w:hAnsi="Times New Roman" w:cs="Times New Roman"/>
+          <w:sz w:val="20"/>
+          <w:szCs w:val="20"/>
+        </w:rPr>
+      </w:pPr>
+      <w:r>
+        <w:rPr>
+          <w:rFonts w:ascii="Times New Roman" w:eastAsia="Times New Roman" w:hAnsi="Times New Roman" w:cs="Times New Roman"/>
+          <w:b/>
+          <w:bCs/>
+          <w:sz w:val="20"/>
+          <w:szCs w:val="20"/>
+        </w:rPr>
+        <w:t xml:space="preserve">Fix: </w:t>
+      </w:r>
+      <w:r>
+        <w:rPr>
+          <w:rFonts w:ascii="Times New Roman" w:eastAsia="Times New Roman" w:hAnsi="Times New Roman" w:cs="Times New Roman"/>
+          <w:sz w:val="20"/>
+          <w:szCs w:val="20"/>
+        </w:rPr>
+        <w:t>Added security-question self-reset, plus Merchant admin override.</w:t>
+      </w:r>
+    </w:p>
+    <w:p>
+      <w:pPr>
+        <w:spacing w:after="80" w:line="240" w:lineRule="auto"/>
+        <w:rPr>
+          <w:rFonts w:ascii="Times New Roman" w:eastAsia="Times New Roman" w:hAnsi="Times New Roman" w:cs="Times New Roman"/>
+          <w:sz w:val="20"/>
+          <w:szCs w:val="20"/>
+        </w:rPr>
+      </w:pPr>
+    </w:p>
+    <w:p>
+      <w:pPr>
+        <w:spacing w:line="240" w:lineRule="auto"/>
+        <w:rPr>
+          <w:rFonts w:ascii="Times New Roman" w:eastAsia="Times New Roman" w:hAnsi="Times New Roman" w:cs="Times New Roman"/>
+          <w:sz w:val="20"/>
+          <w:szCs w:val="20"/>
+        </w:rPr>
+      </w:pPr>
+      <w:r>
+        <w:rPr>
+          <w:rFonts w:ascii="Times New Roman" w:eastAsia="Times New Roman" w:hAnsi="Times New Roman" w:cs="Times New Roman"/>
+          <w:noProof/>
+          <w:sz w:val="20"/>
+          <w:szCs w:val="20"/>
+        </w:rPr>
+        <w:drawing>
+          <wp:inline distT="0" distB="0" distL="0" distR="0" wp14:anchorId="3B9148D7" wp14:editId="4FA437EC">
+            <wp:extent cx="1251953" cy="2643011"/>
+            <wp:effectExtent l="0" t="0" r="5715" b="5080"/>
+            <wp:docPr id="1295366033" name="Picture 5"/>
+            <wp:cNvGraphicFramePr>
+              <a:graphicFrameLocks xmlns:a="http://schemas.openxmlformats.org/drawingml/2006/main" noChangeAspect="1"/>
+            </wp:cNvGraphicFramePr>
+            <a:graphic xmlns:a="http://schemas.openxmlformats.org/drawingml/2006/main">
+              <a:graphicData uri="http://schemas.openxmlformats.org/drawingml/2006/picture">
+                <pic:pic xmlns:pic="http://schemas.openxmlformats.org/drawingml/2006/picture">
+                  <pic:nvPicPr>
+                    <pic:cNvPr id="0" name="Picture 6"/>
+                    <pic:cNvPicPr>
+                      <a:picLocks noChangeAspect="1" noChangeArrowheads="1"/>
+                    </pic:cNvPicPr>
+                  </pic:nvPicPr>
+                  <pic:blipFill>
+                    <a:blip r:embed="rId65" cstate="print">
+                      <a:extLst>
+                        <a:ext uri="{28A0092B-C50C-407E-A947-70E740481C1C}">
+                          <a14:useLocalDpi xmlns:a14="http://schemas.microsoft.com/office/drawing/2010/main" val="0"/>
+                        </a:ext>
+                      </a:extLst>
+                    </a:blip>
+                    <a:srcRect/>
+                    <a:stretch>
+                      <a:fillRect/>
+                    </a:stretch>
+                  </pic:blipFill>
+                  <pic:spPr bwMode="auto">
+                    <a:xfrm>
+                      <a:off x="0" y="0"/>
+                      <a:ext cx="1268905" cy="2678799"/>
+                    </a:xfrm>
+                    <a:prstGeom prst="rect">
+                      <a:avLst/>
+                    </a:prstGeom>
+                    <a:noFill/>
+                  </pic:spPr>
+                </pic:pic>
+              </a:graphicData>
+            </a:graphic>
+          </wp:inline>
+        </w:drawing>
+      </w:r>
+      <w:r>
+        <w:rPr>
+          <w:rFonts w:ascii="Times New Roman" w:eastAsia="Times New Roman" w:hAnsi="Times New Roman" w:cs="Times New Roman"/>
+          <w:noProof/>
+          <w:sz w:val="20"/>
+          <w:szCs w:val="20"/>
+        </w:rPr>
+        <w:drawing>
+          <wp:inline distT="0" distB="0" distL="0" distR="0" wp14:anchorId="6A022E13" wp14:editId="70AE8AD5">
+            <wp:extent cx="1257300" cy="2654300"/>
+            <wp:effectExtent l="0" t="0" r="0" b="0"/>
+            <wp:docPr id="1545086993" name="Picture 6"/>
+            <wp:cNvGraphicFramePr>
+              <a:graphicFrameLocks xmlns:a="http://schemas.openxmlformats.org/drawingml/2006/main" noChangeAspect="1"/>
+            </wp:cNvGraphicFramePr>
+            <a:graphic xmlns:a="http://schemas.openxmlformats.org/drawingml/2006/main">
+              <a:graphicData uri="http://schemas.openxmlformats.org/drawingml/2006/picture">
+                <pic:pic xmlns:pic="http://schemas.openxmlformats.org/drawingml/2006/picture">
+                  <pic:nvPicPr>
+                    <pic:cNvPr id="0" name="Picture 7"/>
+                    <pic:cNvPicPr>
+                      <a:picLocks noChangeAspect="1" noChangeArrowheads="1"/>
+                    </pic:cNvPicPr>
+                  </pic:nvPicPr>
+                  <pic:blipFill>
+                    <a:blip r:embed="rId66" cstate="print">
+                      <a:extLst>
+                        <a:ext uri="{28A0092B-C50C-407E-A947-70E740481C1C}">
+                          <a14:useLocalDpi xmlns:a14="http://schemas.microsoft.com/office/drawing/2010/main" val="0"/>
+                        </a:ext>
+                      </a:extLst>
+                    </a:blip>
+                    <a:srcRect/>
+                    <a:stretch>
+                      <a:fillRect/>
+                    </a:stretch>
+                  </pic:blipFill>
+                  <pic:spPr bwMode="auto">
+                    <a:xfrm>
+                      <a:off x="0" y="0"/>
+                      <a:ext cx="1279991" cy="2702203"/>
+                    </a:xfrm>
+                    <a:prstGeom prst="rect">
+                      <a:avLst/>
+                    </a:prstGeom>
+                    <a:noFill/>
+                  </pic:spPr>
+                </pic:pic>
+              </a:graphicData>
+            </a:graphic>
+          </wp:inline>
+        </w:drawing>
+      </w:r>
+    </w:p>
+    <w:p>
+      <w:pPr>
+        <w:spacing w:before="260" w:after="130" w:line="240" w:lineRule="auto"/>
+        <w:outlineLvl w:val="0"/>
+        <w:rPr>
+          <w:rFonts w:ascii="Times New Roman" w:eastAsia="Times New Roman" w:hAnsi="Times New Roman" w:cs="Times New Roman"/>
+          <w:color w:val="2E74B5"/>
+          <w:sz w:val="32"/>
+          <w:szCs w:val="32"/>
+        </w:rPr>
+      </w:pPr>
+      <w:r>
+        <w:rPr>
+          <w:rFonts w:ascii="Times New Roman" w:eastAsia="Times New Roman" w:hAnsi="Times New Roman" w:cs="Times New Roman"/>
+          <w:b/>
+          <w:bCs/>
+          <w:color w:val="0F172A"/>
+          <w:sz w:val="32"/>
+          <w:szCs w:val="32"/>
+        </w:rPr>
+        <w:t>Summary</w:t>
+      </w:r>
+    </w:p>
+    <w:tbl>
+      <w:tblPr>
+        <w:tblW w:w="9500" w:type="dxa"/>
+        <w:tblBorders>
+          <w:top w:val="single" w:sz="4" w:space="0" w:color="auto"/>
+          <w:left w:val="single" w:sz="4" w:space="0" w:color="auto"/>
+          <w:bottom w:val="single" w:sz="4" w:space="0" w:color="auto"/>
+          <w:right w:val="single" w:sz="4" w:space="0" w:color="auto"/>
+          <w:insideH w:val="single" w:sz="4" w:space="0" w:color="auto"/>
+          <w:insideV w:val="single" w:sz="4" w:space="0" w:color="auto"/>
+        </w:tblBorders>
+        <w:tblCellMar>
+          <w:left w:w="10" w:type="dxa"/>
+          <w:right w:w="10" w:type="dxa"/>
+        </w:tblCellMar>
+        <w:tblLook w:val="04A0" w:firstRow="1" w:lastRow="0" w:firstColumn="1" w:lastColumn="0" w:noHBand="0" w:noVBand="1"/>
+      </w:tblPr>
+      <w:tblGrid>
+        <w:gridCol w:w="500"/>
+        <w:gridCol w:w="3200"/>
+        <w:gridCol w:w="4600"/>
+        <w:gridCol w:w="1200"/>
+      </w:tblGrid>
+      <w:tr>
+        <w:trPr>
+          <w:tblHeader/>
+        </w:trPr>
+        <w:tc>
+          <w:tcPr>
+            <w:tcW w:w="500" w:type="dxa"/>
+            <w:shd w:val="clear" w:color="auto" w:fill="0F172A"/>
+            <w:tcMar>
+              <w:top w:w="90" w:type="dxa"/>
+              <w:left w:w="100" w:type="dxa"/>
+              <w:bottom w:w="90" w:type="dxa"/>
+              <w:right w:w="100" w:type="dxa"/>
+            </w:tcMar>
+            <w:vAlign w:val="center"/>
+          </w:tcPr>
+          <w:p>
+            <w:pPr>
+              <w:spacing w:after="0" w:line="240" w:lineRule="auto"/>
+              <w:rPr>
+                <w:rFonts w:ascii="Times New Roman" w:eastAsia="Times New Roman" w:hAnsi="Times New Roman" w:cs="Times New Roman"/>
+                <w:sz w:val="20"/>
+                <w:szCs w:val="20"/>
+              </w:rPr>
+            </w:pPr>
+            <w:r>
+              <w:rPr>
+                <w:rFonts w:ascii="Times New Roman" w:eastAsia="Times New Roman" w:hAnsi="Times New Roman" w:cs="Times New Roman"/>
+                <w:b/>
+                <w:bCs/>
+                <w:color w:val="FFFFFF"/>
+                <w:sz w:val="19"/>
+                <w:szCs w:val="19"/>
+              </w:rPr>
+              <w:t>#</w:t>
+            </w:r>
+          </w:p>
+        </w:tc>
+        <w:tc>
+          <w:tcPr>
+            <w:tcW w:w="3200" w:type="dxa"/>
+            <w:shd w:val="clear" w:color="auto" w:fill="0F172A"/>
+            <w:tcMar>
+              <w:top w:w="90" w:type="dxa"/>
+              <w:left w:w="100" w:type="dxa"/>
+              <w:bottom w:w="90" w:type="dxa"/>
+              <w:right w:w="100" w:type="dxa"/>
+            </w:tcMar>
+            <w:vAlign w:val="center"/>
+          </w:tcPr>
+          <w:p>
+            <w:pPr>
+              <w:spacing w:after="0" w:line="240" w:lineRule="auto"/>
+              <w:rPr>
+                <w:rFonts w:ascii="Times New Roman" w:eastAsia="Times New Roman" w:hAnsi="Times New Roman" w:cs="Times New Roman"/>
+                <w:sz w:val="20"/>
+                <w:szCs w:val="20"/>
+              </w:rPr>
+            </w:pPr>
+            <w:r>
+              <w:rPr>
+                <w:rFonts w:ascii="Times New Roman" w:eastAsia="Times New Roman" w:hAnsi="Times New Roman" w:cs="Times New Roman"/>
+                <w:b/>
+                <w:bCs/>
+                <w:color w:val="FFFFFF"/>
+                <w:sz w:val="19"/>
+                <w:szCs w:val="19"/>
+              </w:rPr>
+              <w:t>Bug</w:t>
+            </w:r>
+          </w:p>
+        </w:tc>
+        <w:tc>
+          <w:tcPr>
+            <w:tcW w:w="4600" w:type="dxa"/>
+            <w:shd w:val="clear" w:color="auto" w:fill="0F172A"/>
+            <w:tcMar>
+              <w:top w:w="90" w:type="dxa"/>
+              <w:left w:w="100" w:type="dxa"/>
+              <w:bottom w:w="90" w:type="dxa"/>
+              <w:right w:w="100" w:type="dxa"/>
+            </w:tcMar>
+            <w:vAlign w:val="center"/>
+          </w:tcPr>
+          <w:p>
+            <w:pPr>
+              <w:spacing w:after="0" w:line="240" w:lineRule="auto"/>
+              <w:rPr>
+                <w:rFonts w:ascii="Times New Roman" w:eastAsia="Times New Roman" w:hAnsi="Times New Roman" w:cs="Times New Roman"/>
+                <w:sz w:val="20"/>
+                <w:szCs w:val="20"/>
+              </w:rPr>
+            </w:pPr>
+            <w:r>
+              <w:rPr>
+                <w:rFonts w:ascii="Times New Roman" w:eastAsia="Times New Roman" w:hAnsi="Times New Roman" w:cs="Times New Roman"/>
+                <w:b/>
+                <w:bCs/>
+                <w:color w:val="FFFFFF"/>
+                <w:sz w:val="19"/>
+                <w:szCs w:val="19"/>
+              </w:rPr>
+              <w:t>Fix</w:t>
+            </w:r>
+          </w:p>
+        </w:tc>
+        <w:tc>
+          <w:tcPr>
+            <w:tcW w:w="1200" w:type="dxa"/>
+            <w:shd w:val="clear" w:color="auto" w:fill="0F172A"/>
+            <w:tcMar>
+              <w:top w:w="90" w:type="dxa"/>
+              <w:left w:w="100" w:type="dxa"/>
+              <w:bottom w:w="90" w:type="dxa"/>
+              <w:right w:w="100" w:type="dxa"/>
+            </w:tcMar>
+            <w:vAlign w:val="center"/>
+          </w:tcPr>
+          <w:p>
+            <w:pPr>
+              <w:spacing w:after="0" w:line="240" w:lineRule="auto"/>
+              <w:rPr>
+                <w:rFonts w:ascii="Times New Roman" w:eastAsia="Times New Roman" w:hAnsi="Times New Roman" w:cs="Times New Roman"/>
+                <w:sz w:val="20"/>
+                <w:szCs w:val="20"/>
+              </w:rPr>
+            </w:pPr>
+            <w:r>
+              <w:rPr>
+                <w:rFonts w:ascii="Times New Roman" w:eastAsia="Times New Roman" w:hAnsi="Times New Roman" w:cs="Times New Roman"/>
+                <w:b/>
+                <w:bCs/>
+                <w:color w:val="FFFFFF"/>
+                <w:sz w:val="19"/>
+                <w:szCs w:val="19"/>
+              </w:rPr>
+              <w:t>Status</w:t>
+            </w:r>
+          </w:p>
+        </w:tc>
+      </w:tr>
+      <w:tr>
+        <w:tc>
+          <w:tcPr>
+            <w:tcW w:w="500" w:type="dxa"/>
+            <w:shd w:val="clear" w:color="auto" w:fill="FFFFFF"/>
+            <w:tcMar>
+              <w:top w:w="90" w:type="dxa"/>
+              <w:left w:w="100" w:type="dxa"/>
+              <w:bottom w:w="90" w:type="dxa"/>
+              <w:right w:w="100" w:type="dxa"/>
+            </w:tcMar>
+            <w:vAlign w:val="center"/>
+          </w:tcPr>
+          <w:p>
+            <w:pPr>
+              <w:spacing w:after="0" w:line="240" w:lineRule="auto"/>
+              <w:rPr>
+                <w:rFonts w:ascii="Times New Roman" w:eastAsia="Times New Roman" w:hAnsi="Times New Roman" w:cs="Times New Roman"/>
+                <w:sz w:val="20"/>
+                <w:szCs w:val="20"/>
+              </w:rPr>
+            </w:pPr>
+            <w:r>
+              <w:rPr>
+                <w:rFonts w:ascii="Times New Roman" w:eastAsia="Times New Roman" w:hAnsi="Times New Roman" w:cs="Times New Roman"/>
+                <w:sz w:val="19"/>
+                <w:szCs w:val="19"/>
+              </w:rPr>
+              <w:t>1</w:t>
+            </w:r>
+          </w:p>
+        </w:tc>
+        <w:tc>
+          <w:tcPr>
+            <w:tcW w:w="3200" w:type="dxa"/>
+            <w:shd w:val="clear" w:color="auto" w:fill="FFFFFF"/>
+            <w:tcMar>
+              <w:top w:w="90" w:type="dxa"/>
+              <w:left w:w="100" w:type="dxa"/>
+              <w:bottom w:w="90" w:type="dxa"/>
+              <w:right w:w="100" w:type="dxa"/>
+            </w:tcMar>
+            <w:vAlign w:val="center"/>
+          </w:tcPr>
+          <w:p>
+            <w:pPr>
+              <w:spacing w:after="0" w:line="240" w:lineRule="auto"/>
+              <w:rPr>
+                <w:rFonts w:ascii="Times New Roman" w:eastAsia="Times New Roman" w:hAnsi="Times New Roman" w:cs="Times New Roman"/>
+                <w:sz w:val="20"/>
+                <w:szCs w:val="20"/>
+              </w:rPr>
+            </w:pPr>
+            <w:r>
+              <w:rPr>
+                <w:rFonts w:ascii="Times New Roman" w:eastAsia="Times New Roman" w:hAnsi="Times New Roman" w:cs="Times New Roman"/>
+                <w:sz w:val="19"/>
+                <w:szCs w:val="19"/>
+              </w:rPr>
+              <w:t>M-Pesa deducted real money in sandbox testing</w:t>
+            </w:r>
+          </w:p>
+        </w:tc>
+        <w:tc>
+          <w:tcPr>
+            <w:tcW w:w="4600" w:type="dxa"/>
+            <w:shd w:val="clear" w:color="auto" w:fill="FFFFFF"/>
+            <w:tcMar>
+              <w:top w:w="90" w:type="dxa"/>
+              <w:left w:w="100" w:type="dxa"/>
+              <w:bottom w:w="90" w:type="dxa"/>
+              <w:right w:w="100" w:type="dxa"/>
+            </w:tcMar>
+            <w:vAlign w:val="center"/>
+          </w:tcPr>
+          <w:p>
+            <w:pPr>
+              <w:spacing w:after="0" w:line="240" w:lineRule="auto"/>
+              <w:rPr>
+                <w:rFonts w:ascii="Times New Roman" w:eastAsia="Times New Roman" w:hAnsi="Times New Roman" w:cs="Times New Roman"/>
+                <w:sz w:val="20"/>
+                <w:szCs w:val="20"/>
+              </w:rPr>
+            </w:pPr>
+            <w:r>
+              <w:rPr>
+                <w:rFonts w:ascii="Times New Roman" w:eastAsia="Times New Roman" w:hAnsi="Times New Roman" w:cs="Times New Roman"/>
+                <w:sz w:val="19"/>
+                <w:szCs w:val="19"/>
+              </w:rPr>
+              <w:t>Added Simulate Payment toggle</w:t>
+            </w:r>
+          </w:p>
+        </w:tc>
+        <w:tc>
+          <w:tcPr>
+            <w:tcW w:w="1200" w:type="dxa"/>
+            <w:shd w:val="clear" w:color="auto" w:fill="FFFFFF"/>
+            <w:tcMar>
+              <w:top w:w="90" w:type="dxa"/>
+              <w:left w:w="100" w:type="dxa"/>
+              <w:bottom w:w="90" w:type="dxa"/>
+              <w:right w:w="100" w:type="dxa"/>
+            </w:tcMar>
+            <w:vAlign w:val="center"/>
+          </w:tcPr>
+          <w:p>
+            <w:pPr>
+              <w:spacing w:after="0" w:line="240" w:lineRule="auto"/>
+              <w:rPr>
+                <w:rFonts w:ascii="Times New Roman" w:eastAsia="Times New Roman" w:hAnsi="Times New Roman" w:cs="Times New Roman"/>
+                <w:sz w:val="20"/>
+                <w:szCs w:val="20"/>
+              </w:rPr>
+            </w:pPr>
+            <w:r>
+              <w:rPr>
+                <w:rFonts w:ascii="Times New Roman" w:eastAsia="Times New Roman" w:hAnsi="Times New Roman" w:cs="Times New Roman"/>
+                <w:sz w:val="19"/>
+                <w:szCs w:val="19"/>
+              </w:rPr>
+              <w:t>Resolved</w:t>
+            </w:r>
+          </w:p>
+        </w:tc>
+      </w:tr>
+      <w:tr>
+        <w:tc>
+          <w:tcPr>
+            <w:tcW w:w="500" w:type="dxa"/>
+            <w:shd w:val="clear" w:color="auto" w:fill="F1F5F9"/>
+            <w:tcMar>
+              <w:top w:w="90" w:type="dxa"/>
+              <w:left w:w="100" w:type="dxa"/>
+              <w:bottom w:w="90" w:type="dxa"/>
+              <w:right w:w="100" w:type="dxa"/>
+            </w:tcMar>
+            <w:vAlign w:val="center"/>
+          </w:tcPr>
+          <w:p>
+            <w:pPr>
+              <w:spacing w:after="0" w:line="240" w:lineRule="auto"/>
+              <w:rPr>
+                <w:rFonts w:ascii="Times New Roman" w:eastAsia="Times New Roman" w:hAnsi="Times New Roman" w:cs="Times New Roman"/>
+                <w:sz w:val="20"/>
+                <w:szCs w:val="20"/>
+              </w:rPr>
+            </w:pPr>
+            <w:r>
+              <w:rPr>
+                <w:rFonts w:ascii="Times New Roman" w:eastAsia="Times New Roman" w:hAnsi="Times New Roman" w:cs="Times New Roman"/>
+                <w:sz w:val="19"/>
+                <w:szCs w:val="19"/>
+              </w:rPr>
+              <w:t>2</w:t>
+            </w:r>
+          </w:p>
+        </w:tc>
+        <w:tc>
+          <w:tcPr>
+            <w:tcW w:w="3200" w:type="dxa"/>
+            <w:shd w:val="clear" w:color="auto" w:fill="F1F5F9"/>
+            <w:tcMar>
+              <w:top w:w="90" w:type="dxa"/>
+              <w:left w:w="100" w:type="dxa"/>
+              <w:bottom w:w="90" w:type="dxa"/>
+              <w:right w:w="100" w:type="dxa"/>
+            </w:tcMar>
+            <w:vAlign w:val="center"/>
+          </w:tcPr>
+          <w:p>
+            <w:pPr>
+              <w:spacing w:after="0" w:line="240" w:lineRule="auto"/>
+              <w:rPr>
+                <w:rFonts w:ascii="Times New Roman" w:eastAsia="Times New Roman" w:hAnsi="Times New Roman" w:cs="Times New Roman"/>
+                <w:sz w:val="20"/>
+                <w:szCs w:val="20"/>
+              </w:rPr>
+            </w:pPr>
+            <w:r>
+              <w:rPr>
+                <w:rFonts w:ascii="Times New Roman" w:eastAsia="Times New Roman" w:hAnsi="Times New Roman" w:cs="Times New Roman"/>
+                <w:sz w:val="19"/>
+                <w:szCs w:val="19"/>
+              </w:rPr>
+              <w:t>Sales not recording after payment</w:t>
+            </w:r>
+          </w:p>
+        </w:tc>
+        <w:tc>
+          <w:tcPr>
+            <w:tcW w:w="4600" w:type="dxa"/>
+            <w:shd w:val="clear" w:color="auto" w:fill="F1F5F9"/>
+            <w:tcMar>
+              <w:top w:w="90" w:type="dxa"/>
+              <w:left w:w="100" w:type="dxa"/>
+              <w:bottom w:w="90" w:type="dxa"/>
+              <w:right w:w="100" w:type="dxa"/>
+            </w:tcMar>
+            <w:vAlign w:val="center"/>
+          </w:tcPr>
+          <w:p>
+            <w:pPr>
+              <w:spacing w:after="0" w:line="240" w:lineRule="auto"/>
+              <w:rPr>
+                <w:rFonts w:ascii="Times New Roman" w:eastAsia="Times New Roman" w:hAnsi="Times New Roman" w:cs="Times New Roman"/>
+                <w:sz w:val="20"/>
+                <w:szCs w:val="20"/>
+              </w:rPr>
+            </w:pPr>
+            <w:r>
+              <w:rPr>
+                <w:rFonts w:ascii="Times New Roman" w:eastAsia="Times New Roman" w:hAnsi="Times New Roman" w:cs="Times New Roman"/>
+                <w:sz w:val="19"/>
+                <w:szCs w:val="19"/>
+              </w:rPr>
+              <w:t xml:space="preserve">Shared </w:t>
+            </w:r>
+            <w:proofErr w:type="spellStart"/>
+            <w:r>
+              <w:rPr>
+                <w:rFonts w:ascii="Times New Roman" w:eastAsia="Times New Roman" w:hAnsi="Times New Roman" w:cs="Times New Roman"/>
+                <w:sz w:val="19"/>
+                <w:szCs w:val="19"/>
+              </w:rPr>
+              <w:t>recordSale</w:t>
+            </w:r>
+            <w:proofErr w:type="spellEnd"/>
+            <w:r>
+              <w:rPr>
+                <w:rFonts w:ascii="Times New Roman" w:eastAsia="Times New Roman" w:hAnsi="Times New Roman" w:cs="Times New Roman"/>
+                <w:sz w:val="19"/>
+                <w:szCs w:val="19"/>
+              </w:rPr>
+              <w:t>() helper, always runs on success</w:t>
+            </w:r>
+          </w:p>
+        </w:tc>
+        <w:tc>
+          <w:tcPr>
+            <w:tcW w:w="1200" w:type="dxa"/>
+            <w:shd w:val="clear" w:color="auto" w:fill="F1F5F9"/>
+            <w:tcMar>
+              <w:top w:w="90" w:type="dxa"/>
+              <w:left w:w="100" w:type="dxa"/>
+              <w:bottom w:w="90" w:type="dxa"/>
+              <w:right w:w="100" w:type="dxa"/>
+            </w:tcMar>
+            <w:vAlign w:val="center"/>
+          </w:tcPr>
+          <w:p>
+            <w:pPr>
+              <w:spacing w:after="0" w:line="240" w:lineRule="auto"/>
+              <w:rPr>
+                <w:rFonts w:ascii="Times New Roman" w:eastAsia="Times New Roman" w:hAnsi="Times New Roman" w:cs="Times New Roman"/>
+                <w:sz w:val="20"/>
+                <w:szCs w:val="20"/>
+              </w:rPr>
+            </w:pPr>
+            <w:r>
+              <w:rPr>
+                <w:rFonts w:ascii="Times New Roman" w:eastAsia="Times New Roman" w:hAnsi="Times New Roman" w:cs="Times New Roman"/>
+                <w:sz w:val="19"/>
+                <w:szCs w:val="19"/>
+              </w:rPr>
+              <w:t>Resolved</w:t>
+            </w:r>
+          </w:p>
+        </w:tc>
+      </w:tr>
+      <w:tr>
+        <w:tc>
+          <w:tcPr>
+            <w:tcW w:w="500" w:type="dxa"/>
+            <w:shd w:val="clear" w:color="auto" w:fill="FFFFFF"/>
+            <w:tcMar>
+              <w:top w:w="90" w:type="dxa"/>
+              <w:left w:w="100" w:type="dxa"/>
+              <w:bottom w:w="90" w:type="dxa"/>
+              <w:right w:w="100" w:type="dxa"/>
+            </w:tcMar>
+            <w:vAlign w:val="center"/>
+          </w:tcPr>
+          <w:p>
+            <w:pPr>
+              <w:spacing w:after="0" w:line="240" w:lineRule="auto"/>
+              <w:rPr>
+                <w:rFonts w:ascii="Times New Roman" w:eastAsia="Times New Roman" w:hAnsi="Times New Roman" w:cs="Times New Roman"/>
+                <w:sz w:val="20"/>
+                <w:szCs w:val="20"/>
+              </w:rPr>
+            </w:pPr>
+            <w:r>
+              <w:rPr>
+                <w:rFonts w:ascii="Times New Roman" w:eastAsia="Times New Roman" w:hAnsi="Times New Roman" w:cs="Times New Roman"/>
+                <w:sz w:val="19"/>
+                <w:szCs w:val="19"/>
+              </w:rPr>
+              <w:lastRenderedPageBreak/>
+              <w:t>3</w:t>
+            </w:r>
+          </w:p>
+        </w:tc>
+        <w:tc>
+          <w:tcPr>
+            <w:tcW w:w="3200" w:type="dxa"/>
+            <w:shd w:val="clear" w:color="auto" w:fill="FFFFFF"/>
+            <w:tcMar>
+              <w:top w:w="90" w:type="dxa"/>
+              <w:left w:w="100" w:type="dxa"/>
+              <w:bottom w:w="90" w:type="dxa"/>
+              <w:right w:w="100" w:type="dxa"/>
+            </w:tcMar>
+            <w:vAlign w:val="center"/>
+          </w:tcPr>
+          <w:p>
+            <w:pPr>
+              <w:spacing w:after="0" w:line="240" w:lineRule="auto"/>
+              <w:rPr>
+                <w:rFonts w:ascii="Times New Roman" w:eastAsia="Times New Roman" w:hAnsi="Times New Roman" w:cs="Times New Roman"/>
+                <w:sz w:val="20"/>
+                <w:szCs w:val="20"/>
+              </w:rPr>
+            </w:pPr>
+            <w:r>
+              <w:rPr>
+                <w:rFonts w:ascii="Times New Roman" w:eastAsia="Times New Roman" w:hAnsi="Times New Roman" w:cs="Times New Roman"/>
+                <w:sz w:val="19"/>
+                <w:szCs w:val="19"/>
+              </w:rPr>
+              <w:t>Theme toggle had no visual effect</w:t>
+            </w:r>
+          </w:p>
+        </w:tc>
+        <w:tc>
+          <w:tcPr>
+            <w:tcW w:w="4600" w:type="dxa"/>
+            <w:shd w:val="clear" w:color="auto" w:fill="FFFFFF"/>
+            <w:tcMar>
+              <w:top w:w="90" w:type="dxa"/>
+              <w:left w:w="100" w:type="dxa"/>
+              <w:bottom w:w="90" w:type="dxa"/>
+              <w:right w:w="100" w:type="dxa"/>
+            </w:tcMar>
+            <w:vAlign w:val="center"/>
+          </w:tcPr>
+          <w:p>
+            <w:pPr>
+              <w:spacing w:after="0" w:line="240" w:lineRule="auto"/>
+              <w:rPr>
+                <w:rFonts w:ascii="Times New Roman" w:eastAsia="Times New Roman" w:hAnsi="Times New Roman" w:cs="Times New Roman"/>
+                <w:sz w:val="20"/>
+                <w:szCs w:val="20"/>
+              </w:rPr>
+            </w:pPr>
+            <w:r>
+              <w:rPr>
+                <w:rFonts w:ascii="Times New Roman" w:eastAsia="Times New Roman" w:hAnsi="Times New Roman" w:cs="Times New Roman"/>
+                <w:sz w:val="19"/>
+                <w:szCs w:val="19"/>
+              </w:rPr>
+              <w:t xml:space="preserve">Removed duplicate </w:t>
+            </w:r>
+            <w:proofErr w:type="spellStart"/>
+            <w:r>
+              <w:rPr>
+                <w:rFonts w:ascii="Times New Roman" w:eastAsia="Times New Roman" w:hAnsi="Times New Roman" w:cs="Times New Roman"/>
+                <w:sz w:val="19"/>
+                <w:szCs w:val="19"/>
+              </w:rPr>
+              <w:t>main.dart</w:t>
+            </w:r>
+            <w:proofErr w:type="spellEnd"/>
+            <w:r>
+              <w:rPr>
+                <w:rFonts w:ascii="Times New Roman" w:eastAsia="Times New Roman" w:hAnsi="Times New Roman" w:cs="Times New Roman"/>
+                <w:sz w:val="19"/>
+                <w:szCs w:val="19"/>
+              </w:rPr>
+              <w:t>, fixed real entry point</w:t>
+            </w:r>
+          </w:p>
+        </w:tc>
+        <w:tc>
+          <w:tcPr>
+            <w:tcW w:w="1200" w:type="dxa"/>
+            <w:shd w:val="clear" w:color="auto" w:fill="FFFFFF"/>
+            <w:tcMar>
+              <w:top w:w="90" w:type="dxa"/>
+              <w:left w:w="100" w:type="dxa"/>
+              <w:bottom w:w="90" w:type="dxa"/>
+              <w:right w:w="100" w:type="dxa"/>
+            </w:tcMar>
+            <w:vAlign w:val="center"/>
+          </w:tcPr>
+          <w:p>
+            <w:pPr>
+              <w:spacing w:after="0" w:line="240" w:lineRule="auto"/>
+              <w:rPr>
+                <w:rFonts w:ascii="Times New Roman" w:eastAsia="Times New Roman" w:hAnsi="Times New Roman" w:cs="Times New Roman"/>
+                <w:sz w:val="20"/>
+                <w:szCs w:val="20"/>
+              </w:rPr>
+            </w:pPr>
+            <w:r>
+              <w:rPr>
+                <w:rFonts w:ascii="Times New Roman" w:eastAsia="Times New Roman" w:hAnsi="Times New Roman" w:cs="Times New Roman"/>
+                <w:sz w:val="19"/>
+                <w:szCs w:val="19"/>
+              </w:rPr>
+              <w:t>Resolved</w:t>
+            </w:r>
+          </w:p>
+        </w:tc>
+      </w:tr>
+      <w:tr>
+        <w:tc>
+          <w:tcPr>
+            <w:tcW w:w="500" w:type="dxa"/>
+            <w:shd w:val="clear" w:color="auto" w:fill="F1F5F9"/>
+            <w:tcMar>
+              <w:top w:w="90" w:type="dxa"/>
+              <w:left w:w="100" w:type="dxa"/>
+              <w:bottom w:w="90" w:type="dxa"/>
+              <w:right w:w="100" w:type="dxa"/>
+            </w:tcMar>
+            <w:vAlign w:val="center"/>
+          </w:tcPr>
+          <w:p>
+            <w:pPr>
+              <w:spacing w:after="0" w:line="240" w:lineRule="auto"/>
+              <w:rPr>
+                <w:rFonts w:ascii="Times New Roman" w:eastAsia="Times New Roman" w:hAnsi="Times New Roman" w:cs="Times New Roman"/>
+                <w:sz w:val="20"/>
+                <w:szCs w:val="20"/>
+              </w:rPr>
+            </w:pPr>
+            <w:r>
+              <w:rPr>
+                <w:rFonts w:ascii="Times New Roman" w:eastAsia="Times New Roman" w:hAnsi="Times New Roman" w:cs="Times New Roman"/>
+                <w:sz w:val="19"/>
+                <w:szCs w:val="19"/>
+              </w:rPr>
+              <w:t>4</w:t>
+            </w:r>
+          </w:p>
+        </w:tc>
+        <w:tc>
+          <w:tcPr>
+            <w:tcW w:w="3200" w:type="dxa"/>
+            <w:shd w:val="clear" w:color="auto" w:fill="F1F5F9"/>
+            <w:tcMar>
+              <w:top w:w="90" w:type="dxa"/>
+              <w:left w:w="100" w:type="dxa"/>
+              <w:bottom w:w="90" w:type="dxa"/>
+              <w:right w:w="100" w:type="dxa"/>
+            </w:tcMar>
+            <w:vAlign w:val="center"/>
+          </w:tcPr>
+          <w:p>
+            <w:pPr>
+              <w:spacing w:after="0" w:line="240" w:lineRule="auto"/>
+              <w:rPr>
+                <w:rFonts w:ascii="Times New Roman" w:eastAsia="Times New Roman" w:hAnsi="Times New Roman" w:cs="Times New Roman"/>
+                <w:sz w:val="20"/>
+                <w:szCs w:val="20"/>
+              </w:rPr>
+            </w:pPr>
+            <w:r>
+              <w:rPr>
+                <w:rFonts w:ascii="Times New Roman" w:eastAsia="Times New Roman" w:hAnsi="Times New Roman" w:cs="Times New Roman"/>
+                <w:sz w:val="19"/>
+                <w:szCs w:val="19"/>
+              </w:rPr>
+              <w:t>No password recovery option</w:t>
+            </w:r>
+          </w:p>
+        </w:tc>
+        <w:tc>
+          <w:tcPr>
+            <w:tcW w:w="4600" w:type="dxa"/>
+            <w:shd w:val="clear" w:color="auto" w:fill="F1F5F9"/>
+            <w:tcMar>
+              <w:top w:w="90" w:type="dxa"/>
+              <w:left w:w="100" w:type="dxa"/>
+              <w:bottom w:w="90" w:type="dxa"/>
+              <w:right w:w="100" w:type="dxa"/>
+            </w:tcMar>
+            <w:vAlign w:val="center"/>
+          </w:tcPr>
+          <w:p>
+            <w:pPr>
+              <w:spacing w:after="0" w:line="240" w:lineRule="auto"/>
+              <w:rPr>
+                <w:rFonts w:ascii="Times New Roman" w:eastAsia="Times New Roman" w:hAnsi="Times New Roman" w:cs="Times New Roman"/>
+                <w:sz w:val="20"/>
+                <w:szCs w:val="20"/>
+              </w:rPr>
+            </w:pPr>
+            <w:r>
+              <w:rPr>
+                <w:rFonts w:ascii="Times New Roman" w:eastAsia="Times New Roman" w:hAnsi="Times New Roman" w:cs="Times New Roman"/>
+                <w:sz w:val="19"/>
+                <w:szCs w:val="19"/>
+              </w:rPr>
+              <w:t>Security-question reset + admin override</w:t>
+            </w:r>
+          </w:p>
+        </w:tc>
+        <w:tc>
+          <w:tcPr>
+            <w:tcW w:w="1200" w:type="dxa"/>
+            <w:shd w:val="clear" w:color="auto" w:fill="F1F5F9"/>
+            <w:tcMar>
+              <w:top w:w="90" w:type="dxa"/>
+              <w:left w:w="100" w:type="dxa"/>
+              <w:bottom w:w="90" w:type="dxa"/>
+              <w:right w:w="100" w:type="dxa"/>
+            </w:tcMar>
+            <w:vAlign w:val="center"/>
+          </w:tcPr>
+          <w:p>
+            <w:pPr>
+              <w:spacing w:after="0" w:line="240" w:lineRule="auto"/>
+              <w:rPr>
+                <w:rFonts w:ascii="Times New Roman" w:eastAsia="Times New Roman" w:hAnsi="Times New Roman" w:cs="Times New Roman"/>
+                <w:sz w:val="20"/>
+                <w:szCs w:val="20"/>
+              </w:rPr>
+            </w:pPr>
+            <w:r>
+              <w:rPr>
+                <w:rFonts w:ascii="Times New Roman" w:eastAsia="Times New Roman" w:hAnsi="Times New Roman" w:cs="Times New Roman"/>
+                <w:sz w:val="19"/>
+                <w:szCs w:val="19"/>
+              </w:rPr>
+              <w:t>Resolved</w:t>
+            </w:r>
+          </w:p>
+        </w:tc>
+      </w:tr>
+    </w:tbl>
+    <w:p>
+      <w:pPr>
+        <w:spacing w:before="260" w:after="130" w:line="240" w:lineRule="auto"/>
+        <w:outlineLvl w:val="0"/>
+        <w:rPr>
+          <w:rFonts w:ascii="Times New Roman" w:eastAsia="Times New Roman" w:hAnsi="Times New Roman" w:cs="Times New Roman"/>
+          <w:color w:val="2E74B5"/>
+          <w:sz w:val="32"/>
+          <w:szCs w:val="32"/>
+        </w:rPr>
+      </w:pPr>
+      <w:r>
+        <w:rPr>
+          <w:rFonts w:ascii="Times New Roman" w:eastAsia="Times New Roman" w:hAnsi="Times New Roman" w:cs="Times New Roman"/>
+          <w:b/>
+          <w:bCs/>
+          <w:color w:val="0F172A"/>
+          <w:sz w:val="32"/>
+          <w:szCs w:val="32"/>
+        </w:rPr>
+        <w:t>New Features Added</w:t>
+      </w:r>
+    </w:p>
+    <w:p>
+      <w:pPr>
+        <w:numPr>
+          <w:ilvl w:val="0"/>
+          <w:numId w:val="12"/>
+        </w:numPr>
+        <w:spacing w:after="40" w:line="240" w:lineRule="auto"/>
+        <w:rPr>
+          <w:rFonts w:ascii="Times New Roman" w:eastAsia="Times New Roman" w:hAnsi="Times New Roman" w:cs="Times New Roman"/>
+          <w:sz w:val="20"/>
+          <w:szCs w:val="20"/>
+        </w:rPr>
+      </w:pPr>
+      <w:r>
+        <w:rPr>
+          <w:rFonts w:ascii="Times New Roman" w:eastAsia="Times New Roman" w:hAnsi="Times New Roman" w:cs="Times New Roman"/>
+          <w:sz w:val="20"/>
+          <w:szCs w:val="20"/>
+        </w:rPr>
+        <w:t>Splash Screen — animated bar-chart intro on launch.</w:t>
+      </w:r>
+    </w:p>
+    <w:p>
+      <w:pPr>
+        <w:spacing w:after="80" w:line="240" w:lineRule="auto"/>
+        <w:rPr>
+          <w:rFonts w:ascii="Times New Roman" w:eastAsia="Times New Roman" w:hAnsi="Times New Roman" w:cs="Times New Roman"/>
+          <w:sz w:val="20"/>
+          <w:szCs w:val="20"/>
+        </w:rPr>
+      </w:pPr>
+    </w:p>
+    <w:p>
+      <w:pPr>
+        <w:spacing w:after="150" w:line="240" w:lineRule="auto"/>
+        <w:rPr>
+          <w:rFonts w:ascii="Times New Roman" w:eastAsia="Times New Roman" w:hAnsi="Times New Roman" w:cs="Times New Roman"/>
+          <w:sz w:val="20"/>
+          <w:szCs w:val="20"/>
+        </w:rPr>
+      </w:pPr>
+      <w:r>
+        <w:rPr>
+          <w:rFonts w:ascii="Times New Roman" w:eastAsia="Times New Roman" w:hAnsi="Times New Roman" w:cs="Times New Roman"/>
+          <w:noProof/>
+          <w:sz w:val="20"/>
+          <w:szCs w:val="20"/>
+        </w:rPr>
+        <w:drawing>
+          <wp:inline distT="0" distB="0" distL="0" distR="0" wp14:anchorId="7310F7D9" wp14:editId="6D014461">
+            <wp:extent cx="1213251" cy="2561306"/>
+            <wp:effectExtent l="0" t="0" r="6350" b="0"/>
+            <wp:docPr id="1489034014" name="Picture 7"/>
+            <wp:cNvGraphicFramePr>
+              <a:graphicFrameLocks xmlns:a="http://schemas.openxmlformats.org/drawingml/2006/main" noChangeAspect="1"/>
+            </wp:cNvGraphicFramePr>
+            <a:graphic xmlns:a="http://schemas.openxmlformats.org/drawingml/2006/main">
+              <a:graphicData uri="http://schemas.openxmlformats.org/drawingml/2006/picture">
+                <pic:pic xmlns:pic="http://schemas.openxmlformats.org/drawingml/2006/picture">
+                  <pic:nvPicPr>
+                    <pic:cNvPr id="0" name="Picture 8"/>
+                    <pic:cNvPicPr>
+                      <a:picLocks noChangeAspect="1" noChangeArrowheads="1"/>
+                    </pic:cNvPicPr>
+                  </pic:nvPicPr>
+                  <pic:blipFill>
+                    <a:blip r:embed="rId67" cstate="print">
+                      <a:extLst>
+                        <a:ext uri="{28A0092B-C50C-407E-A947-70E740481C1C}">
+                          <a14:useLocalDpi xmlns:a14="http://schemas.microsoft.com/office/drawing/2010/main" val="0"/>
+                        </a:ext>
+                      </a:extLst>
+                    </a:blip>
+                    <a:srcRect/>
+                    <a:stretch>
+                      <a:fillRect/>
+                    </a:stretch>
+                  </pic:blipFill>
+                  <pic:spPr bwMode="auto">
+                    <a:xfrm>
+                      <a:off x="0" y="0"/>
+                      <a:ext cx="1233189" cy="2603396"/>
+                    </a:xfrm>
+                    <a:prstGeom prst="rect">
+                      <a:avLst/>
+                    </a:prstGeom>
+                    <a:noFill/>
+                  </pic:spPr>
+                </pic:pic>
+              </a:graphicData>
+            </a:graphic>
+          </wp:inline>
+        </w:drawing>
+      </w:r>
+    </w:p>
+    <w:p>
+      <w:pPr>
+        <w:numPr>
+          <w:ilvl w:val="0"/>
+          <w:numId w:val="12"/>
+        </w:numPr>
+        <w:spacing w:after="40" w:line="240" w:lineRule="auto"/>
+        <w:rPr>
+          <w:rFonts w:ascii="Times New Roman" w:eastAsia="Times New Roman" w:hAnsi="Times New Roman" w:cs="Times New Roman"/>
+          <w:sz w:val="20"/>
+          <w:szCs w:val="20"/>
+        </w:rPr>
+      </w:pPr>
+      <w:r>
+        <w:rPr>
+          <w:rFonts w:ascii="Times New Roman" w:eastAsia="Times New Roman" w:hAnsi="Times New Roman" w:cs="Times New Roman"/>
+          <w:sz w:val="20"/>
+          <w:szCs w:val="20"/>
+        </w:rPr>
+        <w:t>Dark / Light Mode Toggle — switch theme app-wide, saved across restarts.</w:t>
+      </w:r>
+    </w:p>
+    <w:p>
+      <w:pPr>
+        <w:spacing w:after="80" w:line="240" w:lineRule="auto"/>
+        <w:rPr>
+          <w:rFonts w:ascii="Times New Roman" w:eastAsia="Times New Roman" w:hAnsi="Times New Roman" w:cs="Times New Roman"/>
+          <w:sz w:val="20"/>
+          <w:szCs w:val="20"/>
+        </w:rPr>
+      </w:pPr>
+    </w:p>
+    <w:tbl>
+      <w:tblPr>
+        <w:tblW w:w="9798" w:type="dxa"/>
+        <w:tblBorders>
+          <w:top w:val="single" w:sz="4" w:space="0" w:color="auto"/>
+          <w:left w:val="single" w:sz="4" w:space="0" w:color="auto"/>
+          <w:bottom w:val="single" w:sz="4" w:space="0" w:color="auto"/>
+          <w:right w:val="single" w:sz="4" w:space="0" w:color="auto"/>
+          <w:insideH w:val="single" w:sz="4" w:space="0" w:color="auto"/>
+          <w:insideV w:val="single" w:sz="4" w:space="0" w:color="auto"/>
+        </w:tblBorders>
+        <w:tblCellMar>
+          <w:left w:w="10" w:type="dxa"/>
+          <w:right w:w="10" w:type="dxa"/>
+        </w:tblCellMar>
+        <w:tblLook w:val="04A0" w:firstRow="1" w:lastRow="0" w:firstColumn="1" w:lastColumn="0" w:noHBand="0" w:noVBand="1"/>
+      </w:tblPr>
+      <w:tblGrid>
+        <w:gridCol w:w="4899"/>
+        <w:gridCol w:w="4899"/>
+      </w:tblGrid>
+      <w:tr>
+        <w:trPr>
+          <w:trHeight w:val="4232"/>
+        </w:trPr>
+        <w:tc>
+          <w:tcPr>
+            <w:tcW w:w="4899" w:type="dxa"/>
+            <w:tcBorders>
+              <w:top w:val="dashed" w:sz="4" w:space="0" w:color="999999"/>
+              <w:left w:val="dashed" w:sz="4" w:space="0" w:color="999999"/>
+              <w:bottom w:val="dashed" w:sz="4" w:space="0" w:color="999999"/>
+              <w:right w:val="dashed" w:sz="4" w:space="0" w:color="999999"/>
+            </w:tcBorders>
+            <w:shd w:val="clear" w:color="auto" w:fill="FAFAFA"/>
+            <w:tcMar>
+              <w:top w:w="140" w:type="dxa"/>
+              <w:left w:w="150" w:type="dxa"/>
+              <w:bottom w:w="140" w:type="dxa"/>
+              <w:right w:w="150" w:type="dxa"/>
+            </w:tcMar>
+          </w:tcPr>
+          <w:p>
+            <w:pPr>
+              <w:spacing w:after="20" w:line="240" w:lineRule="auto"/>
+              <w:jc w:val="center"/>
+              <w:rPr>
+                <w:rFonts w:ascii="Times New Roman" w:eastAsia="Times New Roman" w:hAnsi="Times New Roman" w:cs="Times New Roman"/>
+                <w:sz w:val="20"/>
+                <w:szCs w:val="20"/>
+              </w:rPr>
+            </w:pPr>
+            <w:r>
+              <w:rPr>
+                <w:rFonts w:ascii="Times New Roman" w:eastAsia="Times New Roman" w:hAnsi="Times New Roman" w:cs="Times New Roman"/>
+                <w:b/>
+                <w:bCs/>
+                <w:color w:val="888888"/>
+                <w:sz w:val="18"/>
+                <w:szCs w:val="18"/>
+              </w:rPr>
+              <w:t>[ BEFORE ]</w:t>
+            </w:r>
+          </w:p>
+          <w:p>
+            <w:pPr>
+              <w:spacing w:after="0" w:line="240" w:lineRule="auto"/>
+              <w:jc w:val="center"/>
+              <w:rPr>
+                <w:rFonts w:ascii="Times New Roman" w:eastAsia="Times New Roman" w:hAnsi="Times New Roman" w:cs="Times New Roman"/>
+                <w:i/>
+                <w:iCs/>
+                <w:color w:val="666666"/>
+                <w:sz w:val="17"/>
+                <w:szCs w:val="17"/>
+              </w:rPr>
+            </w:pPr>
+            <w:r>
+              <w:rPr>
+                <w:rFonts w:ascii="Times New Roman" w:eastAsia="Times New Roman" w:hAnsi="Times New Roman" w:cs="Times New Roman"/>
+                <w:i/>
+                <w:iCs/>
+                <w:color w:val="666666"/>
+                <w:sz w:val="17"/>
+                <w:szCs w:val="17"/>
+              </w:rPr>
+              <w:t>Dark Mode active</w:t>
+            </w:r>
+          </w:p>
+          <w:p>
+            <w:pPr>
+              <w:spacing w:after="0" w:line="240" w:lineRule="auto"/>
+              <w:jc w:val="center"/>
+              <w:rPr>
+                <w:rFonts w:ascii="Times New Roman" w:eastAsia="Times New Roman" w:hAnsi="Times New Roman" w:cs="Times New Roman"/>
+                <w:sz w:val="20"/>
+                <w:szCs w:val="20"/>
+              </w:rPr>
+            </w:pPr>
+            <w:r>
+              <w:rPr>
+                <w:rFonts w:ascii="Times New Roman" w:eastAsia="Times New Roman" w:hAnsi="Times New Roman" w:cs="Times New Roman"/>
+                <w:noProof/>
+                <w:sz w:val="20"/>
+                <w:szCs w:val="20"/>
+              </w:rPr>
+              <w:drawing>
+                <wp:inline distT="0" distB="0" distL="0" distR="0" wp14:anchorId="64A92383" wp14:editId="47C4568B">
+                  <wp:extent cx="1230630" cy="2597998"/>
+                  <wp:effectExtent l="0" t="0" r="7620" b="0"/>
+                  <wp:docPr id="174164258" name="Picture 10"/>
+                  <wp:cNvGraphicFramePr>
+                    <a:graphicFrameLocks xmlns:a="http://schemas.openxmlformats.org/drawingml/2006/main" noChangeAspect="1"/>
+                  </wp:cNvGraphicFramePr>
+                  <a:graphic xmlns:a="http://schemas.openxmlformats.org/drawingml/2006/main">
+                    <a:graphicData uri="http://schemas.openxmlformats.org/drawingml/2006/picture">
+                      <pic:pic xmlns:pic="http://schemas.openxmlformats.org/drawingml/2006/picture">
+                        <pic:nvPicPr>
+                          <pic:cNvPr id="0" name="Picture 11"/>
+                          <pic:cNvPicPr>
+                            <a:picLocks noChangeAspect="1" noChangeArrowheads="1"/>
+                          </pic:cNvPicPr>
+                        </pic:nvPicPr>
+                        <pic:blipFill>
+                          <a:blip r:embed="rId68" cstate="print">
+                            <a:extLst>
+                              <a:ext uri="{28A0092B-C50C-407E-A947-70E740481C1C}">
+                                <a14:useLocalDpi xmlns:a14="http://schemas.microsoft.com/office/drawing/2010/main" val="0"/>
+                              </a:ext>
+                            </a:extLst>
+                          </a:blip>
+                          <a:srcRect/>
+                          <a:stretch>
+                            <a:fillRect/>
+                          </a:stretch>
+                        </pic:blipFill>
+                        <pic:spPr bwMode="auto">
+                          <a:xfrm>
+                            <a:off x="0" y="0"/>
+                            <a:ext cx="1260259" cy="2660547"/>
+                          </a:xfrm>
+                          <a:prstGeom prst="rect">
+                            <a:avLst/>
+                          </a:prstGeom>
+                          <a:noFill/>
+                        </pic:spPr>
+                      </pic:pic>
+                    </a:graphicData>
+                  </a:graphic>
+                </wp:inline>
+              </w:drawing>
+            </w:r>
+          </w:p>
+        </w:tc>
+        <w:tc>
+          <w:tcPr>
+            <w:tcW w:w="4899" w:type="dxa"/>
+            <w:tcBorders>
+              <w:top w:val="dashed" w:sz="4" w:space="0" w:color="999999"/>
+              <w:left w:val="dashed" w:sz="4" w:space="0" w:color="999999"/>
+              <w:bottom w:val="dashed" w:sz="4" w:space="0" w:color="999999"/>
+              <w:right w:val="dashed" w:sz="4" w:space="0" w:color="999999"/>
+            </w:tcBorders>
+            <w:shd w:val="clear" w:color="auto" w:fill="FAFAFA"/>
+            <w:tcMar>
+              <w:top w:w="140" w:type="dxa"/>
+              <w:left w:w="150" w:type="dxa"/>
+              <w:bottom w:w="140" w:type="dxa"/>
+              <w:right w:w="150" w:type="dxa"/>
+            </w:tcMar>
+          </w:tcPr>
+          <w:p>
+            <w:pPr>
+              <w:spacing w:after="20" w:line="240" w:lineRule="auto"/>
+              <w:jc w:val="center"/>
+              <w:rPr>
+                <w:rFonts w:ascii="Times New Roman" w:eastAsia="Times New Roman" w:hAnsi="Times New Roman" w:cs="Times New Roman"/>
+                <w:sz w:val="20"/>
+                <w:szCs w:val="20"/>
+              </w:rPr>
+            </w:pPr>
+            <w:r>
+              <w:rPr>
+                <w:rFonts w:ascii="Times New Roman" w:eastAsia="Times New Roman" w:hAnsi="Times New Roman" w:cs="Times New Roman"/>
+                <w:b/>
+                <w:bCs/>
+                <w:color w:val="888888"/>
+                <w:sz w:val="18"/>
+                <w:szCs w:val="18"/>
+              </w:rPr>
+              <w:t>[ AFTER ]</w:t>
+            </w:r>
+          </w:p>
+          <w:p>
+            <w:pPr>
+              <w:spacing w:after="0" w:line="240" w:lineRule="auto"/>
+              <w:jc w:val="center"/>
+              <w:rPr>
+                <w:rFonts w:ascii="Times New Roman" w:eastAsia="Times New Roman" w:hAnsi="Times New Roman" w:cs="Times New Roman"/>
+                <w:i/>
+                <w:iCs/>
+                <w:color w:val="666666"/>
+                <w:sz w:val="17"/>
+                <w:szCs w:val="17"/>
+              </w:rPr>
+            </w:pPr>
+            <w:r>
+              <w:rPr>
+                <w:rFonts w:ascii="Times New Roman" w:eastAsia="Times New Roman" w:hAnsi="Times New Roman" w:cs="Times New Roman"/>
+                <w:i/>
+                <w:iCs/>
+                <w:color w:val="666666"/>
+                <w:sz w:val="17"/>
+                <w:szCs w:val="17"/>
+              </w:rPr>
+              <w:t>Light Mode active</w:t>
+            </w:r>
+          </w:p>
+          <w:p>
+            <w:pPr>
+              <w:spacing w:after="0" w:line="240" w:lineRule="auto"/>
+              <w:jc w:val="center"/>
+              <w:rPr>
+                <w:rFonts w:ascii="Times New Roman" w:eastAsia="Times New Roman" w:hAnsi="Times New Roman" w:cs="Times New Roman"/>
+                <w:sz w:val="20"/>
+                <w:szCs w:val="20"/>
+              </w:rPr>
+            </w:pPr>
+            <w:r>
+              <w:rPr>
+                <w:rFonts w:ascii="Times New Roman" w:eastAsia="Times New Roman" w:hAnsi="Times New Roman" w:cs="Times New Roman"/>
+                <w:noProof/>
+                <w:sz w:val="20"/>
+                <w:szCs w:val="20"/>
+              </w:rPr>
+              <w:drawing>
+                <wp:inline distT="0" distB="0" distL="0" distR="0" wp14:anchorId="5238F94C" wp14:editId="6EC0BA8A">
+                  <wp:extent cx="1283134" cy="2708839"/>
+                  <wp:effectExtent l="0" t="0" r="0" b="0"/>
+                  <wp:docPr id="1555546794" name="Picture 9"/>
+                  <wp:cNvGraphicFramePr>
+                    <a:graphicFrameLocks xmlns:a="http://schemas.openxmlformats.org/drawingml/2006/main" noChangeAspect="1"/>
+                  </wp:cNvGraphicFramePr>
+                  <a:graphic xmlns:a="http://schemas.openxmlformats.org/drawingml/2006/main">
+                    <a:graphicData uri="http://schemas.openxmlformats.org/drawingml/2006/picture">
+                      <pic:pic xmlns:pic="http://schemas.openxmlformats.org/drawingml/2006/picture">
+                        <pic:nvPicPr>
+                          <pic:cNvPr id="0" name="Picture 10"/>
+                          <pic:cNvPicPr>
+                            <a:picLocks noChangeAspect="1" noChangeArrowheads="1"/>
+                          </pic:cNvPicPr>
+                        </pic:nvPicPr>
+                        <pic:blipFill>
+                          <a:blip r:embed="rId69" cstate="print">
+                            <a:extLst>
+                              <a:ext uri="{28A0092B-C50C-407E-A947-70E740481C1C}">
+                                <a14:useLocalDpi xmlns:a14="http://schemas.microsoft.com/office/drawing/2010/main" val="0"/>
+                              </a:ext>
+                            </a:extLst>
+                          </a:blip>
+                          <a:srcRect/>
+                          <a:stretch>
+                            <a:fillRect/>
+                          </a:stretch>
+                        </pic:blipFill>
+                        <pic:spPr bwMode="auto">
+                          <a:xfrm>
+                            <a:off x="0" y="0"/>
+                            <a:ext cx="1299125" cy="2742599"/>
+                          </a:xfrm>
+                          <a:prstGeom prst="rect">
+                            <a:avLst/>
+                          </a:prstGeom>
+                          <a:noFill/>
+                        </pic:spPr>
+                      </pic:pic>
+                    </a:graphicData>
+                  </a:graphic>
+                </wp:inline>
+              </w:drawing>
+            </w:r>
+          </w:p>
+        </w:tc>
+      </w:tr>
+    </w:tbl>
+    <w:p>
+      <w:pPr>
+        <w:spacing w:after="150" w:line="240" w:lineRule="auto"/>
+        <w:rPr>
+          <w:rFonts w:ascii="Times New Roman" w:eastAsia="Times New Roman" w:hAnsi="Times New Roman" w:cs="Times New Roman"/>
+          <w:sz w:val="20"/>
+          <w:szCs w:val="20"/>
+        </w:rPr>
+      </w:pPr>
+    </w:p>
+    <w:p>
+      <w:pPr>
+        <w:spacing w:before="260" w:after="130" w:line="240" w:lineRule="auto"/>
+        <w:outlineLvl w:val="0"/>
+        <w:rPr>
+          <w:rFonts w:ascii="Times New Roman" w:eastAsia="Times New Roman" w:hAnsi="Times New Roman" w:cs="Times New Roman"/>
+          <w:color w:val="2E74B5"/>
+          <w:sz w:val="32"/>
+          <w:szCs w:val="32"/>
+        </w:rPr>
+      </w:pPr>
+      <w:r>
+        <w:rPr>
+          <w:rFonts w:ascii="Times New Roman" w:eastAsia="Times New Roman" w:hAnsi="Times New Roman" w:cs="Times New Roman"/>
+          <w:b/>
+          <w:bCs/>
+          <w:color w:val="0F172A"/>
+          <w:sz w:val="32"/>
+          <w:szCs w:val="32"/>
+        </w:rPr>
+        <w:t>Remarks</w:t>
+      </w:r>
+    </w:p>
+    <w:p>
+      <w:pPr>
+        <w:numPr>
+          <w:ilvl w:val="0"/>
+          <w:numId w:val="12"/>
+        </w:numPr>
+        <w:spacing w:after="40" w:line="240" w:lineRule="auto"/>
+        <w:rPr>
+          <w:rFonts w:ascii="Times New Roman" w:eastAsia="Times New Roman" w:hAnsi="Times New Roman" w:cs="Times New Roman"/>
+          <w:sz w:val="20"/>
+          <w:szCs w:val="20"/>
+        </w:rPr>
+      </w:pPr>
+      <w:r>
+        <w:rPr>
+          <w:rFonts w:ascii="Times New Roman" w:eastAsia="Times New Roman" w:hAnsi="Times New Roman" w:cs="Times New Roman"/>
+          <w:sz w:val="20"/>
+          <w:szCs w:val="20"/>
+        </w:rPr>
+        <w:t>Integration across all Week 1–9 features confirmed working.</w:t>
+      </w:r>
+    </w:p>
+    <w:p>
+      <w:pPr>
+        <w:numPr>
+          <w:ilvl w:val="0"/>
+          <w:numId w:val="12"/>
+        </w:numPr>
+        <w:spacing w:after="40" w:line="240" w:lineRule="auto"/>
+        <w:rPr>
+          <w:rFonts w:ascii="Times New Roman" w:eastAsia="Times New Roman" w:hAnsi="Times New Roman" w:cs="Times New Roman"/>
+          <w:sz w:val="20"/>
+          <w:szCs w:val="20"/>
+        </w:rPr>
+      </w:pPr>
+      <w:r>
+        <w:rPr>
+          <w:rFonts w:ascii="Times New Roman" w:eastAsia="Times New Roman" w:hAnsi="Times New Roman" w:cs="Times New Roman"/>
+          <w:sz w:val="20"/>
+          <w:szCs w:val="20"/>
+        </w:rPr>
+        <w:t>All 4 bugs found were fixed and verified.</w:t>
+      </w:r>
+    </w:p>
+    <w:p>
+      <w:pPr>
+        <w:numPr>
+          <w:ilvl w:val="0"/>
+          <w:numId w:val="12"/>
+        </w:numPr>
+        <w:spacing w:after="40" w:line="240" w:lineRule="auto"/>
+        <w:rPr>
+          <w:rFonts w:ascii="Times New Roman" w:eastAsia="Times New Roman" w:hAnsi="Times New Roman" w:cs="Times New Roman"/>
+          <w:sz w:val="20"/>
+          <w:szCs w:val="20"/>
+        </w:rPr>
+      </w:pPr>
+      <w:r>
+        <w:rPr>
+          <w:rFonts w:ascii="Times New Roman" w:eastAsia="Times New Roman" w:hAnsi="Times New Roman" w:cs="Times New Roman"/>
+          <w:sz w:val="20"/>
+          <w:szCs w:val="20"/>
+        </w:rPr>
+        <w:t>4 new features added, exceeding the minimum 3 required.</w:t>
+      </w:r>
+    </w:p>
+    <w:p>
+      <w:pPr>
+        <w:numPr>
+          <w:ilvl w:val="0"/>
+          <w:numId w:val="12"/>
+        </w:numPr>
+        <w:spacing w:after="40" w:line="240" w:lineRule="auto"/>
+        <w:rPr>
+          <w:rFonts w:ascii="Times New Roman" w:eastAsia="Times New Roman" w:hAnsi="Times New Roman" w:cs="Times New Roman"/>
+          <w:sz w:val="20"/>
+          <w:szCs w:val="20"/>
+        </w:rPr>
+      </w:pPr>
+      <w:r>
+        <w:rPr>
+          <w:rFonts w:ascii="Times New Roman" w:eastAsia="Times New Roman" w:hAnsi="Times New Roman" w:cs="Times New Roman"/>
+          <w:sz w:val="20"/>
+          <w:szCs w:val="20"/>
+        </w:rPr>
+        <w:t>App is now safer to demo (no real M-Pesa risk) and more reliable (sales always record).</w:t>
+      </w:r>
+    </w:p>
+    <w:p>
+      <w:pPr>
+        <w:spacing w:after="40" w:line="240" w:lineRule="auto"/>
+        <w:rPr>
+          <w:rFonts w:ascii="Times New Roman" w:eastAsia="Times New Roman" w:hAnsi="Times New Roman" w:cs="Times New Roman"/>
+          <w:sz w:val="20"/>
+          <w:szCs w:val="20"/>
+        </w:rPr>
+      </w:pPr>
+    </w:p>
+    <w:p>
+      <w:pPr>
+        <w:spacing w:after="40" w:line="240" w:lineRule="auto"/>
+        <w:rPr>
+          <w:rFonts w:ascii="Times New Roman" w:eastAsia="Times New Roman" w:hAnsi="Times New Roman" w:cs="Times New Roman"/>
+          <w:sz w:val="20"/>
+          <w:szCs w:val="20"/>
+        </w:rPr>
+      </w:pPr>
+    </w:p>
+    <w:p>
+      <w:pPr>
+        <w:spacing w:after="40" w:line="240" w:lineRule="auto"/>
+        <w:rPr>
+          <w:rFonts w:ascii="Times New Roman" w:eastAsia="Times New Roman" w:hAnsi="Times New Roman" w:cs="Times New Roman"/>
+          <w:b/>
+          <w:bCs/>
+          <w:sz w:val="20"/>
+          <w:szCs w:val="20"/>
+        </w:rPr>
+      </w:pPr>
+      <w:r>
+        <w:rPr>
+          <w:rFonts w:ascii="Times New Roman" w:eastAsia="Times New Roman" w:hAnsi="Times New Roman" w:cs="Times New Roman"/>
+          <w:b/>
+          <w:bCs/>
+          <w:sz w:val="20"/>
+          <w:szCs w:val="20"/>
+        </w:rPr>
+        <w:t>Task 2: Peer App Bug Report</w:t>
+      </w:r>
+    </w:p>
+    <w:p>
+      <w:pPr>
+        <w:spacing w:after="40" w:line="240" w:lineRule="auto"/>
+        <w:rPr>
+          <w:rFonts w:ascii="Times New Roman" w:eastAsia="Times New Roman" w:hAnsi="Times New Roman" w:cs="Times New Roman"/>
+          <w:b/>
+          <w:bCs/>
+          <w:sz w:val="20"/>
+          <w:szCs w:val="20"/>
+        </w:rPr>
+      </w:pPr>
+      <w:r>
+        <w:rPr>
+          <w:rFonts w:ascii="Times New Roman" w:eastAsia="Times New Roman" w:hAnsi="Times New Roman" w:cs="Times New Roman"/>
+          <w:b/>
+          <w:bCs/>
+          <w:sz w:val="20"/>
+          <w:szCs w:val="20"/>
+        </w:rPr>
+        <w:t>Reviewed App: Gym Fitness Tracker</w:t>
+      </w:r>
+    </w:p>
+    <w:p>
+      <w:pPr>
+        <w:spacing w:after="40" w:line="240" w:lineRule="auto"/>
+        <w:rPr>
+          <w:rFonts w:ascii="Times New Roman" w:eastAsia="Times New Roman" w:hAnsi="Times New Roman" w:cs="Times New Roman"/>
+          <w:b/>
+          <w:bCs/>
+          <w:sz w:val="20"/>
+          <w:szCs w:val="20"/>
+        </w:rPr>
+      </w:pPr>
+    </w:p>
+    <w:p>
+      <w:pPr>
+        <w:spacing w:after="40" w:line="240" w:lineRule="auto"/>
+        <w:rPr>
+          <w:rFonts w:ascii="Times New Roman" w:eastAsia="Times New Roman" w:hAnsi="Times New Roman" w:cs="Times New Roman"/>
+          <w:b/>
+          <w:bCs/>
+          <w:sz w:val="20"/>
+          <w:szCs w:val="20"/>
+        </w:rPr>
+      </w:pPr>
+      <w:r>
+        <w:rPr>
+          <w:rFonts w:ascii="Times New Roman" w:eastAsia="Times New Roman" w:hAnsi="Times New Roman" w:cs="Times New Roman"/>
+          <w:b/>
+          <w:bCs/>
+          <w:sz w:val="20"/>
+          <w:szCs w:val="20"/>
+        </w:rPr>
+        <w:t>Bug 1: Step Tracker not counting steps correctly</w:t>
+      </w:r>
+    </w:p>
+    <w:p>
+      <w:pPr>
+        <w:spacing w:after="40" w:line="240" w:lineRule="auto"/>
+        <w:rPr>
+          <w:rFonts w:ascii="Times New Roman" w:eastAsia="Times New Roman" w:hAnsi="Times New Roman" w:cs="Times New Roman"/>
+          <w:b/>
+          <w:bCs/>
+          <w:sz w:val="20"/>
+          <w:szCs w:val="20"/>
+        </w:rPr>
+      </w:pPr>
+      <w:r>
+        <w:rPr>
+          <w:rFonts w:ascii="Times New Roman" w:eastAsia="Times New Roman" w:hAnsi="Times New Roman" w:cs="Times New Roman"/>
+          <w:b/>
+          <w:bCs/>
+          <w:sz w:val="20"/>
+          <w:szCs w:val="20"/>
+        </w:rPr>
+        <w:t>Description: The step counter does not accurately reflect the number of steps taken while walking with the device.</w:t>
+      </w:r>
+    </w:p>
+    <w:p>
+      <w:pPr>
+        <w:spacing w:after="40" w:line="240" w:lineRule="auto"/>
+        <w:rPr>
+          <w:rFonts w:ascii="Times New Roman" w:eastAsia="Times New Roman" w:hAnsi="Times New Roman" w:cs="Times New Roman"/>
+          <w:b/>
+          <w:bCs/>
+          <w:sz w:val="20"/>
+          <w:szCs w:val="20"/>
+        </w:rPr>
+      </w:pPr>
+      <w:r>
+        <w:rPr>
+          <w:rFonts w:ascii="Times New Roman" w:eastAsia="Times New Roman" w:hAnsi="Times New Roman" w:cs="Times New Roman"/>
+          <w:b/>
+          <w:bCs/>
+          <w:sz w:val="20"/>
+          <w:szCs w:val="20"/>
+        </w:rPr>
+        <w:t>Steps to Reproduce:</w:t>
+      </w:r>
+    </w:p>
+    <w:p>
+      <w:pPr>
+        <w:spacing w:after="40" w:line="240" w:lineRule="auto"/>
+        <w:rPr>
+          <w:rFonts w:ascii="Times New Roman" w:eastAsia="Times New Roman" w:hAnsi="Times New Roman" w:cs="Times New Roman"/>
+          <w:b/>
+          <w:bCs/>
+          <w:sz w:val="20"/>
+          <w:szCs w:val="20"/>
+        </w:rPr>
+      </w:pPr>
+      <w:r>
+        <w:rPr>
+          <w:rFonts w:ascii="Times New Roman" w:eastAsia="Times New Roman" w:hAnsi="Times New Roman" w:cs="Times New Roman"/>
+          <w:b/>
+          <w:bCs/>
+          <w:sz w:val="20"/>
+          <w:szCs w:val="20"/>
+        </w:rPr>
+        <w:t>1. Open the app and navigate to the Step Tracker screen.</w:t>
+      </w:r>
+    </w:p>
+    <w:p>
+      <w:pPr>
+        <w:spacing w:after="40" w:line="240" w:lineRule="auto"/>
+        <w:rPr>
+          <w:rFonts w:ascii="Times New Roman" w:eastAsia="Times New Roman" w:hAnsi="Times New Roman" w:cs="Times New Roman"/>
+          <w:b/>
+          <w:bCs/>
+          <w:sz w:val="20"/>
+          <w:szCs w:val="20"/>
+        </w:rPr>
+      </w:pPr>
+      <w:r>
+        <w:rPr>
+          <w:rFonts w:ascii="Times New Roman" w:eastAsia="Times New Roman" w:hAnsi="Times New Roman" w:cs="Times New Roman"/>
+          <w:b/>
+          <w:bCs/>
+          <w:sz w:val="20"/>
+          <w:szCs w:val="20"/>
+        </w:rPr>
+        <w:t>2. Grant activity/motion permissions if prompted.</w:t>
+      </w:r>
+    </w:p>
+    <w:p>
+      <w:pPr>
+        <w:spacing w:after="40" w:line="240" w:lineRule="auto"/>
+        <w:rPr>
+          <w:rFonts w:ascii="Times New Roman" w:eastAsia="Times New Roman" w:hAnsi="Times New Roman" w:cs="Times New Roman"/>
+          <w:b/>
+          <w:bCs/>
+          <w:sz w:val="20"/>
+          <w:szCs w:val="20"/>
+        </w:rPr>
+      </w:pPr>
+      <w:r>
+        <w:rPr>
+          <w:rFonts w:ascii="Times New Roman" w:eastAsia="Times New Roman" w:hAnsi="Times New Roman" w:cs="Times New Roman"/>
+          <w:b/>
+          <w:bCs/>
+          <w:sz w:val="20"/>
+          <w:szCs w:val="20"/>
+        </w:rPr>
+        <w:t>3. Walk a known number of steps (e.g. 20 steps) while carrying the phone.</w:t>
+      </w:r>
+    </w:p>
+    <w:p>
+      <w:pPr>
+        <w:spacing w:after="40" w:line="240" w:lineRule="auto"/>
+        <w:rPr>
+          <w:rFonts w:ascii="Times New Roman" w:eastAsia="Times New Roman" w:hAnsi="Times New Roman" w:cs="Times New Roman"/>
+          <w:b/>
+          <w:bCs/>
+          <w:sz w:val="20"/>
+          <w:szCs w:val="20"/>
+        </w:rPr>
+      </w:pPr>
+      <w:r>
+        <w:rPr>
+          <w:rFonts w:ascii="Times New Roman" w:eastAsia="Times New Roman" w:hAnsi="Times New Roman" w:cs="Times New Roman"/>
+          <w:b/>
+          <w:bCs/>
+          <w:sz w:val="20"/>
+          <w:szCs w:val="20"/>
+        </w:rPr>
+        <w:t>4. Compare the step count shown in-app to the actual steps taken.</w:t>
+      </w:r>
+    </w:p>
+    <w:p>
+      <w:pPr>
+        <w:spacing w:after="40" w:line="240" w:lineRule="auto"/>
+        <w:rPr>
+          <w:rFonts w:ascii="Times New Roman" w:eastAsia="Times New Roman" w:hAnsi="Times New Roman" w:cs="Times New Roman"/>
+          <w:b/>
+          <w:bCs/>
+          <w:sz w:val="20"/>
+          <w:szCs w:val="20"/>
+        </w:rPr>
+      </w:pPr>
+    </w:p>
+    <w:p>
+      <w:pPr>
+        <w:spacing w:after="40" w:line="240" w:lineRule="auto"/>
+        <w:rPr>
+          <w:rFonts w:ascii="Times New Roman" w:eastAsia="Times New Roman" w:hAnsi="Times New Roman" w:cs="Times New Roman"/>
+          <w:b/>
+          <w:bCs/>
+          <w:sz w:val="20"/>
+          <w:szCs w:val="20"/>
+        </w:rPr>
+      </w:pPr>
+      <w:r>
+        <w:rPr>
+          <w:rFonts w:ascii="Times New Roman" w:eastAsia="Times New Roman" w:hAnsi="Times New Roman" w:cs="Times New Roman"/>
+          <w:b/>
+          <w:bCs/>
+          <w:sz w:val="20"/>
+          <w:szCs w:val="20"/>
+        </w:rPr>
+        <w:t>Severity: High</w:t>
+      </w:r>
+    </w:p>
+    <w:p>
+      <w:pPr>
+        <w:spacing w:after="40" w:line="240" w:lineRule="auto"/>
+        <w:rPr>
+          <w:rFonts w:ascii="Times New Roman" w:eastAsia="Times New Roman" w:hAnsi="Times New Roman" w:cs="Times New Roman"/>
+          <w:b/>
+          <w:bCs/>
+          <w:sz w:val="20"/>
+          <w:szCs w:val="20"/>
+        </w:rPr>
+      </w:pPr>
+      <w:r>
+        <w:rPr>
+          <w:rFonts w:ascii="Times New Roman" w:eastAsia="Times New Roman" w:hAnsi="Times New Roman" w:cs="Times New Roman"/>
+          <w:b/>
+          <w:bCs/>
+          <w:sz w:val="20"/>
+          <w:szCs w:val="20"/>
+        </w:rPr>
+        <w:t>Possible Causes:</w:t>
+      </w:r>
+    </w:p>
+    <w:p>
+      <w:pPr>
+        <w:numPr>
+          <w:ilvl w:val="0"/>
+          <w:numId w:val="13"/>
+        </w:numPr>
+        <w:spacing w:after="40" w:line="240" w:lineRule="auto"/>
+        <w:rPr>
+          <w:rFonts w:ascii="Times New Roman" w:eastAsia="Times New Roman" w:hAnsi="Times New Roman" w:cs="Times New Roman"/>
+          <w:b/>
+          <w:bCs/>
+          <w:sz w:val="20"/>
+          <w:szCs w:val="20"/>
+        </w:rPr>
+      </w:pPr>
+      <w:r>
+        <w:rPr>
+          <w:rFonts w:ascii="Times New Roman" w:eastAsia="Times New Roman" w:hAnsi="Times New Roman" w:cs="Times New Roman"/>
+          <w:b/>
+          <w:bCs/>
+          <w:sz w:val="20"/>
+          <w:szCs w:val="20"/>
+        </w:rPr>
+        <w:t>Pedometer/step-count sensor (e.g. Health Connect, Google Fit, or device accelerometer API) not properly initialized or permission not granted before tracking starts.</w:t>
+      </w:r>
+    </w:p>
+    <w:p>
+      <w:pPr>
+        <w:numPr>
+          <w:ilvl w:val="0"/>
+          <w:numId w:val="13"/>
+        </w:numPr>
+        <w:spacing w:after="40" w:line="240" w:lineRule="auto"/>
+        <w:rPr>
+          <w:rFonts w:ascii="Times New Roman" w:eastAsia="Times New Roman" w:hAnsi="Times New Roman" w:cs="Times New Roman"/>
+          <w:b/>
+          <w:bCs/>
+          <w:sz w:val="20"/>
+          <w:szCs w:val="20"/>
+        </w:rPr>
+      </w:pPr>
+      <w:r>
+        <w:rPr>
+          <w:rFonts w:ascii="Times New Roman" w:eastAsia="Times New Roman" w:hAnsi="Times New Roman" w:cs="Times New Roman"/>
+          <w:b/>
+          <w:bCs/>
+          <w:sz w:val="20"/>
+          <w:szCs w:val="20"/>
+        </w:rPr>
+        <w:t>Step counting logic reset on app pause/resume, losing accumulated count.</w:t>
+      </w:r>
+    </w:p>
+    <w:p>
+      <w:pPr>
+        <w:numPr>
+          <w:ilvl w:val="0"/>
+          <w:numId w:val="13"/>
+        </w:numPr>
+        <w:spacing w:after="40" w:line="240" w:lineRule="auto"/>
+        <w:rPr>
+          <w:rFonts w:ascii="Times New Roman" w:eastAsia="Times New Roman" w:hAnsi="Times New Roman" w:cs="Times New Roman"/>
+          <w:b/>
+          <w:bCs/>
+          <w:sz w:val="20"/>
+          <w:szCs w:val="20"/>
+        </w:rPr>
+      </w:pPr>
+      <w:r>
+        <w:rPr>
+          <w:rFonts w:ascii="Times New Roman" w:eastAsia="Times New Roman" w:hAnsi="Times New Roman" w:cs="Times New Roman"/>
+          <w:b/>
+          <w:bCs/>
+          <w:sz w:val="20"/>
+          <w:szCs w:val="20"/>
+        </w:rPr>
+        <w:t>No debounce/smoothing on raw accelerometer data, causing missed or double-counted steps.</w:t>
+      </w:r>
+    </w:p>
+    <w:p>
+      <w:pPr>
+        <w:spacing w:after="40" w:line="240" w:lineRule="auto"/>
+        <w:rPr>
+          <w:rFonts w:ascii="Times New Roman" w:eastAsia="Times New Roman" w:hAnsi="Times New Roman" w:cs="Times New Roman"/>
+          <w:b/>
+          <w:bCs/>
+          <w:sz w:val="20"/>
+          <w:szCs w:val="20"/>
+        </w:rPr>
+      </w:pPr>
+    </w:p>
+    <w:p>
+      <w:pPr>
+        <w:spacing w:after="40" w:line="240" w:lineRule="auto"/>
+        <w:rPr>
+          <w:rFonts w:ascii="Times New Roman" w:eastAsia="Times New Roman" w:hAnsi="Times New Roman" w:cs="Times New Roman"/>
+          <w:b/>
+          <w:bCs/>
+          <w:sz w:val="20"/>
+          <w:szCs w:val="20"/>
+        </w:rPr>
+      </w:pPr>
+      <w:r>
+        <w:rPr>
+          <w:rFonts w:ascii="Times New Roman" w:eastAsia="Times New Roman" w:hAnsi="Times New Roman" w:cs="Times New Roman"/>
+          <w:b/>
+          <w:bCs/>
+          <w:sz w:val="20"/>
+          <w:szCs w:val="20"/>
+        </w:rPr>
+        <w:t>Suggested Fixes:</w:t>
+      </w:r>
+    </w:p>
+    <w:p>
+      <w:pPr>
+        <w:numPr>
+          <w:ilvl w:val="0"/>
+          <w:numId w:val="13"/>
+        </w:numPr>
+        <w:spacing w:after="40" w:line="240" w:lineRule="auto"/>
+        <w:rPr>
+          <w:rFonts w:ascii="Times New Roman" w:eastAsia="Times New Roman" w:hAnsi="Times New Roman" w:cs="Times New Roman"/>
+          <w:b/>
+          <w:bCs/>
+          <w:sz w:val="20"/>
+          <w:szCs w:val="20"/>
+        </w:rPr>
+      </w:pPr>
+      <w:r>
+        <w:rPr>
+          <w:rFonts w:ascii="Times New Roman" w:eastAsia="Times New Roman" w:hAnsi="Times New Roman" w:cs="Times New Roman"/>
+          <w:b/>
+          <w:bCs/>
+          <w:sz w:val="20"/>
+          <w:szCs w:val="20"/>
+        </w:rPr>
+        <w:t>Verify the app explicitly requests and confirms ACTIVITY_RECOGNITION (Android) permission before starting the tracker, with a clear message if denied.</w:t>
+      </w:r>
+    </w:p>
+    <w:p>
+      <w:pPr>
+        <w:numPr>
+          <w:ilvl w:val="0"/>
+          <w:numId w:val="13"/>
+        </w:numPr>
+        <w:spacing w:after="40" w:line="240" w:lineRule="auto"/>
+        <w:rPr>
+          <w:rFonts w:ascii="Times New Roman" w:eastAsia="Times New Roman" w:hAnsi="Times New Roman" w:cs="Times New Roman"/>
+          <w:b/>
+          <w:bCs/>
+          <w:sz w:val="20"/>
+          <w:szCs w:val="20"/>
+        </w:rPr>
+      </w:pPr>
+      <w:r>
+        <w:rPr>
+          <w:rFonts w:ascii="Times New Roman" w:eastAsia="Times New Roman" w:hAnsi="Times New Roman" w:cs="Times New Roman"/>
+          <w:b/>
+          <w:bCs/>
+          <w:sz w:val="20"/>
+          <w:szCs w:val="20"/>
+        </w:rPr>
+        <w:t>Use a dedicated step-counting API (e.g. Health Connect or the device's built-in step-counter sensor) rather than raw accelerometer data, for more reliable counts.</w:t>
+      </w:r>
+    </w:p>
+    <w:p>
+      <w:pPr>
+        <w:numPr>
+          <w:ilvl w:val="0"/>
+          <w:numId w:val="13"/>
+        </w:numPr>
+        <w:spacing w:after="40" w:line="240" w:lineRule="auto"/>
+        <w:rPr>
+          <w:rFonts w:ascii="Times New Roman" w:eastAsia="Times New Roman" w:hAnsi="Times New Roman" w:cs="Times New Roman"/>
+          <w:b/>
+          <w:bCs/>
+          <w:sz w:val="20"/>
+          <w:szCs w:val="20"/>
+        </w:rPr>
+      </w:pPr>
+      <w:r>
+        <w:rPr>
+          <w:rFonts w:ascii="Times New Roman" w:eastAsia="Times New Roman" w:hAnsi="Times New Roman" w:cs="Times New Roman"/>
+          <w:b/>
+          <w:bCs/>
+          <w:sz w:val="20"/>
+          <w:szCs w:val="20"/>
+        </w:rPr>
+        <w:t xml:space="preserve">Persist step count locally (e.g. </w:t>
+      </w:r>
+      <w:proofErr w:type="spellStart"/>
+      <w:r>
+        <w:rPr>
+          <w:rFonts w:ascii="Times New Roman" w:eastAsia="Times New Roman" w:hAnsi="Times New Roman" w:cs="Times New Roman"/>
+          <w:b/>
+          <w:bCs/>
+          <w:sz w:val="20"/>
+          <w:szCs w:val="20"/>
+        </w:rPr>
+        <w:t>SharedPreferences</w:t>
+      </w:r>
+      <w:proofErr w:type="spellEnd"/>
+      <w:r>
+        <w:rPr>
+          <w:rFonts w:ascii="Times New Roman" w:eastAsia="Times New Roman" w:hAnsi="Times New Roman" w:cs="Times New Roman"/>
+          <w:b/>
+          <w:bCs/>
+          <w:sz w:val="20"/>
+          <w:szCs w:val="20"/>
+        </w:rPr>
+        <w:t>/SQLite) so it survives app pause/resume and device restarts.</w:t>
+      </w:r>
+    </w:p>
+    <w:p>
+      <w:pPr>
+        <w:numPr>
+          <w:ilvl w:val="0"/>
+          <w:numId w:val="13"/>
+        </w:numPr>
+        <w:spacing w:after="40" w:line="240" w:lineRule="auto"/>
+        <w:rPr>
+          <w:rFonts w:ascii="Times New Roman" w:eastAsia="Times New Roman" w:hAnsi="Times New Roman" w:cs="Times New Roman"/>
+          <w:b/>
+          <w:bCs/>
+          <w:sz w:val="20"/>
+          <w:szCs w:val="20"/>
+        </w:rPr>
+      </w:pPr>
+      <w:r>
+        <w:rPr>
+          <w:rFonts w:ascii="Times New Roman" w:eastAsia="Times New Roman" w:hAnsi="Times New Roman" w:cs="Times New Roman"/>
+          <w:b/>
+          <w:bCs/>
+          <w:sz w:val="20"/>
+          <w:szCs w:val="20"/>
+        </w:rPr>
+        <w:t>Add a manual test mode or debug log to compare raw sensor events against displayed count during QA.</w:t>
+      </w:r>
+    </w:p>
+    <w:p>
+      <w:pPr>
+        <w:spacing w:after="40" w:line="240" w:lineRule="auto"/>
+        <w:rPr>
+          <w:rFonts w:ascii="Times New Roman" w:eastAsia="Times New Roman" w:hAnsi="Times New Roman" w:cs="Times New Roman"/>
+          <w:b/>
+          <w:bCs/>
+          <w:sz w:val="20"/>
+          <w:szCs w:val="20"/>
+        </w:rPr>
+      </w:pPr>
+    </w:p>
+    <w:p>
+      <w:pPr>
+        <w:spacing w:after="40" w:line="240" w:lineRule="auto"/>
+        <w:rPr>
+          <w:rFonts w:ascii="Times New Roman" w:eastAsia="Times New Roman" w:hAnsi="Times New Roman" w:cs="Times New Roman"/>
+          <w:b/>
+          <w:bCs/>
+          <w:sz w:val="20"/>
+          <w:szCs w:val="20"/>
+        </w:rPr>
+      </w:pPr>
+    </w:p>
+    <w:p>
+      <w:pPr>
+        <w:spacing w:after="40" w:line="240" w:lineRule="auto"/>
+        <w:rPr>
+          <w:rFonts w:ascii="Times New Roman" w:eastAsia="Times New Roman" w:hAnsi="Times New Roman" w:cs="Times New Roman"/>
+          <w:b/>
+          <w:bCs/>
+          <w:sz w:val="20"/>
+          <w:szCs w:val="20"/>
+        </w:rPr>
+      </w:pPr>
+      <w:r>
+        <w:rPr>
+          <w:rFonts w:ascii="Times New Roman" w:eastAsia="Times New Roman" w:hAnsi="Times New Roman" w:cs="Times New Roman"/>
+          <w:b/>
+          <w:bCs/>
+          <w:sz w:val="20"/>
+          <w:szCs w:val="20"/>
+        </w:rPr>
+        <w:t>Bug 2: Calorie Tracker producing inconsistent/incorrect values</w:t>
+      </w:r>
+    </w:p>
+    <w:p>
+      <w:pPr>
+        <w:spacing w:after="40" w:line="240" w:lineRule="auto"/>
+        <w:rPr>
+          <w:rFonts w:ascii="Times New Roman" w:eastAsia="Times New Roman" w:hAnsi="Times New Roman" w:cs="Times New Roman"/>
+          <w:b/>
+          <w:bCs/>
+          <w:sz w:val="20"/>
+          <w:szCs w:val="20"/>
+        </w:rPr>
+      </w:pPr>
+      <w:r>
+        <w:rPr>
+          <w:rFonts w:ascii="Times New Roman" w:eastAsia="Times New Roman" w:hAnsi="Times New Roman" w:cs="Times New Roman"/>
+          <w:b/>
+          <w:bCs/>
+          <w:sz w:val="20"/>
+          <w:szCs w:val="20"/>
+        </w:rPr>
+        <w:t>Description: Calories burned displayed by the app do not match expected values for the recorded activity and duration, and fluctuate unpredictably.</w:t>
+      </w:r>
+    </w:p>
+    <w:p>
+      <w:pPr>
+        <w:spacing w:after="40" w:line="240" w:lineRule="auto"/>
+        <w:rPr>
+          <w:rFonts w:ascii="Times New Roman" w:eastAsia="Times New Roman" w:hAnsi="Times New Roman" w:cs="Times New Roman"/>
+          <w:b/>
+          <w:bCs/>
+          <w:sz w:val="20"/>
+          <w:szCs w:val="20"/>
+        </w:rPr>
+      </w:pPr>
+      <w:r>
+        <w:rPr>
+          <w:rFonts w:ascii="Times New Roman" w:eastAsia="Times New Roman" w:hAnsi="Times New Roman" w:cs="Times New Roman"/>
+          <w:b/>
+          <w:bCs/>
+          <w:sz w:val="20"/>
+          <w:szCs w:val="20"/>
+        </w:rPr>
+        <w:t>Steps to Reproduce:</w:t>
+      </w:r>
+    </w:p>
+    <w:p>
+      <w:pPr>
+        <w:spacing w:after="40" w:line="240" w:lineRule="auto"/>
+        <w:rPr>
+          <w:rFonts w:ascii="Times New Roman" w:eastAsia="Times New Roman" w:hAnsi="Times New Roman" w:cs="Times New Roman"/>
+          <w:b/>
+          <w:bCs/>
+          <w:sz w:val="20"/>
+          <w:szCs w:val="20"/>
+        </w:rPr>
+      </w:pPr>
+      <w:r>
+        <w:rPr>
+          <w:rFonts w:ascii="Times New Roman" w:eastAsia="Times New Roman" w:hAnsi="Times New Roman" w:cs="Times New Roman"/>
+          <w:b/>
+          <w:bCs/>
+          <w:sz w:val="20"/>
+          <w:szCs w:val="20"/>
+        </w:rPr>
+        <w:t>1. Log a workout activity with a known duration and intensity.</w:t>
+      </w:r>
+    </w:p>
+    <w:p>
+      <w:pPr>
+        <w:spacing w:after="40" w:line="240" w:lineRule="auto"/>
+        <w:rPr>
+          <w:rFonts w:ascii="Times New Roman" w:eastAsia="Times New Roman" w:hAnsi="Times New Roman" w:cs="Times New Roman"/>
+          <w:b/>
+          <w:bCs/>
+          <w:sz w:val="20"/>
+          <w:szCs w:val="20"/>
+        </w:rPr>
+      </w:pPr>
+      <w:r>
+        <w:rPr>
+          <w:rFonts w:ascii="Times New Roman" w:eastAsia="Times New Roman" w:hAnsi="Times New Roman" w:cs="Times New Roman"/>
+          <w:b/>
+          <w:bCs/>
+          <w:sz w:val="20"/>
+          <w:szCs w:val="20"/>
+        </w:rPr>
+        <w:t>2. Check the calorie value the app calculates for that session.</w:t>
+      </w:r>
+    </w:p>
+    <w:p>
+      <w:pPr>
+        <w:spacing w:after="40" w:line="240" w:lineRule="auto"/>
+        <w:rPr>
+          <w:rFonts w:ascii="Times New Roman" w:eastAsia="Times New Roman" w:hAnsi="Times New Roman" w:cs="Times New Roman"/>
+          <w:b/>
+          <w:bCs/>
+          <w:sz w:val="20"/>
+          <w:szCs w:val="20"/>
+        </w:rPr>
+      </w:pPr>
+      <w:r>
+        <w:rPr>
+          <w:rFonts w:ascii="Times New Roman" w:eastAsia="Times New Roman" w:hAnsi="Times New Roman" w:cs="Times New Roman"/>
+          <w:b/>
+          <w:bCs/>
+          <w:sz w:val="20"/>
+          <w:szCs w:val="20"/>
+        </w:rPr>
+        <w:t>3. Repeat with the same inputs and compare results between attempts.</w:t>
+      </w:r>
+    </w:p>
+    <w:p>
+      <w:pPr>
+        <w:spacing w:after="40" w:line="240" w:lineRule="auto"/>
+        <w:rPr>
+          <w:rFonts w:ascii="Times New Roman" w:eastAsia="Times New Roman" w:hAnsi="Times New Roman" w:cs="Times New Roman"/>
+          <w:b/>
+          <w:bCs/>
+          <w:sz w:val="20"/>
+          <w:szCs w:val="20"/>
+        </w:rPr>
+      </w:pPr>
+    </w:p>
+    <w:p>
+      <w:pPr>
+        <w:spacing w:after="40" w:line="240" w:lineRule="auto"/>
+        <w:rPr>
+          <w:rFonts w:ascii="Times New Roman" w:eastAsia="Times New Roman" w:hAnsi="Times New Roman" w:cs="Times New Roman"/>
+          <w:b/>
+          <w:bCs/>
+          <w:sz w:val="20"/>
+          <w:szCs w:val="20"/>
+        </w:rPr>
+      </w:pPr>
+      <w:r>
+        <w:rPr>
+          <w:rFonts w:ascii="Times New Roman" w:eastAsia="Times New Roman" w:hAnsi="Times New Roman" w:cs="Times New Roman"/>
+          <w:b/>
+          <w:bCs/>
+          <w:sz w:val="20"/>
+          <w:szCs w:val="20"/>
+        </w:rPr>
+        <w:t>Severity: Medium</w:t>
+      </w:r>
+    </w:p>
+    <w:p>
+      <w:pPr>
+        <w:spacing w:after="40" w:line="240" w:lineRule="auto"/>
+        <w:rPr>
+          <w:rFonts w:ascii="Times New Roman" w:eastAsia="Times New Roman" w:hAnsi="Times New Roman" w:cs="Times New Roman"/>
+          <w:b/>
+          <w:bCs/>
+          <w:sz w:val="20"/>
+          <w:szCs w:val="20"/>
+        </w:rPr>
+      </w:pPr>
+      <w:r>
+        <w:rPr>
+          <w:rFonts w:ascii="Times New Roman" w:eastAsia="Times New Roman" w:hAnsi="Times New Roman" w:cs="Times New Roman"/>
+          <w:b/>
+          <w:bCs/>
+          <w:sz w:val="20"/>
+          <w:szCs w:val="20"/>
+        </w:rPr>
+        <w:t>Possible Causes:</w:t>
+      </w:r>
+    </w:p>
+    <w:p>
+      <w:pPr>
+        <w:numPr>
+          <w:ilvl w:val="0"/>
+          <w:numId w:val="13"/>
+        </w:numPr>
+        <w:spacing w:after="40" w:line="240" w:lineRule="auto"/>
+        <w:rPr>
+          <w:rFonts w:ascii="Times New Roman" w:eastAsia="Times New Roman" w:hAnsi="Times New Roman" w:cs="Times New Roman"/>
+          <w:b/>
+          <w:bCs/>
+          <w:sz w:val="20"/>
+          <w:szCs w:val="20"/>
+        </w:rPr>
+      </w:pPr>
+      <w:r>
+        <w:rPr>
+          <w:rFonts w:ascii="Times New Roman" w:eastAsia="Times New Roman" w:hAnsi="Times New Roman" w:cs="Times New Roman"/>
+          <w:b/>
+          <w:bCs/>
+          <w:sz w:val="20"/>
+          <w:szCs w:val="20"/>
+        </w:rPr>
+        <w:t>Calorie formula likely depends on step count as an input — if step tracking is inaccurate (Bug 1), calorie output inherits the same error.</w:t>
+      </w:r>
+    </w:p>
+    <w:p>
+      <w:pPr>
+        <w:numPr>
+          <w:ilvl w:val="0"/>
+          <w:numId w:val="13"/>
+        </w:numPr>
+        <w:spacing w:after="40" w:line="240" w:lineRule="auto"/>
+        <w:rPr>
+          <w:rFonts w:ascii="Times New Roman" w:eastAsia="Times New Roman" w:hAnsi="Times New Roman" w:cs="Times New Roman"/>
+          <w:b/>
+          <w:bCs/>
+          <w:sz w:val="20"/>
+          <w:szCs w:val="20"/>
+        </w:rPr>
+      </w:pPr>
+      <w:r>
+        <w:rPr>
+          <w:rFonts w:ascii="Times New Roman" w:eastAsia="Times New Roman" w:hAnsi="Times New Roman" w:cs="Times New Roman"/>
+          <w:b/>
+          <w:bCs/>
+          <w:sz w:val="20"/>
+          <w:szCs w:val="20"/>
+        </w:rPr>
+        <w:t>Missing or default user profile data (weight, age, height) used in the MET (Metabolic Equivalent of Task) formula, producing generic/incorrect results.</w:t>
+      </w:r>
+    </w:p>
+    <w:p>
+      <w:pPr>
+        <w:numPr>
+          <w:ilvl w:val="0"/>
+          <w:numId w:val="13"/>
+        </w:numPr>
+        <w:spacing w:after="40" w:line="240" w:lineRule="auto"/>
+        <w:rPr>
+          <w:rFonts w:ascii="Times New Roman" w:eastAsia="Times New Roman" w:hAnsi="Times New Roman" w:cs="Times New Roman"/>
+          <w:b/>
+          <w:bCs/>
+          <w:sz w:val="20"/>
+          <w:szCs w:val="20"/>
+        </w:rPr>
+      </w:pPr>
+      <w:r>
+        <w:rPr>
+          <w:rFonts w:ascii="Times New Roman" w:eastAsia="Times New Roman" w:hAnsi="Times New Roman" w:cs="Times New Roman"/>
+          <w:b/>
+          <w:bCs/>
+          <w:sz w:val="20"/>
+          <w:szCs w:val="20"/>
+        </w:rPr>
+        <w:t>Calculation possibly re-running or double-counting on screen rebuild/re-render.</w:t>
+      </w:r>
+    </w:p>
+    <w:p>
+      <w:pPr>
+        <w:spacing w:after="40" w:line="240" w:lineRule="auto"/>
+        <w:rPr>
+          <w:rFonts w:ascii="Times New Roman" w:eastAsia="Times New Roman" w:hAnsi="Times New Roman" w:cs="Times New Roman"/>
+          <w:b/>
+          <w:bCs/>
+          <w:sz w:val="20"/>
+          <w:szCs w:val="20"/>
+        </w:rPr>
+      </w:pPr>
+    </w:p>
+    <w:p>
+      <w:pPr>
+        <w:spacing w:after="40" w:line="240" w:lineRule="auto"/>
+        <w:rPr>
+          <w:rFonts w:ascii="Times New Roman" w:eastAsia="Times New Roman" w:hAnsi="Times New Roman" w:cs="Times New Roman"/>
+          <w:b/>
+          <w:bCs/>
+          <w:sz w:val="20"/>
+          <w:szCs w:val="20"/>
+        </w:rPr>
+      </w:pPr>
+      <w:r>
+        <w:rPr>
+          <w:rFonts w:ascii="Times New Roman" w:eastAsia="Times New Roman" w:hAnsi="Times New Roman" w:cs="Times New Roman"/>
+          <w:b/>
+          <w:bCs/>
+          <w:sz w:val="20"/>
+          <w:szCs w:val="20"/>
+        </w:rPr>
+        <w:t>Suggested Fixes:</w:t>
+      </w:r>
+    </w:p>
+    <w:p>
+      <w:pPr>
+        <w:numPr>
+          <w:ilvl w:val="0"/>
+          <w:numId w:val="13"/>
+        </w:numPr>
+        <w:spacing w:after="40" w:line="240" w:lineRule="auto"/>
+        <w:rPr>
+          <w:rFonts w:ascii="Times New Roman" w:eastAsia="Times New Roman" w:hAnsi="Times New Roman" w:cs="Times New Roman"/>
+          <w:b/>
+          <w:bCs/>
+          <w:sz w:val="20"/>
+          <w:szCs w:val="20"/>
+        </w:rPr>
+      </w:pPr>
+      <w:r>
+        <w:rPr>
+          <w:rFonts w:ascii="Times New Roman" w:eastAsia="Times New Roman" w:hAnsi="Times New Roman" w:cs="Times New Roman"/>
+          <w:b/>
+          <w:bCs/>
+          <w:sz w:val="20"/>
+          <w:szCs w:val="20"/>
+        </w:rPr>
+        <w:t>Fix the step tracker first (Bug 1), since calorie accuracy likely depends on it.</w:t>
+      </w:r>
+    </w:p>
+    <w:p>
+      <w:pPr>
+        <w:numPr>
+          <w:ilvl w:val="0"/>
+          <w:numId w:val="13"/>
+        </w:numPr>
+        <w:spacing w:after="40" w:line="240" w:lineRule="auto"/>
+        <w:rPr>
+          <w:rFonts w:ascii="Times New Roman" w:eastAsia="Times New Roman" w:hAnsi="Times New Roman" w:cs="Times New Roman"/>
+          <w:b/>
+          <w:bCs/>
+          <w:sz w:val="20"/>
+          <w:szCs w:val="20"/>
+        </w:rPr>
+      </w:pPr>
+      <w:r>
+        <w:rPr>
+          <w:rFonts w:ascii="Times New Roman" w:eastAsia="Times New Roman" w:hAnsi="Times New Roman" w:cs="Times New Roman"/>
+          <w:b/>
+          <w:bCs/>
+          <w:sz w:val="20"/>
+          <w:szCs w:val="20"/>
+        </w:rPr>
+        <w:t>Ensure the calorie formula uses actual user profile data (weight, age, activity type) rather than placeholder defaults.</w:t>
+      </w:r>
+    </w:p>
+    <w:p>
+      <w:pPr>
+        <w:numPr>
+          <w:ilvl w:val="0"/>
+          <w:numId w:val="13"/>
+        </w:numPr>
+        <w:spacing w:after="40" w:line="240" w:lineRule="auto"/>
+        <w:rPr>
+          <w:rFonts w:ascii="Times New Roman" w:eastAsia="Times New Roman" w:hAnsi="Times New Roman" w:cs="Times New Roman"/>
+          <w:b/>
+          <w:bCs/>
+          <w:sz w:val="20"/>
+          <w:szCs w:val="20"/>
+        </w:rPr>
+      </w:pPr>
+      <w:r>
+        <w:rPr>
+          <w:rFonts w:ascii="Times New Roman" w:eastAsia="Times New Roman" w:hAnsi="Times New Roman" w:cs="Times New Roman"/>
+          <w:b/>
+          <w:bCs/>
+          <w:sz w:val="20"/>
+          <w:szCs w:val="20"/>
+        </w:rPr>
+        <w:t>Use a standard MET-based formula: Calories = MET x weight (kg) x duration (hours), and verify it only runs once per session rather than on every widget rebuild.</w:t>
+      </w:r>
+    </w:p>
+    <w:p>
+      <w:pPr>
+        <w:numPr>
+          <w:ilvl w:val="0"/>
+          <w:numId w:val="13"/>
+        </w:numPr>
+        <w:spacing w:after="40" w:line="240" w:lineRule="auto"/>
+        <w:rPr>
+          <w:rFonts w:ascii="Times New Roman" w:eastAsia="Times New Roman" w:hAnsi="Times New Roman" w:cs="Times New Roman"/>
+          <w:b/>
+          <w:bCs/>
+          <w:sz w:val="20"/>
+          <w:szCs w:val="20"/>
+        </w:rPr>
+      </w:pPr>
+      <w:r>
+        <w:rPr>
+          <w:rFonts w:ascii="Times New Roman" w:eastAsia="Times New Roman" w:hAnsi="Times New Roman" w:cs="Times New Roman"/>
+          <w:b/>
+          <w:bCs/>
+          <w:sz w:val="20"/>
+          <w:szCs w:val="20"/>
+        </w:rPr>
+        <w:t>Add unit tests with known inputs/outputs to confirm the formula produces consistent, expected results.</w:t>
+      </w:r>
+    </w:p>
+    <w:p>
+      <w:pPr>
+        <w:spacing w:after="40" w:line="240" w:lineRule="auto"/>
+        <w:rPr>
+          <w:rFonts w:ascii="Times New Roman" w:eastAsia="Times New Roman" w:hAnsi="Times New Roman" w:cs="Times New Roman"/>
+          <w:b/>
+          <w:bCs/>
+          <w:sz w:val="20"/>
+          <w:szCs w:val="20"/>
+        </w:rPr>
+      </w:pPr>
+    </w:p>
+    <w:p>
+      <w:pPr>
+        <w:spacing w:after="40" w:line="240" w:lineRule="auto"/>
+        <w:rPr>
+          <w:rFonts w:ascii="Times New Roman" w:eastAsia="Times New Roman" w:hAnsi="Times New Roman" w:cs="Times New Roman"/>
+          <w:b/>
+          <w:bCs/>
+          <w:sz w:val="20"/>
+          <w:szCs w:val="20"/>
+        </w:rPr>
+      </w:pPr>
+    </w:p>
+    <w:p>
+      <w:pPr>
+        <w:spacing w:after="40" w:line="240" w:lineRule="auto"/>
+        <w:rPr>
+          <w:rFonts w:ascii="Times New Roman" w:eastAsia="Times New Roman" w:hAnsi="Times New Roman" w:cs="Times New Roman"/>
+          <w:b/>
+          <w:bCs/>
+          <w:sz w:val="20"/>
+          <w:szCs w:val="20"/>
+        </w:rPr>
+      </w:pPr>
+      <w:r>
+        <w:rPr>
+          <w:rFonts w:ascii="Times New Roman" w:eastAsia="Times New Roman" w:hAnsi="Times New Roman" w:cs="Times New Roman"/>
+          <w:b/>
+          <w:bCs/>
+          <w:sz w:val="20"/>
+          <w:szCs w:val="20"/>
+        </w:rPr>
+        <w:t>Overall Recommendation</w:t>
+      </w:r>
+    </w:p>
+    <w:p>
+      <w:pPr>
+        <w:numPr>
+          <w:ilvl w:val="0"/>
+          <w:numId w:val="13"/>
+        </w:numPr>
+        <w:spacing w:after="40" w:line="240" w:lineRule="auto"/>
+        <w:rPr>
+          <w:rFonts w:ascii="Times New Roman" w:eastAsia="Times New Roman" w:hAnsi="Times New Roman" w:cs="Times New Roman"/>
+          <w:b/>
+          <w:bCs/>
+          <w:sz w:val="20"/>
+          <w:szCs w:val="20"/>
+        </w:rPr>
+      </w:pPr>
+      <w:r>
+        <w:rPr>
+          <w:rFonts w:ascii="Times New Roman" w:eastAsia="Times New Roman" w:hAnsi="Times New Roman" w:cs="Times New Roman"/>
+          <w:b/>
+          <w:bCs/>
+          <w:sz w:val="20"/>
+          <w:szCs w:val="20"/>
+        </w:rPr>
+        <w:t>Both issues affect core tracking accuracy — the app's main value proposition — so should be prioritized before public release.</w:t>
+      </w:r>
+    </w:p>
+    <w:p>
+      <w:pPr>
+        <w:numPr>
+          <w:ilvl w:val="0"/>
+          <w:numId w:val="13"/>
+        </w:numPr>
+        <w:spacing w:after="40" w:line="240" w:lineRule="auto"/>
+        <w:rPr>
+          <w:rFonts w:ascii="Times New Roman" w:eastAsia="Times New Roman" w:hAnsi="Times New Roman" w:cs="Times New Roman"/>
+          <w:b/>
+          <w:bCs/>
+          <w:sz w:val="20"/>
+          <w:szCs w:val="20"/>
+        </w:rPr>
+      </w:pPr>
+      <w:r>
+        <w:rPr>
+          <w:rFonts w:ascii="Times New Roman" w:eastAsia="Times New Roman" w:hAnsi="Times New Roman" w:cs="Times New Roman"/>
+          <w:b/>
+          <w:bCs/>
+          <w:sz w:val="20"/>
+          <w:szCs w:val="20"/>
+        </w:rPr>
+        <w:t>Recommend fixing the Step Tracker first, since the Calorie Tracker appears to depend on its output.</w:t>
+      </w:r>
+    </w:p>
+    <w:p>
+      <w:pPr>
+        <w:numPr>
+          <w:ilvl w:val="0"/>
+          <w:numId w:val="13"/>
+        </w:numPr>
+        <w:spacing w:after="40" w:line="240" w:lineRule="auto"/>
+        <w:rPr>
+          <w:rFonts w:ascii="Times New Roman" w:eastAsia="Times New Roman" w:hAnsi="Times New Roman" w:cs="Times New Roman"/>
+          <w:b/>
+          <w:bCs/>
+          <w:sz w:val="20"/>
+          <w:szCs w:val="20"/>
+        </w:rPr>
+      </w:pPr>
+      <w:r>
+        <w:rPr>
+          <w:rFonts w:ascii="Times New Roman" w:eastAsia="Times New Roman" w:hAnsi="Times New Roman" w:cs="Times New Roman"/>
+          <w:b/>
+          <w:bCs/>
+          <w:sz w:val="20"/>
+          <w:szCs w:val="20"/>
+        </w:rPr>
+        <w:t>Suggest adding a simple in-app debug/test mode to verify sensor readings against manual counts during QA.</w:t>
+      </w:r>
+    </w:p>
+    <w:p>
+      <w:pPr>
         <w:pStyle w:val="Heading1"/>
       </w:pPr>
-      <w:r>
-        <w:lastRenderedPageBreak/>
-        <w:t>Week 10: Notifications and Background Services</w:t>
-      </w:r>
-    </w:p>
-    <w:p>
-      <w:pPr>
-        <w:pStyle w:val="Heading2"/>
-      </w:pPr>
-      <w:r>
-        <w:t>Same as week 1</w:t>
-      </w:r>
     </w:p>
     <w:p>
       <w:r>
@@ -21596,8 +25190,8 @@
       </w:r>
     </w:p>
     <w:sectPr>
-      <w:headerReference w:type="default" r:id="rId61"/>
-      <w:footerReference w:type="default" r:id="rId62"/>
+      <w:headerReference w:type="default" r:id="rId70"/>
+      <w:footerReference w:type="default" r:id="rId71"/>
       <w:pgSz w:w="12240" w:h="15840"/>
       <w:pgMar w:top="1440" w:right="1800" w:bottom="1440" w:left="1800" w:header="720" w:footer="720" w:gutter="0"/>
       <w:cols w:space="720"/>
@@ -21827,6 +25421,92 @@
     </w:lvl>
   </w:abstractNum>
   <w:abstractNum w:abstractNumId="6" w15:restartNumberingAfterBreak="0">
+    <w:nsid w:val="119D6E15"/>
+    <w:multiLevelType w:val="hybridMultilevel"/>
+    <w:tmpl w:val="FF9C8972"/>
+    <w:lvl w:ilvl="0" w:tplc="817A8B1E">
+      <w:start w:val="1"/>
+      <w:numFmt w:val="bullet"/>
+      <w:lvlText w:val="●"/>
+      <w:lvlJc w:val="left"/>
+      <w:pPr>
+        <w:ind w:left="720" w:hanging="360"/>
+      </w:pPr>
+    </w:lvl>
+    <w:lvl w:ilvl="1" w:tplc="8A321746">
+      <w:start w:val="1"/>
+      <w:numFmt w:val="bullet"/>
+      <w:lvlText w:val="○"/>
+      <w:lvlJc w:val="left"/>
+      <w:pPr>
+        <w:ind w:left="1440" w:hanging="360"/>
+      </w:pPr>
+    </w:lvl>
+    <w:lvl w:ilvl="2" w:tplc="479ED0C2">
+      <w:start w:val="1"/>
+      <w:numFmt w:val="bullet"/>
+      <w:lvlText w:val="■"/>
+      <w:lvlJc w:val="left"/>
+      <w:pPr>
+        <w:ind w:left="2160" w:hanging="360"/>
+      </w:pPr>
+    </w:lvl>
+    <w:lvl w:ilvl="3" w:tplc="380A4F02">
+      <w:start w:val="1"/>
+      <w:numFmt w:val="bullet"/>
+      <w:lvlText w:val="●"/>
+      <w:lvlJc w:val="left"/>
+      <w:pPr>
+        <w:ind w:left="2880" w:hanging="360"/>
+      </w:pPr>
+    </w:lvl>
+    <w:lvl w:ilvl="4" w:tplc="9278ABEC">
+      <w:start w:val="1"/>
+      <w:numFmt w:val="bullet"/>
+      <w:lvlText w:val="○"/>
+      <w:lvlJc w:val="left"/>
+      <w:pPr>
+        <w:ind w:left="3600" w:hanging="360"/>
+      </w:pPr>
+    </w:lvl>
+    <w:lvl w:ilvl="5" w:tplc="FE7446E2">
+      <w:start w:val="1"/>
+      <w:numFmt w:val="bullet"/>
+      <w:lvlText w:val="■"/>
+      <w:lvlJc w:val="left"/>
+      <w:pPr>
+        <w:ind w:left="4320" w:hanging="360"/>
+      </w:pPr>
+    </w:lvl>
+    <w:lvl w:ilvl="6" w:tplc="C36C9F4C">
+      <w:start w:val="1"/>
+      <w:numFmt w:val="bullet"/>
+      <w:lvlText w:val="●"/>
+      <w:lvlJc w:val="left"/>
+      <w:pPr>
+        <w:ind w:left="5040" w:hanging="360"/>
+      </w:pPr>
+    </w:lvl>
+    <w:lvl w:ilvl="7" w:tplc="986007AC">
+      <w:start w:val="1"/>
+      <w:numFmt w:val="bullet"/>
+      <w:lvlText w:val="●"/>
+      <w:lvlJc w:val="left"/>
+      <w:pPr>
+        <w:ind w:left="5760" w:hanging="360"/>
+      </w:pPr>
+    </w:lvl>
+    <w:lvl w:ilvl="8" w:tplc="BDC2441E">
+      <w:start w:val="1"/>
+      <w:numFmt w:val="bullet"/>
+      <w:lvlText w:val="●"/>
+      <w:lvlJc w:val="left"/>
+      <w:pPr>
+        <w:ind w:left="6480" w:hanging="360"/>
+      </w:pPr>
+    </w:lvl>
+  </w:abstractNum>
+  <w:abstractNum w:abstractNumId="7" w15:restartNumberingAfterBreak="0">
     <w:nsid w:val="3ADA6B03"/>
     <w:multiLevelType w:val="hybridMultilevel"/>
     <w:tmpl w:val="43687E48"/>
@@ -21880,7 +25560,7 @@
       <w:lvlJc w:val="left"/>
     </w:lvl>
   </w:abstractNum>
-  <w:abstractNum w:abstractNumId="7" w15:restartNumberingAfterBreak="0">
+  <w:abstractNum w:abstractNumId="8" w15:restartNumberingAfterBreak="0">
     <w:nsid w:val="4CFB0302"/>
     <w:multiLevelType w:val="hybridMultilevel"/>
     <w:tmpl w:val="28A0E468"/>
@@ -21934,7 +25614,7 @@
       <w:lvlJc w:val="left"/>
     </w:lvl>
   </w:abstractNum>
-  <w:abstractNum w:abstractNumId="8" w15:restartNumberingAfterBreak="0">
+  <w:abstractNum w:abstractNumId="9" w15:restartNumberingAfterBreak="0">
     <w:nsid w:val="516C65BD"/>
     <w:multiLevelType w:val="hybridMultilevel"/>
     <w:tmpl w:val="4DF6542A"/>
@@ -22023,7 +25703,93 @@
       </w:pPr>
     </w:lvl>
   </w:abstractNum>
-  <w:abstractNum w:abstractNumId="9" w15:restartNumberingAfterBreak="0">
+  <w:abstractNum w:abstractNumId="10" w15:restartNumberingAfterBreak="0">
+    <w:nsid w:val="5E0D5384"/>
+    <w:multiLevelType w:val="hybridMultilevel"/>
+    <w:tmpl w:val="49189F0C"/>
+    <w:lvl w:ilvl="0" w:tplc="316E9800">
+      <w:start w:val="1"/>
+      <w:numFmt w:val="bullet"/>
+      <w:lvlText w:val="●"/>
+      <w:lvlJc w:val="left"/>
+      <w:pPr>
+        <w:ind w:left="720" w:hanging="360"/>
+      </w:pPr>
+    </w:lvl>
+    <w:lvl w:ilvl="1" w:tplc="C7F82EB2">
+      <w:start w:val="1"/>
+      <w:numFmt w:val="bullet"/>
+      <w:lvlText w:val="○"/>
+      <w:lvlJc w:val="left"/>
+      <w:pPr>
+        <w:ind w:left="1440" w:hanging="360"/>
+      </w:pPr>
+    </w:lvl>
+    <w:lvl w:ilvl="2" w:tplc="CB0C49E6">
+      <w:start w:val="1"/>
+      <w:numFmt w:val="bullet"/>
+      <w:lvlText w:val="■"/>
+      <w:lvlJc w:val="left"/>
+      <w:pPr>
+        <w:ind w:left="2160" w:hanging="360"/>
+      </w:pPr>
+    </w:lvl>
+    <w:lvl w:ilvl="3" w:tplc="78ACF4E6">
+      <w:start w:val="1"/>
+      <w:numFmt w:val="bullet"/>
+      <w:lvlText w:val="●"/>
+      <w:lvlJc w:val="left"/>
+      <w:pPr>
+        <w:ind w:left="2880" w:hanging="360"/>
+      </w:pPr>
+    </w:lvl>
+    <w:lvl w:ilvl="4" w:tplc="D428A0B8">
+      <w:start w:val="1"/>
+      <w:numFmt w:val="bullet"/>
+      <w:lvlText w:val="○"/>
+      <w:lvlJc w:val="left"/>
+      <w:pPr>
+        <w:ind w:left="3600" w:hanging="360"/>
+      </w:pPr>
+    </w:lvl>
+    <w:lvl w:ilvl="5" w:tplc="65445B5C">
+      <w:start w:val="1"/>
+      <w:numFmt w:val="bullet"/>
+      <w:lvlText w:val="■"/>
+      <w:lvlJc w:val="left"/>
+      <w:pPr>
+        <w:ind w:left="4320" w:hanging="360"/>
+      </w:pPr>
+    </w:lvl>
+    <w:lvl w:ilvl="6" w:tplc="3168B74E">
+      <w:start w:val="1"/>
+      <w:numFmt w:val="bullet"/>
+      <w:lvlText w:val="●"/>
+      <w:lvlJc w:val="left"/>
+      <w:pPr>
+        <w:ind w:left="5040" w:hanging="360"/>
+      </w:pPr>
+    </w:lvl>
+    <w:lvl w:ilvl="7" w:tplc="C0203180">
+      <w:start w:val="1"/>
+      <w:numFmt w:val="bullet"/>
+      <w:lvlText w:val="●"/>
+      <w:lvlJc w:val="left"/>
+      <w:pPr>
+        <w:ind w:left="5760" w:hanging="360"/>
+      </w:pPr>
+    </w:lvl>
+    <w:lvl w:ilvl="8" w:tplc="644040B0">
+      <w:start w:val="1"/>
+      <w:numFmt w:val="bullet"/>
+      <w:lvlText w:val="●"/>
+      <w:lvlJc w:val="left"/>
+      <w:pPr>
+        <w:ind w:left="6480" w:hanging="360"/>
+      </w:pPr>
+    </w:lvl>
+  </w:abstractNum>
+  <w:abstractNum w:abstractNumId="11" w15:restartNumberingAfterBreak="0">
     <w:nsid w:val="6FA2799A"/>
     <w:multiLevelType w:val="hybridMultilevel"/>
     <w:tmpl w:val="D7F0BED6"/>
@@ -22077,7 +25843,7 @@
       <w:lvlJc w:val="left"/>
     </w:lvl>
   </w:abstractNum>
-  <w:abstractNum w:abstractNumId="10" w15:restartNumberingAfterBreak="0">
+  <w:abstractNum w:abstractNumId="12" w15:restartNumberingAfterBreak="0">
     <w:nsid w:val="7D35201B"/>
     <w:multiLevelType w:val="hybridMultilevel"/>
     <w:tmpl w:val="D908AA3A"/>
@@ -22150,28 +25916,40 @@
     <w:abstractNumId w:val="0"/>
   </w:num>
   <w:num w:numId="7" w16cid:durableId="2025743925">
-    <w:abstractNumId w:val="10"/>
+    <w:abstractNumId w:val="12"/>
     <w:lvlOverride w:ilvl="0">
       <w:startOverride w:val="1"/>
     </w:lvlOverride>
   </w:num>
   <w:num w:numId="8" w16cid:durableId="1144928965">
+    <w:abstractNumId w:val="8"/>
+    <w:lvlOverride w:ilvl="0">
+      <w:startOverride w:val="1"/>
+    </w:lvlOverride>
+  </w:num>
+  <w:num w:numId="9" w16cid:durableId="1020164506">
+    <w:abstractNumId w:val="11"/>
+    <w:lvlOverride w:ilvl="0">
+      <w:startOverride w:val="1"/>
+    </w:lvlOverride>
+  </w:num>
+  <w:num w:numId="10" w16cid:durableId="1662006389">
+    <w:abstractNumId w:val="9"/>
+  </w:num>
+  <w:num w:numId="11" w16cid:durableId="183831199">
     <w:abstractNumId w:val="7"/>
     <w:lvlOverride w:ilvl="0">
       <w:startOverride w:val="1"/>
     </w:lvlOverride>
   </w:num>
-  <w:num w:numId="9" w16cid:durableId="1020164506">
-    <w:abstractNumId w:val="9"/>
+  <w:num w:numId="12" w16cid:durableId="1950696236">
+    <w:abstractNumId w:val="6"/>
     <w:lvlOverride w:ilvl="0">
       <w:startOverride w:val="1"/>
     </w:lvlOverride>
   </w:num>
-  <w:num w:numId="10" w16cid:durableId="1662006389">
-    <w:abstractNumId w:val="8"/>
-  </w:num>
-  <w:num w:numId="11" w16cid:durableId="183831199">
-    <w:abstractNumId w:val="6"/>
+  <w:num w:numId="13" w16cid:durableId="1615021821">
+    <w:abstractNumId w:val="10"/>
     <w:lvlOverride w:ilvl="0">
       <w:startOverride w:val="1"/>
     </w:lvlOverride>
@@ -22759,6 +26537,7 @@
   <w:style w:type="character" w:default="1" w:styleId="DefaultParagraphFont">
     <w:name w:val="Default Paragraph Font"/>
     <w:uiPriority w:val="1"/>
+    <w:semiHidden/>
     <w:unhideWhenUsed/>
   </w:style>
   <w:style w:type="table" w:default="1" w:styleId="TableNormal">
@@ -33133,10 +36912,6 @@
 </file>
 
 <file path=customXml/item1.xml><?xml version="1.0" encoding="utf-8"?>
-<b:Sources xmlns:b="http://schemas.openxmlformats.org/officeDocument/2006/bibliography" xmlns="http://schemas.openxmlformats.org/officeDocument/2006/bibliography" SelectedStyle="/APA.XSL" StyleName="APA"/>
-</file>
-
-<file path=customXml/item2.xml><?xml version="1.0" encoding="utf-8"?>
 <s:customData xmlns="http://www.wps.cn/officeDocument/2013/wpsCustomData" xmlns:s="http://www.wps.cn/officeDocument/2013/wpsCustomData">
   <customSectProps/>
   <customShpExts>
@@ -33145,18 +36920,22 @@
 </s:customData>
 </file>
 
+<file path=customXml/item2.xml><?xml version="1.0" encoding="utf-8"?>
+<b:Sources xmlns:b="http://schemas.openxmlformats.org/officeDocument/2006/bibliography" xmlns="http://schemas.openxmlformats.org/officeDocument/2006/bibliography" SelectedStyle="/APA.XSL" StyleName="APA"/>
+</file>
+
 <file path=customXml/itemProps1.xml><?xml version="1.0" encoding="utf-8"?>
+<ds:datastoreItem xmlns:ds="http://schemas.openxmlformats.org/officeDocument/2006/customXml" ds:itemID="{B1977F7D-205B-4081-913C-38D41E755F92}">
+  <ds:schemaRefs>
+    <ds:schemaRef ds:uri="http://www.wps.cn/officeDocument/2013/wpsCustomData"/>
+  </ds:schemaRefs>
+</ds:datastoreItem>
+</file>
+
+<file path=customXml/itemProps2.xml><?xml version="1.0" encoding="utf-8"?>
 <ds:datastoreItem xmlns:ds="http://schemas.openxmlformats.org/officeDocument/2006/customXml" ds:itemID="{EF278816-EC6F-A645-907D-7F25AECB1D4A}">
   <ds:schemaRefs>
     <ds:schemaRef ds:uri="http://schemas.openxmlformats.org/officeDocument/2006/bibliography"/>
   </ds:schemaRefs>
 </ds:datastoreItem>
-</file>
-
-<file path=customXml/itemProps2.xml><?xml version="1.0" encoding="utf-8"?>
-<ds:datastoreItem xmlns:ds="http://schemas.openxmlformats.org/officeDocument/2006/customXml" ds:itemID="{B1977F7D-205B-4081-913C-38D41E755F92}">
-  <ds:schemaRefs>
-    <ds:schemaRef ds:uri="http://www.wps.cn/officeDocument/2013/wpsCustomData"/>
-  </ds:schemaRefs>
-</ds:datastoreItem>
 </file>
</xml_diff>